<commit_message>
Se termina el documento de Diseño y se agrega doc personal Diego Carrillo
</commit_message>
<xml_diff>
--- a/Fase 2/Evidencias Proyecto (version Agil)/Documento 05 - Documento de Diseño.docx
+++ b/Fase 2/Evidencias Proyecto (version Agil)/Documento 05 - Documento de Diseño.docx
@@ -93,6 +93,7 @@
                   <w:rFonts w:eastAsiaTheme="majorEastAsia" w:cstheme="minorHAnsi"/>
                   <w:sz w:val="80"/>
                   <w:szCs w:val="80"/>
+                  <w:u w:val="single"/>
                 </w:rPr>
                 <w:alias w:val="Título"/>
                 <w:id w:val="15524250"/>
@@ -126,16 +127,9 @@
                         <w:rFonts w:eastAsiaTheme="majorEastAsia" w:cstheme="minorHAnsi"/>
                         <w:sz w:val="80"/>
                         <w:szCs w:val="80"/>
+                        <w:u w:val="single"/>
                       </w:rPr>
-                      <w:t xml:space="preserve">Propuesta de Proyecto       y </w:t>
-                    </w:r>
-                    <w:r>
-                      <w:rPr>
-                        <w:rFonts w:eastAsiaTheme="majorEastAsia" w:cstheme="minorHAnsi"/>
-                        <w:sz w:val="80"/>
-                        <w:szCs w:val="80"/>
-                      </w:rPr>
-                      <w:t>Especificación de Requisitos de Software</w:t>
+                      <w:t>Propuesta de Proyecto       y Especificación de Requisitos de Software</w:t>
                     </w:r>
                   </w:p>
                 </w:tc>
@@ -201,7 +195,7 @@
                         <w:szCs w:val="44"/>
                         <w:lang w:val="es-AR"/>
                       </w:rPr>
-                      <w:t>[Insertar Nombre de Proyecto]</w:t>
+                      <w:t>A2D_SM</w:t>
                     </w:r>
                   </w:p>
                 </w:tc>
@@ -313,9 +307,9 @@
                 </w:rPr>
                 <w:alias w:val="Fecha"/>
                 <w:id w:val="516659546"/>
-                <w:showingPlcHdr/>
                 <w:dataBinding w:prefixMappings="xmlns:ns0='http://schemas.microsoft.com/office/2006/coverPageProps'" w:xpath="/ns0:CoverPageProperties[1]/ns0:PublishDate[1]" w:storeItemID="{55AF091B-3C7A-41E3-B477-F2FDAA23CFDA}"/>
-                <w:date>
+                <w:date w:fullDate="2026-10-05T00:00:00Z">
+                  <w:dateFormat w:val="dd/MM/yyyy"/>
                   <w:lid w:val="es-ES"/>
                   <w:storeMappedDataAs w:val="dateTime"/>
                   <w:calendar w:val="gregorian"/>
@@ -342,9 +336,8 @@
                         <w:rFonts w:cstheme="minorHAnsi"/>
                         <w:b/>
                         <w:bCs/>
-                        <w:color w:val="FF0000"/>
                       </w:rPr>
-                      <w:t>[Seleccionar fecha]</w:t>
+                      <w:t>05/10/2026</w:t>
                     </w:r>
                   </w:p>
                 </w:tc>
@@ -716,7 +709,7 @@
                 <w:noProof/>
                 <w:webHidden/>
               </w:rPr>
-              <w:t>2</w:t>
+              <w:t>3</w:t>
             </w:r>
             <w:r>
               <w:rPr>
@@ -816,7 +809,7 @@
                 <w:noProof/>
                 <w:webHidden/>
               </w:rPr>
-              <w:t>5</w:t>
+              <w:t>4</w:t>
             </w:r>
             <w:r>
               <w:rPr>
@@ -912,7 +905,7 @@
                 <w:noProof/>
                 <w:webHidden/>
               </w:rPr>
-              <w:t>5</w:t>
+              <w:t>4</w:t>
             </w:r>
             <w:r>
               <w:rPr>
@@ -1008,7 +1001,7 @@
                 <w:noProof/>
                 <w:webHidden/>
               </w:rPr>
-              <w:t>5</w:t>
+              <w:t>8</w:t>
             </w:r>
             <w:r>
               <w:rPr>
@@ -1106,7 +1099,7 @@
                 <w:noProof/>
                 <w:webHidden/>
               </w:rPr>
-              <w:t>5</w:t>
+              <w:t>8</w:t>
             </w:r>
             <w:r>
               <w:rPr>
@@ -1204,7 +1197,7 @@
                 <w:noProof/>
                 <w:webHidden/>
               </w:rPr>
-              <w:t>5</w:t>
+              <w:t>9</w:t>
             </w:r>
             <w:r>
               <w:rPr>
@@ -1302,7 +1295,7 @@
                 <w:noProof/>
                 <w:webHidden/>
               </w:rPr>
-              <w:t>5</w:t>
+              <w:t>10</w:t>
             </w:r>
             <w:r>
               <w:rPr>
@@ -1398,7 +1391,7 @@
                 <w:noProof/>
                 <w:webHidden/>
               </w:rPr>
-              <w:t>5</w:t>
+              <w:t>12</w:t>
             </w:r>
             <w:r>
               <w:rPr>
@@ -1496,7 +1489,7 @@
                 <w:noProof/>
                 <w:webHidden/>
               </w:rPr>
-              <w:t>5</w:t>
+              <w:t>12</w:t>
             </w:r>
             <w:r>
               <w:rPr>
@@ -2204,8 +2197,6 @@
     </w:p>
     <w:p>
       <w:pPr>
-        <w:spacing w:after="0" w:line="240" w:lineRule="auto"/>
-        <w:jc w:val="both"/>
         <w:rPr>
           <w:rFonts w:eastAsia="Times New Roman" w:cstheme="minorHAnsi"/>
           <w:sz w:val="20"/>
@@ -2213,6 +2204,15 @@
           <w:lang w:val="es-ES" w:eastAsia="es-ES"/>
         </w:rPr>
       </w:pPr>
+      <w:r>
+        <w:rPr>
+          <w:rFonts w:eastAsia="Times New Roman" w:cstheme="minorHAnsi"/>
+          <w:sz w:val="20"/>
+          <w:szCs w:val="24"/>
+          <w:lang w:val="es-ES" w:eastAsia="es-ES"/>
+        </w:rPr>
+        <w:br w:type="page"/>
+      </w:r>
     </w:p>
     <w:p>
       <w:pPr>
@@ -2220,6 +2220,7 @@
       </w:pPr>
       <w:bookmarkStart w:id="2" w:name="_Toc241504831"/>
       <w:r>
+        <w:lastRenderedPageBreak/>
         <w:t>Integrantes:</w:t>
       </w:r>
       <w:bookmarkEnd w:id="2"/>
@@ -2309,12 +2310,30 @@
             <w:pPr>
               <w:jc w:val="both"/>
               <w:rPr>
-                <w:rFonts w:asciiTheme="minorHAnsi" w:hAnsiTheme="minorHAnsi" w:cstheme="minorHAnsi"/>
+                <w:rFonts w:cstheme="minorHAnsi"/>
                 <w:i/>
                 <w:szCs w:val="24"/>
                 <w:lang w:val="es-ES" w:eastAsia="es-ES"/>
               </w:rPr>
             </w:pPr>
+            <w:r>
+              <w:rPr>
+                <w:rFonts w:cstheme="minorHAnsi"/>
+                <w:i/>
+                <w:szCs w:val="24"/>
+                <w:lang w:val="es-ES" w:eastAsia="es-ES"/>
+              </w:rPr>
+              <w:t xml:space="preserve">Alejandro </w:t>
+            </w:r>
+            <w:r>
+              <w:rPr>
+                <w:rFonts w:cstheme="minorHAnsi"/>
+                <w:i/>
+                <w:szCs w:val="24"/>
+                <w:lang w:val="es-ES" w:eastAsia="es-ES"/>
+              </w:rPr>
+              <w:t>Rodríguez</w:t>
+            </w:r>
           </w:p>
         </w:tc>
         <w:tc>
@@ -2326,12 +2345,21 @@
             <w:pPr>
               <w:jc w:val="both"/>
               <w:rPr>
-                <w:rFonts w:asciiTheme="minorHAnsi" w:hAnsiTheme="minorHAnsi" w:cstheme="minorHAnsi"/>
+                <w:rFonts w:cstheme="minorHAnsi"/>
                 <w:i/>
                 <w:szCs w:val="24"/>
                 <w:lang w:val="es-ES" w:eastAsia="es-ES"/>
               </w:rPr>
             </w:pPr>
+            <w:r>
+              <w:rPr>
+                <w:rFonts w:cstheme="minorHAnsi"/>
+                <w:i/>
+                <w:szCs w:val="24"/>
+                <w:lang w:val="es-ES" w:eastAsia="es-ES"/>
+              </w:rPr>
+              <w:t>Project Manager</w:t>
+            </w:r>
           </w:p>
         </w:tc>
       </w:tr>
@@ -2361,8 +2389,7 @@
                 <w:szCs w:val="24"/>
                 <w:lang w:val="es-ES" w:eastAsia="es-ES"/>
               </w:rPr>
-              <w:lastRenderedPageBreak/>
-              <w:t>Alejandro Rodriguez</w:t>
+              <w:t>Diego Carrillo</w:t>
             </w:r>
           </w:p>
         </w:tc>
@@ -2388,7 +2415,7 @@
                 <w:szCs w:val="24"/>
                 <w:lang w:val="es-ES" w:eastAsia="es-ES"/>
               </w:rPr>
-              <w:t>Project Manager</w:t>
+              <w:t>Analista de Base de Datos</w:t>
             </w:r>
           </w:p>
         </w:tc>
@@ -2419,7 +2446,7 @@
                 <w:szCs w:val="24"/>
                 <w:lang w:val="es-ES" w:eastAsia="es-ES"/>
               </w:rPr>
-              <w:t>Diego Carrillo</w:t>
+              <w:t>Angelo Galindo</w:t>
             </w:r>
           </w:p>
         </w:tc>
@@ -2445,104 +2472,8 @@
                 <w:szCs w:val="24"/>
                 <w:lang w:val="es-ES" w:eastAsia="es-ES"/>
               </w:rPr>
-              <w:t>Analista de Base de Datos</w:t>
-            </w:r>
-          </w:p>
-        </w:tc>
-      </w:tr>
-      <w:tr>
-        <w:trPr>
-          <w:trHeight w:val="465"/>
-        </w:trPr>
-        <w:tc>
-          <w:tcPr>
-            <w:tcW w:w="3539" w:type="dxa"/>
-            <w:vAlign w:val="center"/>
-          </w:tcPr>
-          <w:p>
-            <w:pPr>
-              <w:jc w:val="both"/>
-              <w:rPr>
-                <w:rFonts w:cstheme="minorHAnsi"/>
-                <w:i/>
-                <w:szCs w:val="24"/>
-                <w:lang w:val="es-ES" w:eastAsia="es-ES"/>
-              </w:rPr>
-            </w:pPr>
-            <w:r>
-              <w:rPr>
-                <w:rFonts w:cstheme="minorHAnsi"/>
-                <w:i/>
-                <w:szCs w:val="24"/>
-                <w:lang w:val="es-ES" w:eastAsia="es-ES"/>
-              </w:rPr>
-              <w:t>Angelo Galindo</w:t>
-            </w:r>
-          </w:p>
-        </w:tc>
-        <w:tc>
-          <w:tcPr>
-            <w:tcW w:w="5275" w:type="dxa"/>
-            <w:vAlign w:val="center"/>
-          </w:tcPr>
-          <w:p>
-            <w:pPr>
-              <w:jc w:val="both"/>
-              <w:rPr>
-                <w:rFonts w:cstheme="minorHAnsi"/>
-                <w:i/>
-                <w:szCs w:val="24"/>
-                <w:lang w:val="es-ES" w:eastAsia="es-ES"/>
-              </w:rPr>
-            </w:pPr>
-            <w:r>
-              <w:rPr>
-                <w:rFonts w:cstheme="minorHAnsi"/>
-                <w:i/>
-                <w:szCs w:val="24"/>
-                <w:lang w:val="es-ES" w:eastAsia="es-ES"/>
-              </w:rPr>
               <w:t>QA</w:t>
             </w:r>
-          </w:p>
-        </w:tc>
-      </w:tr>
-      <w:tr>
-        <w:trPr>
-          <w:trHeight w:val="465"/>
-        </w:trPr>
-        <w:tc>
-          <w:tcPr>
-            <w:tcW w:w="3539" w:type="dxa"/>
-            <w:vAlign w:val="center"/>
-          </w:tcPr>
-          <w:p>
-            <w:pPr>
-              <w:jc w:val="both"/>
-              <w:rPr>
-                <w:rFonts w:cstheme="minorHAnsi"/>
-                <w:i/>
-                <w:szCs w:val="24"/>
-                <w:lang w:val="es-ES" w:eastAsia="es-ES"/>
-              </w:rPr>
-            </w:pPr>
-          </w:p>
-        </w:tc>
-        <w:tc>
-          <w:tcPr>
-            <w:tcW w:w="5275" w:type="dxa"/>
-            <w:vAlign w:val="center"/>
-          </w:tcPr>
-          <w:p>
-            <w:pPr>
-              <w:jc w:val="both"/>
-              <w:rPr>
-                <w:rFonts w:cstheme="minorHAnsi"/>
-                <w:i/>
-                <w:szCs w:val="24"/>
-                <w:lang w:val="es-ES" w:eastAsia="es-ES"/>
-              </w:rPr>
-            </w:pPr>
           </w:p>
         </w:tc>
       </w:tr>
@@ -2574,22 +2505,6 @@
           <w:b/>
         </w:rPr>
       </w:pPr>
-      <w:r>
-        <w:rPr>
-          <w:rFonts w:cstheme="minorHAnsi"/>
-          <w:b/>
-        </w:rPr>
-        <w:lastRenderedPageBreak/>
-        <w:br w:type="page"/>
-      </w:r>
-    </w:p>
-    <w:p>
-      <w:pPr>
-        <w:jc w:val="both"/>
-        <w:rPr>
-          <w:lang w:val="es-ES" w:eastAsia="es-ES"/>
-        </w:rPr>
-      </w:pPr>
     </w:p>
     <w:p>
       <w:pPr>
@@ -2612,12 +2527,453 @@
       </w:r>
       <w:bookmarkEnd w:id="4"/>
     </w:p>
+    <w:p>
+      <w:pPr>
+        <w:pStyle w:val="Ttulo2"/>
+        <w:numPr>
+          <w:ilvl w:val="0"/>
+          <w:numId w:val="0"/>
+        </w:numPr>
+        <w:ind w:left="576"/>
+        <w:jc w:val="center"/>
+        <w:rPr>
+          <w:rFonts w:asciiTheme="minorHAnsi" w:eastAsiaTheme="minorHAnsi" w:hAnsiTheme="minorHAnsi" w:cstheme="minorBidi"/>
+          <w:b w:val="0"/>
+          <w:bCs w:val="0"/>
+          <w:color w:val="auto"/>
+          <w:sz w:val="22"/>
+          <w:szCs w:val="22"/>
+        </w:rPr>
+      </w:pPr>
+      <w:r>
+        <w:rPr>
+          <w:rFonts w:asciiTheme="minorHAnsi" w:eastAsiaTheme="minorHAnsi" w:hAnsiTheme="minorHAnsi" w:cstheme="minorBidi"/>
+          <w:b w:val="0"/>
+          <w:bCs w:val="0"/>
+          <w:color w:val="auto"/>
+          <w:sz w:val="22"/>
+          <w:szCs w:val="22"/>
+        </w:rPr>
+        <w:t>Caso de uso - Operador de recepción</w:t>
+      </w:r>
+    </w:p>
+    <w:p>
+      <w:pPr>
+        <w:pStyle w:val="Ttulo2"/>
+        <w:numPr>
+          <w:ilvl w:val="0"/>
+          <w:numId w:val="0"/>
+        </w:numPr>
+        <w:ind w:left="576"/>
+        <w:jc w:val="center"/>
+        <w:rPr>
+          <w:rFonts w:asciiTheme="minorHAnsi" w:eastAsiaTheme="minorHAnsi" w:hAnsiTheme="minorHAnsi" w:cstheme="minorBidi"/>
+          <w:b w:val="0"/>
+          <w:bCs w:val="0"/>
+          <w:color w:val="auto"/>
+          <w:sz w:val="22"/>
+          <w:szCs w:val="22"/>
+        </w:rPr>
+      </w:pPr>
+      <w:r>
+        <w:rPr>
+          <w:noProof/>
+        </w:rPr>
+        <w:drawing>
+          <wp:anchor distT="0" distB="0" distL="114300" distR="114300" simplePos="0" relativeHeight="251641856" behindDoc="1" locked="0" layoutInCell="1" allowOverlap="1" wp14:anchorId="648EB09B" wp14:editId="162B798C">
+            <wp:simplePos x="0" y="0"/>
+            <wp:positionH relativeFrom="column">
+              <wp:posOffset>-385869</wp:posOffset>
+            </wp:positionH>
+            <wp:positionV relativeFrom="paragraph">
+              <wp:posOffset>254847</wp:posOffset>
+            </wp:positionV>
+            <wp:extent cx="6316133" cy="5310611"/>
+            <wp:effectExtent l="0" t="0" r="0" b="0"/>
+            <wp:wrapNone/>
+            <wp:docPr id="1786144815" name="Imagen 1"/>
+            <wp:cNvGraphicFramePr>
+              <a:graphicFrameLocks xmlns:a="http://schemas.openxmlformats.org/drawingml/2006/main" noChangeAspect="1"/>
+            </wp:cNvGraphicFramePr>
+            <a:graphic xmlns:a="http://schemas.openxmlformats.org/drawingml/2006/main">
+              <a:graphicData uri="http://schemas.openxmlformats.org/drawingml/2006/picture">
+                <pic:pic xmlns:pic="http://schemas.openxmlformats.org/drawingml/2006/picture">
+                  <pic:nvPicPr>
+                    <pic:cNvPr id="0" name="Picture 1"/>
+                    <pic:cNvPicPr>
+                      <a:picLocks noChangeAspect="1" noChangeArrowheads="1"/>
+                    </pic:cNvPicPr>
+                  </pic:nvPicPr>
+                  <pic:blipFill>
+                    <a:blip r:embed="rId12">
+                      <a:extLst>
+                        <a:ext uri="{28A0092B-C50C-407E-A947-70E740481C1C}">
+                          <a14:useLocalDpi xmlns:a14="http://schemas.microsoft.com/office/drawing/2010/main" val="0"/>
+                        </a:ext>
+                      </a:extLst>
+                    </a:blip>
+                    <a:srcRect/>
+                    <a:stretch>
+                      <a:fillRect/>
+                    </a:stretch>
+                  </pic:blipFill>
+                  <pic:spPr bwMode="auto">
+                    <a:xfrm>
+                      <a:off x="0" y="0"/>
+                      <a:ext cx="6326724" cy="5319516"/>
+                    </a:xfrm>
+                    <a:prstGeom prst="rect">
+                      <a:avLst/>
+                    </a:prstGeom>
+                    <a:noFill/>
+                    <a:ln>
+                      <a:noFill/>
+                    </a:ln>
+                  </pic:spPr>
+                </pic:pic>
+              </a:graphicData>
+            </a:graphic>
+            <wp14:sizeRelH relativeFrom="margin">
+              <wp14:pctWidth>0</wp14:pctWidth>
+            </wp14:sizeRelH>
+            <wp14:sizeRelV relativeFrom="margin">
+              <wp14:pctHeight>0</wp14:pctHeight>
+            </wp14:sizeRelV>
+          </wp:anchor>
+        </w:drawing>
+      </w:r>
+    </w:p>
+    <w:p/>
+    <w:p/>
+    <w:p/>
+    <w:p/>
+    <w:p/>
+    <w:p/>
+    <w:p/>
+    <w:p/>
+    <w:p/>
+    <w:p/>
+    <w:p/>
+    <w:p/>
+    <w:p/>
     <w:p/>
     <w:p>
+      <w:r>
+        <w:br w:type="page"/>
+      </w:r>
+    </w:p>
+    <w:p>
+      <w:pPr>
+        <w:jc w:val="center"/>
+        <w:rPr>
+          <w:noProof/>
+        </w:rPr>
+      </w:pPr>
+      <w:r>
+        <w:rPr>
+          <w:noProof/>
+        </w:rPr>
+        <w:lastRenderedPageBreak/>
+        <w:t>Caso de uso - Operador de proceso</w:t>
+      </w:r>
+    </w:p>
+    <w:p>
+      <w:pPr>
+        <w:jc w:val="center"/>
+      </w:pPr>
+      <w:r>
+        <w:rPr>
+          <w:noProof/>
+        </w:rPr>
+        <w:drawing>
+          <wp:inline distT="0" distB="0" distL="0" distR="0" wp14:anchorId="35842A92" wp14:editId="783FFE9C">
+            <wp:extent cx="5612130" cy="5542280"/>
+            <wp:effectExtent l="0" t="0" r="0" b="0"/>
+            <wp:docPr id="241663544" name="Imagen 3"/>
+            <wp:cNvGraphicFramePr>
+              <a:graphicFrameLocks xmlns:a="http://schemas.openxmlformats.org/drawingml/2006/main" noChangeAspect="1"/>
+            </wp:cNvGraphicFramePr>
+            <a:graphic xmlns:a="http://schemas.openxmlformats.org/drawingml/2006/main">
+              <a:graphicData uri="http://schemas.openxmlformats.org/drawingml/2006/picture">
+                <pic:pic xmlns:pic="http://schemas.openxmlformats.org/drawingml/2006/picture">
+                  <pic:nvPicPr>
+                    <pic:cNvPr id="0" name="Picture 4"/>
+                    <pic:cNvPicPr>
+                      <a:picLocks noChangeAspect="1" noChangeArrowheads="1"/>
+                    </pic:cNvPicPr>
+                  </pic:nvPicPr>
+                  <pic:blipFill>
+                    <a:blip r:embed="rId13">
+                      <a:extLst>
+                        <a:ext uri="{28A0092B-C50C-407E-A947-70E740481C1C}">
+                          <a14:useLocalDpi xmlns:a14="http://schemas.microsoft.com/office/drawing/2010/main" val="0"/>
+                        </a:ext>
+                      </a:extLst>
+                    </a:blip>
+                    <a:srcRect/>
+                    <a:stretch>
+                      <a:fillRect/>
+                    </a:stretch>
+                  </pic:blipFill>
+                  <pic:spPr bwMode="auto">
+                    <a:xfrm>
+                      <a:off x="0" y="0"/>
+                      <a:ext cx="5612130" cy="5542280"/>
+                    </a:xfrm>
+                    <a:prstGeom prst="rect">
+                      <a:avLst/>
+                    </a:prstGeom>
+                    <a:noFill/>
+                    <a:ln>
+                      <a:noFill/>
+                    </a:ln>
+                  </pic:spPr>
+                </pic:pic>
+              </a:graphicData>
+            </a:graphic>
+          </wp:inline>
+        </w:drawing>
+      </w:r>
+    </w:p>
+    <w:p>
+      <w:r>
+        <w:br w:type="page"/>
+      </w:r>
+    </w:p>
+    <w:p>
+      <w:pPr>
+        <w:jc w:val="center"/>
+      </w:pPr>
+      <w:r>
+        <w:lastRenderedPageBreak/>
+        <w:t>Caso de uso - Administrador</w:t>
+      </w:r>
+    </w:p>
+    <w:p>
+      <w:r>
+        <w:rPr>
+          <w:noProof/>
+        </w:rPr>
+        <w:drawing>
+          <wp:inline distT="0" distB="0" distL="0" distR="0" wp14:anchorId="372EEE94" wp14:editId="0C2EF12F">
+            <wp:extent cx="6231467" cy="6231467"/>
+            <wp:effectExtent l="0" t="0" r="0" b="0"/>
+            <wp:docPr id="1128499574" name="Imagen 4"/>
+            <wp:cNvGraphicFramePr>
+              <a:graphicFrameLocks xmlns:a="http://schemas.openxmlformats.org/drawingml/2006/main" noChangeAspect="1"/>
+            </wp:cNvGraphicFramePr>
+            <a:graphic xmlns:a="http://schemas.openxmlformats.org/drawingml/2006/main">
+              <a:graphicData uri="http://schemas.openxmlformats.org/drawingml/2006/picture">
+                <pic:pic xmlns:pic="http://schemas.openxmlformats.org/drawingml/2006/picture">
+                  <pic:nvPicPr>
+                    <pic:cNvPr id="0" name="Picture 6"/>
+                    <pic:cNvPicPr>
+                      <a:picLocks noChangeAspect="1" noChangeArrowheads="1"/>
+                    </pic:cNvPicPr>
+                  </pic:nvPicPr>
+                  <pic:blipFill>
+                    <a:blip r:embed="rId14">
+                      <a:extLst>
+                        <a:ext uri="{28A0092B-C50C-407E-A947-70E740481C1C}">
+                          <a14:useLocalDpi xmlns:a14="http://schemas.microsoft.com/office/drawing/2010/main" val="0"/>
+                        </a:ext>
+                      </a:extLst>
+                    </a:blip>
+                    <a:srcRect/>
+                    <a:stretch>
+                      <a:fillRect/>
+                    </a:stretch>
+                  </pic:blipFill>
+                  <pic:spPr bwMode="auto">
+                    <a:xfrm>
+                      <a:off x="0" y="0"/>
+                      <a:ext cx="6235790" cy="6235790"/>
+                    </a:xfrm>
+                    <a:prstGeom prst="rect">
+                      <a:avLst/>
+                    </a:prstGeom>
+                    <a:noFill/>
+                    <a:ln>
+                      <a:noFill/>
+                    </a:ln>
+                  </pic:spPr>
+                </pic:pic>
+              </a:graphicData>
+            </a:graphic>
+          </wp:inline>
+        </w:drawing>
+      </w:r>
+    </w:p>
+    <w:p>
+      <w:r>
+        <w:br w:type="page"/>
+      </w:r>
+    </w:p>
+    <w:p>
+      <w:pPr>
+        <w:jc w:val="center"/>
+      </w:pPr>
+      <w:r>
+        <w:lastRenderedPageBreak/>
+        <w:t>Caso de uso - Gerencia</w:t>
+      </w:r>
+    </w:p>
+    <w:p>
+      <w:pPr>
+        <w:jc w:val="center"/>
+      </w:pPr>
+      <w:r>
+        <w:rPr>
+          <w:noProof/>
+        </w:rPr>
+        <w:drawing>
+          <wp:inline distT="0" distB="0" distL="0" distR="0" wp14:anchorId="78257762" wp14:editId="13594008">
+            <wp:extent cx="4673600" cy="6984355"/>
+            <wp:effectExtent l="0" t="0" r="0" b="0"/>
+            <wp:docPr id="531192965" name="Imagen 5"/>
+            <wp:cNvGraphicFramePr>
+              <a:graphicFrameLocks xmlns:a="http://schemas.openxmlformats.org/drawingml/2006/main" noChangeAspect="1"/>
+            </wp:cNvGraphicFramePr>
+            <a:graphic xmlns:a="http://schemas.openxmlformats.org/drawingml/2006/main">
+              <a:graphicData uri="http://schemas.openxmlformats.org/drawingml/2006/picture">
+                <pic:pic xmlns:pic="http://schemas.openxmlformats.org/drawingml/2006/picture">
+                  <pic:nvPicPr>
+                    <pic:cNvPr id="0" name="Picture 8"/>
+                    <pic:cNvPicPr>
+                      <a:picLocks noChangeAspect="1" noChangeArrowheads="1"/>
+                    </pic:cNvPicPr>
+                  </pic:nvPicPr>
+                  <pic:blipFill>
+                    <a:blip r:embed="rId15">
+                      <a:extLst>
+                        <a:ext uri="{28A0092B-C50C-407E-A947-70E740481C1C}">
+                          <a14:useLocalDpi xmlns:a14="http://schemas.microsoft.com/office/drawing/2010/main" val="0"/>
+                        </a:ext>
+                      </a:extLst>
+                    </a:blip>
+                    <a:srcRect/>
+                    <a:stretch>
+                      <a:fillRect/>
+                    </a:stretch>
+                  </pic:blipFill>
+                  <pic:spPr bwMode="auto">
+                    <a:xfrm>
+                      <a:off x="0" y="0"/>
+                      <a:ext cx="4678294" cy="6991370"/>
+                    </a:xfrm>
+                    <a:prstGeom prst="rect">
+                      <a:avLst/>
+                    </a:prstGeom>
+                    <a:noFill/>
+                    <a:ln>
+                      <a:noFill/>
+                    </a:ln>
+                  </pic:spPr>
+                </pic:pic>
+              </a:graphicData>
+            </a:graphic>
+          </wp:inline>
+        </w:drawing>
+      </w:r>
+    </w:p>
+    <w:p>
+      <w:pPr>
+        <w:jc w:val="center"/>
+      </w:pPr>
+    </w:p>
+    <w:p>
+      <w:pPr>
+        <w:jc w:val="center"/>
+      </w:pPr>
+    </w:p>
+    <w:p>
       <w:pPr>
         <w:pStyle w:val="Ttulo2"/>
+        <w:sectPr>
+          <w:headerReference w:type="default" r:id="rId16"/>
+          <w:footerReference w:type="default" r:id="rId17"/>
+          <w:headerReference w:type="first" r:id="rId18"/>
+          <w:pgSz w:w="12240" w:h="15840"/>
+          <w:pgMar w:top="1417" w:right="1701" w:bottom="1417" w:left="1701" w:header="708" w:footer="708" w:gutter="0"/>
+          <w:cols w:space="708"/>
+          <w:titlePg/>
+          <w:docGrid w:linePitch="360"/>
+        </w:sectPr>
       </w:pPr>
       <w:bookmarkStart w:id="5" w:name="_Toc241504834"/>
+    </w:p>
+    <w:p>
+      <w:pPr>
+        <w:pStyle w:val="Ttulo2"/>
+      </w:pPr>
+      <w:r>
+        <w:rPr>
+          <w:noProof/>
+        </w:rPr>
+        <w:lastRenderedPageBreak/>
+        <w:drawing>
+          <wp:anchor distT="0" distB="0" distL="114300" distR="114300" simplePos="0" relativeHeight="251648000" behindDoc="1" locked="0" layoutInCell="1" allowOverlap="1" wp14:anchorId="1C47998D" wp14:editId="41ABCA09">
+            <wp:simplePos x="0" y="0"/>
+            <wp:positionH relativeFrom="column">
+              <wp:posOffset>-652780</wp:posOffset>
+            </wp:positionH>
+            <wp:positionV relativeFrom="paragraph">
+              <wp:posOffset>137795</wp:posOffset>
+            </wp:positionV>
+            <wp:extent cx="9486900" cy="5690205"/>
+            <wp:effectExtent l="0" t="0" r="0" b="0"/>
+            <wp:wrapNone/>
+            <wp:docPr id="2096950476" name="Imagen 6"/>
+            <wp:cNvGraphicFramePr>
+              <a:graphicFrameLocks xmlns:a="http://schemas.openxmlformats.org/drawingml/2006/main" noChangeAspect="1"/>
+            </wp:cNvGraphicFramePr>
+            <a:graphic xmlns:a="http://schemas.openxmlformats.org/drawingml/2006/main">
+              <a:graphicData uri="http://schemas.openxmlformats.org/drawingml/2006/picture">
+                <pic:pic xmlns:pic="http://schemas.openxmlformats.org/drawingml/2006/picture">
+                  <pic:nvPicPr>
+                    <pic:cNvPr id="0" name="Picture 10"/>
+                    <pic:cNvPicPr>
+                      <a:picLocks noChangeAspect="1" noChangeArrowheads="1"/>
+                    </pic:cNvPicPr>
+                  </pic:nvPicPr>
+                  <pic:blipFill>
+                    <a:blip r:embed="rId19">
+                      <a:extLst>
+                        <a:ext uri="{28A0092B-C50C-407E-A947-70E740481C1C}">
+                          <a14:useLocalDpi xmlns:a14="http://schemas.microsoft.com/office/drawing/2010/main" val="0"/>
+                        </a:ext>
+                      </a:extLst>
+                    </a:blip>
+                    <a:srcRect/>
+                    <a:stretch>
+                      <a:fillRect/>
+                    </a:stretch>
+                  </pic:blipFill>
+                  <pic:spPr bwMode="auto">
+                    <a:xfrm>
+                      <a:off x="0" y="0"/>
+                      <a:ext cx="9486900" cy="5690205"/>
+                    </a:xfrm>
+                    <a:prstGeom prst="rect">
+                      <a:avLst/>
+                    </a:prstGeom>
+                    <a:noFill/>
+                    <a:ln>
+                      <a:noFill/>
+                    </a:ln>
+                  </pic:spPr>
+                </pic:pic>
+              </a:graphicData>
+            </a:graphic>
+            <wp14:sizeRelH relativeFrom="margin">
+              <wp14:pctWidth>0</wp14:pctWidth>
+            </wp14:sizeRelH>
+            <wp14:sizeRelV relativeFrom="margin">
+              <wp14:pctHeight>0</wp14:pctHeight>
+            </wp14:sizeRelV>
+          </wp:anchor>
+        </w:drawing>
+      </w:r>
       <w:r>
         <w:t>Vista Lógica</w:t>
       </w:r>
@@ -2639,6 +2995,115 @@
           <w:lang w:val="es-ES" w:eastAsia="es-ES"/>
         </w:rPr>
       </w:pPr>
+    </w:p>
+    <w:p>
+      <w:pPr>
+        <w:rPr>
+          <w:lang w:val="es-ES" w:eastAsia="es-ES"/>
+        </w:rPr>
+      </w:pPr>
+    </w:p>
+    <w:p>
+      <w:pPr>
+        <w:rPr>
+          <w:lang w:val="es-ES" w:eastAsia="es-ES"/>
+        </w:rPr>
+      </w:pPr>
+      <w:r>
+        <w:rPr>
+          <w:lang w:val="es-ES" w:eastAsia="es-ES"/>
+        </w:rPr>
+        <w:br w:type="page"/>
+      </w:r>
+    </w:p>
+    <w:p>
+      <w:pPr>
+        <w:rPr>
+          <w:lang w:val="es-ES" w:eastAsia="es-ES"/>
+        </w:rPr>
+        <w:sectPr>
+          <w:pgSz w:w="15840" w:h="12240" w:orient="landscape" w:code="1"/>
+          <w:pgMar w:top="1701" w:right="1418" w:bottom="1701" w:left="1418" w:header="709" w:footer="709" w:gutter="0"/>
+          <w:cols w:space="708"/>
+          <w:titlePg/>
+          <w:docGrid w:linePitch="360"/>
+        </w:sectPr>
+      </w:pPr>
+    </w:p>
+    <w:p>
+      <w:pPr>
+        <w:rPr>
+          <w:lang w:val="es-ES" w:eastAsia="es-ES"/>
+        </w:rPr>
+      </w:pPr>
+      <w:r>
+        <w:rPr>
+          <w:noProof/>
+        </w:rPr>
+        <w:lastRenderedPageBreak/>
+        <w:drawing>
+          <wp:anchor distT="0" distB="0" distL="114300" distR="114300" simplePos="0" relativeHeight="251655168" behindDoc="1" locked="0" layoutInCell="1" allowOverlap="1" wp14:anchorId="0D815C33" wp14:editId="51714ACD">
+            <wp:simplePos x="0" y="0"/>
+            <wp:positionH relativeFrom="column">
+              <wp:posOffset>-490856</wp:posOffset>
+            </wp:positionH>
+            <wp:positionV relativeFrom="paragraph">
+              <wp:posOffset>13969</wp:posOffset>
+            </wp:positionV>
+            <wp:extent cx="9286875" cy="6029429"/>
+            <wp:effectExtent l="0" t="0" r="0" b="0"/>
+            <wp:wrapNone/>
+            <wp:docPr id="2117855738" name="Imagen 7"/>
+            <wp:cNvGraphicFramePr>
+              <a:graphicFrameLocks xmlns:a="http://schemas.openxmlformats.org/drawingml/2006/main" noChangeAspect="1"/>
+            </wp:cNvGraphicFramePr>
+            <a:graphic xmlns:a="http://schemas.openxmlformats.org/drawingml/2006/main">
+              <a:graphicData uri="http://schemas.openxmlformats.org/drawingml/2006/picture">
+                <pic:pic xmlns:pic="http://schemas.openxmlformats.org/drawingml/2006/picture">
+                  <pic:nvPicPr>
+                    <pic:cNvPr id="0" name="Picture 12"/>
+                    <pic:cNvPicPr>
+                      <a:picLocks noChangeAspect="1" noChangeArrowheads="1"/>
+                    </pic:cNvPicPr>
+                  </pic:nvPicPr>
+                  <pic:blipFill>
+                    <a:blip r:embed="rId20">
+                      <a:extLst>
+                        <a:ext uri="{28A0092B-C50C-407E-A947-70E740481C1C}">
+                          <a14:useLocalDpi xmlns:a14="http://schemas.microsoft.com/office/drawing/2010/main" val="0"/>
+                        </a:ext>
+                      </a:extLst>
+                    </a:blip>
+                    <a:srcRect/>
+                    <a:stretch>
+                      <a:fillRect/>
+                    </a:stretch>
+                  </pic:blipFill>
+                  <pic:spPr bwMode="auto">
+                    <a:xfrm>
+                      <a:off x="0" y="0"/>
+                      <a:ext cx="9304240" cy="6040703"/>
+                    </a:xfrm>
+                    <a:prstGeom prst="rect">
+                      <a:avLst/>
+                    </a:prstGeom>
+                    <a:noFill/>
+                    <a:ln>
+                      <a:noFill/>
+                    </a:ln>
+                  </pic:spPr>
+                </pic:pic>
+              </a:graphicData>
+            </a:graphic>
+            <wp14:sizeRelH relativeFrom="margin">
+              <wp14:pctWidth>0</wp14:pctWidth>
+            </wp14:sizeRelH>
+            <wp14:sizeRelV relativeFrom="margin">
+              <wp14:pctHeight>0</wp14:pctHeight>
+            </wp14:sizeRelV>
+          </wp:anchor>
+        </w:drawing>
+      </w:r>
     </w:p>
     <w:p>
       <w:pPr>
@@ -2652,14 +3117,257 @@
     </w:p>
     <w:p/>
     <w:p>
+      <w:r>
+        <w:br w:type="page"/>
+      </w:r>
+    </w:p>
+    <w:p>
       <w:pPr>
         <w:pStyle w:val="Ttulo3"/>
+        <w:numPr>
+          <w:ilvl w:val="0"/>
+          <w:numId w:val="0"/>
+        </w:numPr>
+        <w:sectPr>
+          <w:pgSz w:w="15840" w:h="12240" w:orient="landscape"/>
+          <w:pgMar w:top="1701" w:right="1418" w:bottom="1701" w:left="1418" w:header="709" w:footer="709" w:gutter="0"/>
+          <w:cols w:space="708"/>
+          <w:titlePg/>
+          <w:docGrid w:linePitch="360"/>
+        </w:sectPr>
       </w:pPr>
       <w:bookmarkStart w:id="8" w:name="_Toc241504837"/>
+    </w:p>
+    <w:p>
+      <w:pPr>
+        <w:pStyle w:val="Ttulo3"/>
+      </w:pPr>
       <w:r>
+        <w:lastRenderedPageBreak/>
         <w:t>Diagrama de Secuencia</w:t>
       </w:r>
       <w:bookmarkEnd w:id="8"/>
+    </w:p>
+    <w:p>
+      <w:pPr>
+        <w:pStyle w:val="Ttulo3"/>
+        <w:numPr>
+          <w:ilvl w:val="0"/>
+          <w:numId w:val="0"/>
+        </w:numPr>
+        <w:ind w:left="720"/>
+        <w:jc w:val="center"/>
+        <w:rPr>
+          <w:rFonts w:asciiTheme="minorHAnsi" w:eastAsiaTheme="minorHAnsi" w:hAnsiTheme="minorHAnsi" w:cstheme="minorBidi"/>
+          <w:b w:val="0"/>
+          <w:bCs w:val="0"/>
+          <w:color w:val="auto"/>
+          <w:sz w:val="22"/>
+          <w:szCs w:val="22"/>
+        </w:rPr>
+      </w:pPr>
+      <w:r>
+        <w:rPr>
+          <w:rFonts w:asciiTheme="minorHAnsi" w:eastAsiaTheme="minorHAnsi" w:hAnsiTheme="minorHAnsi" w:cstheme="minorBidi"/>
+          <w:b w:val="0"/>
+          <w:bCs w:val="0"/>
+          <w:color w:val="auto"/>
+          <w:sz w:val="22"/>
+          <w:szCs w:val="22"/>
+        </w:rPr>
+        <w:t>Diagrama de secuencia - Inicio de sesión</w:t>
+      </w:r>
+    </w:p>
+    <w:p>
+      <w:pPr>
+        <w:rPr>
+          <w:lang w:val="es-ES" w:eastAsia="es-ES"/>
+        </w:rPr>
+      </w:pPr>
+      <w:r>
+        <w:rPr>
+          <w:noProof/>
+        </w:rPr>
+        <w:drawing>
+          <wp:anchor distT="0" distB="0" distL="114300" distR="114300" simplePos="0" relativeHeight="251673600" behindDoc="1" locked="0" layoutInCell="1" allowOverlap="1" wp14:anchorId="0A024C78" wp14:editId="3FFCE0B7">
+            <wp:simplePos x="0" y="0"/>
+            <wp:positionH relativeFrom="column">
+              <wp:posOffset>-1364048</wp:posOffset>
+            </wp:positionH>
+            <wp:positionV relativeFrom="paragraph">
+              <wp:posOffset>378097</wp:posOffset>
+            </wp:positionV>
+            <wp:extent cx="8209529" cy="6324600"/>
+            <wp:effectExtent l="0" t="0" r="0" b="0"/>
+            <wp:wrapNone/>
+            <wp:docPr id="918983248" name="Imagen 10"/>
+            <wp:cNvGraphicFramePr>
+              <a:graphicFrameLocks xmlns:a="http://schemas.openxmlformats.org/drawingml/2006/main" noChangeAspect="1"/>
+            </wp:cNvGraphicFramePr>
+            <a:graphic xmlns:a="http://schemas.openxmlformats.org/drawingml/2006/main">
+              <a:graphicData uri="http://schemas.openxmlformats.org/drawingml/2006/picture">
+                <pic:pic xmlns:pic="http://schemas.openxmlformats.org/drawingml/2006/picture">
+                  <pic:nvPicPr>
+                    <pic:cNvPr id="0" name="Picture 21"/>
+                    <pic:cNvPicPr>
+                      <a:picLocks noChangeAspect="1" noChangeArrowheads="1"/>
+                    </pic:cNvPicPr>
+                  </pic:nvPicPr>
+                  <pic:blipFill>
+                    <a:blip r:embed="rId21">
+                      <a:extLst>
+                        <a:ext uri="{28A0092B-C50C-407E-A947-70E740481C1C}">
+                          <a14:useLocalDpi xmlns:a14="http://schemas.microsoft.com/office/drawing/2010/main" val="0"/>
+                        </a:ext>
+                      </a:extLst>
+                    </a:blip>
+                    <a:srcRect/>
+                    <a:stretch>
+                      <a:fillRect/>
+                    </a:stretch>
+                  </pic:blipFill>
+                  <pic:spPr bwMode="auto">
+                    <a:xfrm>
+                      <a:off x="0" y="0"/>
+                      <a:ext cx="8242682" cy="6350141"/>
+                    </a:xfrm>
+                    <a:prstGeom prst="rect">
+                      <a:avLst/>
+                    </a:prstGeom>
+                    <a:noFill/>
+                    <a:ln>
+                      <a:noFill/>
+                    </a:ln>
+                  </pic:spPr>
+                </pic:pic>
+              </a:graphicData>
+            </a:graphic>
+            <wp14:sizeRelH relativeFrom="margin">
+              <wp14:pctWidth>0</wp14:pctWidth>
+            </wp14:sizeRelH>
+            <wp14:sizeRelV relativeFrom="margin">
+              <wp14:pctHeight>0</wp14:pctHeight>
+            </wp14:sizeRelV>
+          </wp:anchor>
+        </w:drawing>
+      </w:r>
+      <w:r>
+        <w:rPr>
+          <w:lang w:val="es-ES" w:eastAsia="es-ES"/>
+        </w:rPr>
+        <w:br w:type="page"/>
+      </w:r>
+    </w:p>
+    <w:p>
+      <w:pPr>
+        <w:jc w:val="center"/>
+        <w:rPr>
+          <w:lang w:val="es-ES" w:eastAsia="es-ES"/>
+        </w:rPr>
+        <w:sectPr>
+          <w:pgSz w:w="12240" w:h="15840"/>
+          <w:pgMar w:top="1418" w:right="1701" w:bottom="1418" w:left="1701" w:header="709" w:footer="709" w:gutter="0"/>
+          <w:cols w:space="708"/>
+          <w:titlePg/>
+          <w:docGrid w:linePitch="360"/>
+        </w:sectPr>
+      </w:pPr>
+    </w:p>
+    <w:p>
+      <w:pPr>
+        <w:jc w:val="center"/>
+        <w:rPr>
+          <w:lang w:val="es-ES" w:eastAsia="es-ES"/>
+        </w:rPr>
+      </w:pPr>
+      <w:r>
+        <w:rPr>
+          <w:lang w:val="es-ES" w:eastAsia="es-ES"/>
+        </w:rPr>
+        <w:lastRenderedPageBreak/>
+        <w:t>Diagrama de secuencia - Registro de tarja de recepción</w:t>
+      </w:r>
+    </w:p>
+    <w:p>
+      <w:pPr>
+        <w:rPr>
+          <w:lang w:val="es-ES" w:eastAsia="es-ES"/>
+        </w:rPr>
+        <w:sectPr>
+          <w:pgSz w:w="12240" w:h="15840"/>
+          <w:pgMar w:top="1418" w:right="1701" w:bottom="1418" w:left="1701" w:header="709" w:footer="709" w:gutter="0"/>
+          <w:cols w:space="708"/>
+          <w:titlePg/>
+          <w:docGrid w:linePitch="360"/>
+        </w:sectPr>
+      </w:pPr>
+      <w:r>
+        <w:rPr>
+          <w:noProof/>
+        </w:rPr>
+        <w:drawing>
+          <wp:anchor distT="0" distB="0" distL="114300" distR="114300" simplePos="0" relativeHeight="251675648" behindDoc="1" locked="0" layoutInCell="1" allowOverlap="1" wp14:anchorId="0F052675" wp14:editId="079D49C1">
+            <wp:simplePos x="0" y="0"/>
+            <wp:positionH relativeFrom="column">
+              <wp:posOffset>-1417593</wp:posOffset>
+            </wp:positionH>
+            <wp:positionV relativeFrom="paragraph">
+              <wp:posOffset>320766</wp:posOffset>
+            </wp:positionV>
+            <wp:extent cx="8336419" cy="6422571"/>
+            <wp:effectExtent l="0" t="0" r="0" b="0"/>
+            <wp:wrapNone/>
+            <wp:docPr id="1396443609" name="Imagen 11"/>
+            <wp:cNvGraphicFramePr>
+              <a:graphicFrameLocks xmlns:a="http://schemas.openxmlformats.org/drawingml/2006/main" noChangeAspect="1"/>
+            </wp:cNvGraphicFramePr>
+            <a:graphic xmlns:a="http://schemas.openxmlformats.org/drawingml/2006/main">
+              <a:graphicData uri="http://schemas.openxmlformats.org/drawingml/2006/picture">
+                <pic:pic xmlns:pic="http://schemas.openxmlformats.org/drawingml/2006/picture">
+                  <pic:nvPicPr>
+                    <pic:cNvPr id="0" name="Picture 23"/>
+                    <pic:cNvPicPr>
+                      <a:picLocks noChangeAspect="1" noChangeArrowheads="1"/>
+                    </pic:cNvPicPr>
+                  </pic:nvPicPr>
+                  <pic:blipFill>
+                    <a:blip r:embed="rId21">
+                      <a:extLst>
+                        <a:ext uri="{28A0092B-C50C-407E-A947-70E740481C1C}">
+                          <a14:useLocalDpi xmlns:a14="http://schemas.microsoft.com/office/drawing/2010/main" val="0"/>
+                        </a:ext>
+                      </a:extLst>
+                    </a:blip>
+                    <a:srcRect/>
+                    <a:stretch>
+                      <a:fillRect/>
+                    </a:stretch>
+                  </pic:blipFill>
+                  <pic:spPr bwMode="auto">
+                    <a:xfrm>
+                      <a:off x="0" y="0"/>
+                      <a:ext cx="8373143" cy="6450864"/>
+                    </a:xfrm>
+                    <a:prstGeom prst="rect">
+                      <a:avLst/>
+                    </a:prstGeom>
+                    <a:noFill/>
+                    <a:ln>
+                      <a:noFill/>
+                    </a:ln>
+                  </pic:spPr>
+                </pic:pic>
+              </a:graphicData>
+            </a:graphic>
+            <wp14:sizeRelH relativeFrom="margin">
+              <wp14:pctWidth>0</wp14:pctWidth>
+            </wp14:sizeRelH>
+            <wp14:sizeRelV relativeFrom="margin">
+              <wp14:pctHeight>0</wp14:pctHeight>
+            </wp14:sizeRelV>
+          </wp:anchor>
+        </w:drawing>
+      </w:r>
     </w:p>
     <w:p>
       <w:pPr>
@@ -2688,13 +3396,78 @@
       </w:r>
       <w:bookmarkEnd w:id="10"/>
     </w:p>
-    <w:p/>
+    <w:p>
+      <w:r>
+        <w:rPr>
+          <w:noProof/>
+        </w:rPr>
+        <w:drawing>
+          <wp:anchor distT="0" distB="0" distL="114300" distR="114300" simplePos="0" relativeHeight="251677696" behindDoc="0" locked="0" layoutInCell="1" allowOverlap="1" wp14:anchorId="29E6B972" wp14:editId="403B04B5">
+            <wp:simplePos x="0" y="0"/>
+            <wp:positionH relativeFrom="column">
+              <wp:posOffset>-802459</wp:posOffset>
+            </wp:positionH>
+            <wp:positionV relativeFrom="paragraph">
+              <wp:posOffset>323941</wp:posOffset>
+            </wp:positionV>
+            <wp:extent cx="10010198" cy="2079171"/>
+            <wp:effectExtent l="0" t="0" r="0" b="0"/>
+            <wp:wrapNone/>
+            <wp:docPr id="1325233541" name="Imagen 15"/>
+            <wp:cNvGraphicFramePr>
+              <a:graphicFrameLocks xmlns:a="http://schemas.openxmlformats.org/drawingml/2006/main" noChangeAspect="1"/>
+            </wp:cNvGraphicFramePr>
+            <a:graphic xmlns:a="http://schemas.openxmlformats.org/drawingml/2006/main">
+              <a:graphicData uri="http://schemas.openxmlformats.org/drawingml/2006/picture">
+                <pic:pic xmlns:pic="http://schemas.openxmlformats.org/drawingml/2006/picture">
+                  <pic:nvPicPr>
+                    <pic:cNvPr id="0" name="Picture 40"/>
+                    <pic:cNvPicPr>
+                      <a:picLocks noChangeAspect="1" noChangeArrowheads="1"/>
+                    </pic:cNvPicPr>
+                  </pic:nvPicPr>
+                  <pic:blipFill>
+                    <a:blip r:embed="rId22">
+                      <a:extLst>
+                        <a:ext uri="{28A0092B-C50C-407E-A947-70E740481C1C}">
+                          <a14:useLocalDpi xmlns:a14="http://schemas.microsoft.com/office/drawing/2010/main" val="0"/>
+                        </a:ext>
+                      </a:extLst>
+                    </a:blip>
+                    <a:srcRect/>
+                    <a:stretch>
+                      <a:fillRect/>
+                    </a:stretch>
+                  </pic:blipFill>
+                  <pic:spPr bwMode="auto">
+                    <a:xfrm>
+                      <a:off x="0" y="0"/>
+                      <a:ext cx="10079596" cy="2093585"/>
+                    </a:xfrm>
+                    <a:prstGeom prst="rect">
+                      <a:avLst/>
+                    </a:prstGeom>
+                    <a:noFill/>
+                    <a:ln>
+                      <a:noFill/>
+                    </a:ln>
+                  </pic:spPr>
+                </pic:pic>
+              </a:graphicData>
+            </a:graphic>
+            <wp14:sizeRelH relativeFrom="margin">
+              <wp14:pctWidth>0</wp14:pctWidth>
+            </wp14:sizeRelH>
+            <wp14:sizeRelV relativeFrom="margin">
+              <wp14:pctHeight>0</wp14:pctHeight>
+            </wp14:sizeRelV>
+          </wp:anchor>
+        </w:drawing>
+      </w:r>
+    </w:p>
     <w:sectPr>
-      <w:headerReference w:type="default" r:id="rId12"/>
-      <w:footerReference w:type="default" r:id="rId13"/>
-      <w:headerReference w:type="first" r:id="rId14"/>
-      <w:pgSz w:w="12240" w:h="15840"/>
-      <w:pgMar w:top="1417" w:right="1701" w:bottom="1417" w:left="1701" w:header="708" w:footer="708" w:gutter="0"/>
+      <w:pgSz w:w="15840" w:h="12240" w:orient="landscape"/>
+      <w:pgMar w:top="1701" w:right="1418" w:bottom="1701" w:left="1418" w:header="709" w:footer="709" w:gutter="0"/>
       <w:cols w:space="708"/>
       <w:titlePg/>
       <w:docGrid w:linePitch="360"/>
@@ -2841,7 +3614,7 @@
         <w:lang w:val="es-CL" w:eastAsia="es-CL"/>
       </w:rPr>
       <w:drawing>
-        <wp:anchor distT="0" distB="0" distL="114300" distR="114300" simplePos="0" relativeHeight="251659264" behindDoc="0" locked="0" layoutInCell="1" allowOverlap="1" wp14:anchorId="73414B88" wp14:editId="2AFBA375">
+        <wp:anchor distT="0" distB="0" distL="114300" distR="114300" simplePos="0" relativeHeight="251658240" behindDoc="0" locked="0" layoutInCell="1" allowOverlap="1" wp14:anchorId="73414B88" wp14:editId="2AFBA375">
           <wp:simplePos x="0" y="0"/>
           <wp:positionH relativeFrom="column">
             <wp:posOffset>131977</wp:posOffset>
@@ -2852,7 +3625,7 @@
           <wp:extent cx="924397" cy="233916"/>
           <wp:effectExtent l="0" t="0" r="635" b="0"/>
           <wp:wrapSquare wrapText="bothSides"/>
-          <wp:docPr id="5" name="Imagen 2"/>
+          <wp:docPr id="1489166757" name="Imagen 2"/>
           <wp:cNvGraphicFramePr>
             <a:graphicFrameLocks xmlns:a="http://schemas.openxmlformats.org/drawingml/2006/main" noChangeAspect="1"/>
           </wp:cNvGraphicFramePr>
@@ -2922,7 +3695,7 @@
         <wp:inline distT="0" distB="0" distL="0" distR="0" wp14:anchorId="12BA8D82" wp14:editId="19D36B14">
           <wp:extent cx="3038475" cy="669494"/>
           <wp:effectExtent l="0" t="0" r="0" b="0"/>
-          <wp:docPr id="1" name="Imagen 1"/>
+          <wp:docPr id="220855791" name="Imagen 220855791"/>
           <wp:cNvGraphicFramePr>
             <a:graphicFrameLocks xmlns:a="http://schemas.openxmlformats.org/drawingml/2006/main" noChangeAspect="1"/>
           </wp:cNvGraphicFramePr>
@@ -5033,6 +5806,7 @@
   <w:style w:type="character" w:default="1" w:styleId="Fuentedeprrafopredeter">
     <w:name w:val="Default Paragraph Font"/>
     <w:uiPriority w:val="1"/>
+    <w:semiHidden/>
     <w:unhideWhenUsed/>
   </w:style>
   <w:style w:type="table" w:default="1" w:styleId="Tablanormal">
@@ -5723,7 +6497,7 @@
     <w:charset w:val="00"/>
     <w:family w:val="swiss"/>
     <w:pitch w:val="variable"/>
-    <w:sig w:usb0="E4002EFF" w:usb1="C200247B" w:usb2="00000009" w:usb3="00000000" w:csb0="000001FF" w:csb1="00000000"/>
+    <w:sig w:usb0="E4002EFF" w:usb1="C000247B" w:usb2="00000009" w:usb3="00000000" w:csb0="000001FF" w:csb1="00000000"/>
   </w:font>
   <w:font w:name="Cambria">
     <w:panose1 w:val="02040503050406030204"/>
@@ -5815,10 +6589,12 @@
     <w:rsid w:val="005B27DB"/>
     <w:rsid w:val="006E2FCC"/>
     <w:rsid w:val="00704192"/>
+    <w:rsid w:val="00801859"/>
     <w:rsid w:val="00825B36"/>
     <w:rsid w:val="008E5D5B"/>
     <w:rsid w:val="00960213"/>
     <w:rsid w:val="00AE6FE7"/>
+    <w:rsid w:val="00B86F34"/>
     <w:rsid w:val="00BD2436"/>
     <w:rsid w:val="00C47BA2"/>
     <w:rsid w:val="00C5036F"/>
@@ -6568,7 +7344,7 @@
 
 <file path=customXml/item1.xml><?xml version="1.0" encoding="utf-8"?>
 <CoverPageProperties xmlns="http://schemas.microsoft.com/office/2006/coverPageProps">
-  <PublishDate/>
+  <PublishDate>2026-10-05T00:00:00</PublishDate>
   <Abstract>Documento de Diseño basado en UML</Abstract>
   <CompanyAddress/>
   <CompanyPhone/>
@@ -6578,12 +7354,7 @@
 </file>
 
 <file path=customXml/item2.xml><?xml version="1.0" encoding="utf-8"?>
-<?mso-contentType ?>
-<FormTemplates xmlns="http://schemas.microsoft.com/sharepoint/v3/contenttype/forms">
-  <Display>DocumentLibraryForm</Display>
-  <Edit>DocumentLibraryForm</Edit>
-  <New>DocumentLibraryForm</New>
-</FormTemplates>
+<b:Sources xmlns:b="http://schemas.openxmlformats.org/officeDocument/2006/bibliography" xmlns="http://schemas.openxmlformats.org/officeDocument/2006/bibliography" SelectedStyle="\APA.XSL" StyleName="APA"/>
 </file>
 
 <file path=customXml/item3.xml><?xml version="1.0" encoding="utf-8"?>
@@ -6804,7 +7575,12 @@
 </file>
 
 <file path=customXml/item4.xml><?xml version="1.0" encoding="utf-8"?>
-<b:Sources xmlns:b="http://schemas.openxmlformats.org/officeDocument/2006/bibliography" xmlns="http://schemas.openxmlformats.org/officeDocument/2006/bibliography" SelectedStyle="\APA.XSL" StyleName="APA"/>
+<?mso-contentType ?>
+<FormTemplates xmlns="http://schemas.microsoft.com/sharepoint/v3/contenttype/forms">
+  <Display>DocumentLibraryForm</Display>
+  <Edit>DocumentLibraryForm</Edit>
+  <New>DocumentLibraryForm</New>
+</FormTemplates>
 </file>
 
 <file path=customXml/item5.xml><?xml version="1.0" encoding="utf-8"?>
@@ -6826,9 +7602,9 @@
 </file>
 
 <file path=customXml/itemProps2.xml><?xml version="1.0" encoding="utf-8"?>
-<ds:datastoreItem xmlns:ds="http://schemas.openxmlformats.org/officeDocument/2006/customXml" ds:itemID="{EE9AAF0E-D63F-459F-A0FB-CDCE9F728F33}">
+<ds:datastoreItem xmlns:ds="http://schemas.openxmlformats.org/officeDocument/2006/customXml" ds:itemID="{BD6EC776-6679-4C69-98E3-6D068EA0A3C9}">
   <ds:schemaRefs>
-    <ds:schemaRef ds:uri="http://schemas.microsoft.com/sharepoint/v3/contenttype/forms"/>
+    <ds:schemaRef ds:uri="http://schemas.openxmlformats.org/officeDocument/2006/bibliography"/>
   </ds:schemaRefs>
 </ds:datastoreItem>
 </file>
@@ -6853,9 +7629,9 @@
 </file>
 
 <file path=customXml/itemProps4.xml><?xml version="1.0" encoding="utf-8"?>
-<ds:datastoreItem xmlns:ds="http://schemas.openxmlformats.org/officeDocument/2006/customXml" ds:itemID="{BD6EC776-6679-4C69-98E3-6D068EA0A3C9}">
+<ds:datastoreItem xmlns:ds="http://schemas.openxmlformats.org/officeDocument/2006/customXml" ds:itemID="{EE9AAF0E-D63F-459F-A0FB-CDCE9F728F33}">
   <ds:schemaRefs>
-    <ds:schemaRef ds:uri="http://schemas.openxmlformats.org/officeDocument/2006/bibliography"/>
+    <ds:schemaRef ds:uri="http://schemas.microsoft.com/sharepoint/v3/contenttype/forms"/>
   </ds:schemaRefs>
 </ds:datastoreItem>
 </file>

</xml_diff>

<commit_message>
Cuadro de modificaciones y revisiones
</commit_message>
<xml_diff>
--- a/Fase 2/Evidencias Proyecto (version Agil)/Documento 05 - Documento de Diseño.docx
+++ b/Fase 2/Evidencias Proyecto (version Agil)/Documento 05 - Documento de Diseño.docx
@@ -1566,7 +1566,8 @@
     <w:tbl>
       <w:tblPr>
         <w:tblStyle w:val="Tablaconcuadrcula1"/>
-        <w:tblW w:w="0" w:type="auto"/>
+        <w:tblW w:w="11057" w:type="dxa"/>
+        <w:tblInd w:w="-1168" w:type="dxa"/>
         <w:tblBorders>
           <w:top w:val="single" w:sz="4" w:space="0" w:color="808080"/>
           <w:left w:val="single" w:sz="4" w:space="0" w:color="808080"/>
@@ -1578,15 +1579,15 @@
         <w:tblLook w:val="01E0" w:firstRow="1" w:lastRow="1" w:firstColumn="1" w:lastColumn="1" w:noHBand="0" w:noVBand="0"/>
       </w:tblPr>
       <w:tblGrid>
-        <w:gridCol w:w="1188"/>
-        <w:gridCol w:w="1080"/>
-        <w:gridCol w:w="3060"/>
-        <w:gridCol w:w="3316"/>
+        <w:gridCol w:w="1276"/>
+        <w:gridCol w:w="3969"/>
+        <w:gridCol w:w="1985"/>
+        <w:gridCol w:w="3827"/>
       </w:tblGrid>
       <w:tr>
         <w:tc>
           <w:tcPr>
-            <w:tcW w:w="1188" w:type="dxa"/>
+            <w:tcW w:w="1276" w:type="dxa"/>
             <w:shd w:val="clear" w:color="auto" w:fill="E6E6E6"/>
           </w:tcPr>
           <w:p>
@@ -1612,7 +1613,7 @@
         </w:tc>
         <w:tc>
           <w:tcPr>
-            <w:tcW w:w="1080" w:type="dxa"/>
+            <w:tcW w:w="3969" w:type="dxa"/>
             <w:shd w:val="clear" w:color="auto" w:fill="E6E6E6"/>
           </w:tcPr>
           <w:p>
@@ -1638,7 +1639,7 @@
         </w:tc>
         <w:tc>
           <w:tcPr>
-            <w:tcW w:w="3060" w:type="dxa"/>
+            <w:tcW w:w="1985" w:type="dxa"/>
             <w:shd w:val="clear" w:color="auto" w:fill="E6E6E6"/>
           </w:tcPr>
           <w:p>
@@ -1664,7 +1665,7 @@
         </w:tc>
         <w:tc>
           <w:tcPr>
-            <w:tcW w:w="3316" w:type="dxa"/>
+            <w:tcW w:w="3827" w:type="dxa"/>
             <w:shd w:val="clear" w:color="auto" w:fill="E6E6E6"/>
           </w:tcPr>
           <w:p>
@@ -1695,7 +1696,7 @@
         </w:trPr>
         <w:tc>
           <w:tcPr>
-            <w:tcW w:w="1188" w:type="dxa"/>
+            <w:tcW w:w="1276" w:type="dxa"/>
             <w:vAlign w:val="center"/>
           </w:tcPr>
           <w:p>
@@ -1704,7 +1705,6 @@
               <w:rPr>
                 <w:rFonts w:asciiTheme="minorHAnsi" w:hAnsiTheme="minorHAnsi" w:cstheme="minorHAnsi"/>
                 <w:i/>
-                <w:color w:val="FF0000"/>
                 <w:szCs w:val="24"/>
                 <w:lang w:val="es-ES" w:eastAsia="es-ES"/>
               </w:rPr>
@@ -1713,37 +1713,90 @@
               <w:rPr>
                 <w:rFonts w:cstheme="minorHAnsi"/>
                 <w:i/>
-                <w:color w:val="FF0000"/>
                 <w:szCs w:val="24"/>
                 <w:lang w:val="es-ES" w:eastAsia="es-ES"/>
               </w:rPr>
-              <w:fldChar w:fldCharType="begin"/>
-            </w:r>
-            <w:r>
-              <w:rPr>
-                <w:rFonts w:asciiTheme="minorHAnsi" w:hAnsiTheme="minorHAnsi" w:cstheme="minorHAnsi"/>
-                <w:i/>
-                <w:color w:val="FF0000"/>
-                <w:szCs w:val="24"/>
-                <w:lang w:val="es-ES" w:eastAsia="es-ES"/>
-              </w:rPr>
-              <w:instrText>MACROBUTTON NoMacro [Fecha]</w:instrText>
-            </w:r>
-            <w:r>
-              <w:rPr>
-                <w:rFonts w:cstheme="minorHAnsi"/>
-                <w:i/>
-                <w:color w:val="FF0000"/>
-                <w:szCs w:val="24"/>
-                <w:lang w:val="es-ES" w:eastAsia="es-ES"/>
-              </w:rPr>
-              <w:fldChar w:fldCharType="end"/>
+              <w:t>03/10/2026</w:t>
             </w:r>
           </w:p>
         </w:tc>
         <w:tc>
           <w:tcPr>
-            <w:tcW w:w="1080" w:type="dxa"/>
+            <w:tcW w:w="3969" w:type="dxa"/>
+            <w:vAlign w:val="center"/>
+          </w:tcPr>
+          <w:p>
+            <w:pPr>
+              <w:pStyle w:val="Prrafodelista"/>
+              <w:numPr>
+                <w:ilvl w:val="0"/>
+                <w:numId w:val="14"/>
+              </w:numPr>
+              <w:jc w:val="both"/>
+              <w:rPr>
+                <w:rFonts w:cstheme="minorHAnsi"/>
+                <w:i/>
+                <w:szCs w:val="24"/>
+                <w:lang w:val="es-ES" w:eastAsia="es-ES"/>
+              </w:rPr>
+            </w:pPr>
+            <w:r>
+              <w:rPr>
+                <w:rFonts w:cstheme="minorHAnsi"/>
+                <w:i/>
+                <w:szCs w:val="24"/>
+                <w:lang w:val="es-ES" w:eastAsia="es-ES"/>
+              </w:rPr>
+              <w:t xml:space="preserve"> </w:t>
+            </w:r>
+          </w:p>
+          <w:p>
+            <w:pPr>
+              <w:pStyle w:val="Prrafodelista"/>
+              <w:numPr>
+                <w:ilvl w:val="0"/>
+                <w:numId w:val="17"/>
+              </w:numPr>
+              <w:jc w:val="both"/>
+              <w:rPr>
+                <w:rFonts w:asciiTheme="minorHAnsi" w:hAnsiTheme="minorHAnsi" w:cstheme="minorHAnsi"/>
+                <w:i/>
+                <w:szCs w:val="24"/>
+                <w:lang w:val="es-ES" w:eastAsia="es-ES"/>
+              </w:rPr>
+            </w:pPr>
+            <w:r>
+              <w:rPr>
+                <w:rFonts w:cstheme="minorHAnsi"/>
+                <w:i/>
+                <w:szCs w:val="24"/>
+                <w:lang w:val="es-ES" w:eastAsia="es-ES"/>
+              </w:rPr>
+              <w:t xml:space="preserve">Se revisan los usuarios </w:t>
+            </w:r>
+            <w:r>
+              <w:rPr>
+                <w:rFonts w:cstheme="minorHAnsi"/>
+                <w:i/>
+                <w:szCs w:val="24"/>
+                <w:lang w:val="es-ES" w:eastAsia="es-ES"/>
+              </w:rPr>
+              <w:t>de acuerdo con</w:t>
+            </w:r>
+            <w:r>
+              <w:rPr>
+                <w:rFonts w:cstheme="minorHAnsi"/>
+                <w:i/>
+                <w:szCs w:val="24"/>
+                <w:lang w:val="es-ES" w:eastAsia="es-ES"/>
+              </w:rPr>
+              <w:t xml:space="preserve"> los módulos.</w:t>
+            </w:r>
+          </w:p>
+        </w:tc>
+        <w:tc>
+          <w:tcPr>
+            <w:tcW w:w="1985" w:type="dxa"/>
             <w:vAlign w:val="center"/>
           </w:tcPr>
           <w:p>
@@ -1752,136 +1805,70 @@
               <w:rPr>
                 <w:rFonts w:asciiTheme="minorHAnsi" w:hAnsiTheme="minorHAnsi" w:cstheme="minorHAnsi"/>
                 <w:i/>
-                <w:color w:val="FF0000"/>
                 <w:szCs w:val="24"/>
                 <w:lang w:val="es-ES" w:eastAsia="es-ES"/>
               </w:rPr>
             </w:pPr>
-            <w:r>
-              <w:rPr>
-                <w:rFonts w:cstheme="minorHAnsi"/>
-                <w:i/>
-                <w:color w:val="FF0000"/>
-                <w:szCs w:val="24"/>
-                <w:lang w:val="es-ES" w:eastAsia="es-ES"/>
-              </w:rPr>
-              <w:fldChar w:fldCharType="begin"/>
-            </w:r>
             <w:r>
               <w:rPr>
                 <w:rFonts w:asciiTheme="minorHAnsi" w:hAnsiTheme="minorHAnsi" w:cstheme="minorHAnsi"/>
                 <w:i/>
-                <w:color w:val="FF0000"/>
                 <w:szCs w:val="24"/>
                 <w:lang w:val="es-ES" w:eastAsia="es-ES"/>
               </w:rPr>
-              <w:instrText>MACROBUTTON NoMacro [Rev]</w:instrText>
-            </w:r>
-            <w:r>
-              <w:rPr>
-                <w:rFonts w:cstheme="minorHAnsi"/>
-                <w:i/>
-                <w:color w:val="FF0000"/>
-                <w:szCs w:val="24"/>
-                <w:lang w:val="es-ES" w:eastAsia="es-ES"/>
-              </w:rPr>
-              <w:fldChar w:fldCharType="end"/>
+              <w:t>Alejandro Rodríguez.</w:t>
             </w:r>
           </w:p>
         </w:tc>
         <w:tc>
           <w:tcPr>
-            <w:tcW w:w="3060" w:type="dxa"/>
+            <w:tcW w:w="3827" w:type="dxa"/>
             <w:vAlign w:val="center"/>
           </w:tcPr>
           <w:p>
             <w:pPr>
               <w:jc w:val="both"/>
               <w:rPr>
-                <w:rFonts w:asciiTheme="minorHAnsi" w:hAnsiTheme="minorHAnsi" w:cstheme="minorHAnsi"/>
                 <w:i/>
-                <w:color w:val="FF0000"/>
                 <w:szCs w:val="24"/>
                 <w:lang w:val="es-ES" w:eastAsia="es-ES"/>
               </w:rPr>
             </w:pPr>
             <w:r>
               <w:rPr>
-                <w:rFonts w:cstheme="minorHAnsi"/>
                 <w:i/>
-                <w:color w:val="FF0000"/>
                 <w:szCs w:val="24"/>
                 <w:lang w:val="es-ES" w:eastAsia="es-ES"/>
               </w:rPr>
-              <w:fldChar w:fldCharType="begin"/>
-            </w:r>
-            <w:r>
-              <w:rPr>
-                <w:rFonts w:asciiTheme="minorHAnsi" w:hAnsiTheme="minorHAnsi" w:cstheme="minorHAnsi"/>
-                <w:i/>
-                <w:color w:val="FF0000"/>
-                <w:szCs w:val="24"/>
-                <w:lang w:val="es-ES" w:eastAsia="es-ES"/>
-              </w:rPr>
-              <w:instrText>MACROBUTTON NoMacro [Descripcion]</w:instrText>
-            </w:r>
-            <w:r>
-              <w:rPr>
-                <w:rFonts w:cstheme="minorHAnsi"/>
-                <w:i/>
-                <w:color w:val="FF0000"/>
-                <w:szCs w:val="24"/>
-                <w:lang w:val="es-ES" w:eastAsia="es-ES"/>
-              </w:rPr>
-              <w:fldChar w:fldCharType="end"/>
+              <w:t>-Se realizó cambio de rol de Supervisor/Gerencia a solo Gerencia.</w:t>
             </w:r>
           </w:p>
-        </w:tc>
-        <w:tc>
-          <w:tcPr>
-            <w:tcW w:w="3316" w:type="dxa"/>
-            <w:vAlign w:val="center"/>
-          </w:tcPr>
           <w:p>
             <w:pPr>
               <w:jc w:val="both"/>
               <w:rPr>
-                <w:rFonts w:asciiTheme="minorHAnsi" w:hAnsiTheme="minorHAnsi" w:cstheme="minorHAnsi"/>
                 <w:i/>
-                <w:color w:val="FF0000"/>
                 <w:szCs w:val="24"/>
                 <w:lang w:val="es-ES" w:eastAsia="es-ES"/>
               </w:rPr>
             </w:pPr>
-            <w:r>
-              <w:rPr>
-                <w:rFonts w:cstheme="minorHAnsi"/>
+          </w:p>
+          <w:p>
+            <w:pPr>
+              <w:jc w:val="both"/>
+              <w:rPr>
                 <w:i/>
-                <w:color w:val="FF0000"/>
                 <w:szCs w:val="24"/>
                 <w:lang w:val="es-ES" w:eastAsia="es-ES"/>
               </w:rPr>
-              <w:fldChar w:fldCharType="begin"/>
-            </w:r>
-            <w:r>
-              <w:rPr>
-                <w:rFonts w:asciiTheme="minorHAnsi" w:hAnsiTheme="minorHAnsi" w:cstheme="minorHAnsi"/>
+            </w:pPr>
+            <w:r>
+              <w:rPr>
                 <w:i/>
-                <w:color w:val="FF0000"/>
                 <w:szCs w:val="24"/>
                 <w:lang w:val="es-ES" w:eastAsia="es-ES"/>
               </w:rPr>
-              <w:instrText>MACROBUTTON NoMacro [Descripcion]</w:instrText>
-            </w:r>
-            <w:r>
-              <w:rPr>
-                <w:rFonts w:cstheme="minorHAnsi"/>
-                <w:i/>
-                <w:color w:val="FF0000"/>
-                <w:szCs w:val="24"/>
-                <w:lang w:val="es-ES" w:eastAsia="es-ES"/>
-              </w:rPr>
-              <w:fldChar w:fldCharType="end"/>
+              <w:t>-Se eliminó el usuario Bodeguero mencionado al comienzo de las reuniones.</w:t>
             </w:r>
           </w:p>
         </w:tc>
@@ -1892,7 +1879,7 @@
         </w:trPr>
         <w:tc>
           <w:tcPr>
-            <w:tcW w:w="1188" w:type="dxa"/>
+            <w:tcW w:w="1276" w:type="dxa"/>
             <w:vAlign w:val="center"/>
           </w:tcPr>
           <w:p>
@@ -1901,7 +1888,6 @@
               <w:rPr>
                 <w:rFonts w:asciiTheme="minorHAnsi" w:hAnsiTheme="minorHAnsi" w:cstheme="minorHAnsi"/>
                 <w:i/>
-                <w:color w:val="FF0000"/>
                 <w:szCs w:val="24"/>
                 <w:lang w:val="es-ES" w:eastAsia="es-ES"/>
               </w:rPr>
@@ -1910,37 +1896,101 @@
               <w:rPr>
                 <w:rFonts w:cstheme="minorHAnsi"/>
                 <w:i/>
-                <w:color w:val="FF0000"/>
                 <w:szCs w:val="24"/>
                 <w:lang w:val="es-ES" w:eastAsia="es-ES"/>
               </w:rPr>
-              <w:fldChar w:fldCharType="begin"/>
-            </w:r>
-            <w:r>
-              <w:rPr>
-                <w:rFonts w:asciiTheme="minorHAnsi" w:hAnsiTheme="minorHAnsi" w:cstheme="minorHAnsi"/>
-                <w:i/>
-                <w:color w:val="FF0000"/>
-                <w:szCs w:val="24"/>
-                <w:lang w:val="es-ES" w:eastAsia="es-ES"/>
-              </w:rPr>
-              <w:instrText>MACROBUTTON NoMacro [Fecha]</w:instrText>
+              <w:t>04</w:t>
             </w:r>
             <w:r>
               <w:rPr>
                 <w:rFonts w:cstheme="minorHAnsi"/>
                 <w:i/>
-                <w:color w:val="FF0000"/>
                 <w:szCs w:val="24"/>
                 <w:lang w:val="es-ES" w:eastAsia="es-ES"/>
               </w:rPr>
-              <w:fldChar w:fldCharType="end"/>
+              <w:t>/10/2026</w:t>
             </w:r>
           </w:p>
         </w:tc>
         <w:tc>
           <w:tcPr>
-            <w:tcW w:w="1080" w:type="dxa"/>
+            <w:tcW w:w="3969" w:type="dxa"/>
+            <w:vAlign w:val="center"/>
+          </w:tcPr>
+          <w:p>
+            <w:pPr>
+              <w:pStyle w:val="Prrafodelista"/>
+              <w:numPr>
+                <w:ilvl w:val="0"/>
+                <w:numId w:val="16"/>
+              </w:numPr>
+              <w:jc w:val="both"/>
+              <w:rPr>
+                <w:rFonts w:cstheme="minorHAnsi"/>
+                <w:i/>
+                <w:szCs w:val="24"/>
+                <w:lang w:val="es-ES" w:eastAsia="es-ES"/>
+              </w:rPr>
+            </w:pPr>
+            <w:r>
+              <w:rPr>
+                <w:rFonts w:cstheme="minorHAnsi"/>
+                <w:i/>
+                <w:szCs w:val="24"/>
+                <w:lang w:val="es-ES" w:eastAsia="es-ES"/>
+              </w:rPr>
+              <w:t>Se revisan los diagramas y documentos grupales.</w:t>
+            </w:r>
+          </w:p>
+          <w:p>
+            <w:pPr>
+              <w:pStyle w:val="Prrafodelista"/>
+              <w:numPr>
+                <w:ilvl w:val="0"/>
+                <w:numId w:val="16"/>
+              </w:numPr>
+              <w:jc w:val="both"/>
+              <w:rPr>
+                <w:rFonts w:cstheme="minorHAnsi"/>
+                <w:i/>
+                <w:szCs w:val="24"/>
+                <w:lang w:val="es-ES" w:eastAsia="es-ES"/>
+              </w:rPr>
+            </w:pPr>
+            <w:r>
+              <w:rPr>
+                <w:rFonts w:cstheme="minorHAnsi"/>
+                <w:i/>
+                <w:szCs w:val="24"/>
+                <w:lang w:val="es-ES" w:eastAsia="es-ES"/>
+              </w:rPr>
+              <w:t xml:space="preserve">Se revisa el trabajo faltante para completar el </w:t>
+            </w:r>
+            <w:proofErr w:type="spellStart"/>
+            <w:r>
+              <w:rPr>
+                <w:rFonts w:cstheme="minorHAnsi"/>
+                <w:i/>
+                <w:szCs w:val="24"/>
+                <w:lang w:val="es-ES" w:eastAsia="es-ES"/>
+              </w:rPr>
+              <w:t>backend</w:t>
+            </w:r>
+            <w:proofErr w:type="spellEnd"/>
+            <w:r>
+              <w:rPr>
+                <w:rFonts w:cstheme="minorHAnsi"/>
+                <w:i/>
+                <w:szCs w:val="24"/>
+                <w:lang w:val="es-ES" w:eastAsia="es-ES"/>
+              </w:rPr>
+              <w:t xml:space="preserve"> correspondiente a la E1.</w:t>
+            </w:r>
+          </w:p>
+        </w:tc>
+        <w:tc>
+          <w:tcPr>
+            <w:tcW w:w="1985" w:type="dxa"/>
             <w:vAlign w:val="center"/>
           </w:tcPr>
           <w:p>
@@ -1949,46 +1999,64 @@
               <w:rPr>
                 <w:rFonts w:asciiTheme="minorHAnsi" w:hAnsiTheme="minorHAnsi" w:cstheme="minorHAnsi"/>
                 <w:i/>
-                <w:color w:val="FF0000"/>
                 <w:szCs w:val="24"/>
                 <w:lang w:val="es-ES" w:eastAsia="es-ES"/>
               </w:rPr>
             </w:pPr>
-            <w:r>
-              <w:rPr>
-                <w:rFonts w:cstheme="minorHAnsi"/>
-                <w:i/>
-                <w:color w:val="FF0000"/>
-                <w:szCs w:val="24"/>
-                <w:lang w:val="es-ES" w:eastAsia="es-ES"/>
-              </w:rPr>
-              <w:fldChar w:fldCharType="begin"/>
-            </w:r>
             <w:r>
               <w:rPr>
                 <w:rFonts w:asciiTheme="minorHAnsi" w:hAnsiTheme="minorHAnsi" w:cstheme="minorHAnsi"/>
                 <w:i/>
-                <w:color w:val="FF0000"/>
                 <w:szCs w:val="24"/>
                 <w:lang w:val="es-ES" w:eastAsia="es-ES"/>
               </w:rPr>
-              <w:instrText>MACROBUTTON NoMacro [Rev]</w:instrText>
-            </w:r>
-            <w:r>
-              <w:rPr>
-                <w:rFonts w:cstheme="minorHAnsi"/>
+              <w:t>Alejandro Rodríguez</w:t>
+            </w:r>
+            <w:r>
+              <w:rPr>
+                <w:rFonts w:asciiTheme="minorHAnsi" w:hAnsiTheme="minorHAnsi" w:cstheme="minorHAnsi"/>
                 <w:i/>
-                <w:color w:val="FF0000"/>
                 <w:szCs w:val="24"/>
                 <w:lang w:val="es-ES" w:eastAsia="es-ES"/>
               </w:rPr>
-              <w:fldChar w:fldCharType="end"/>
+              <w:t>.</w:t>
+            </w:r>
+          </w:p>
+          <w:p>
+            <w:pPr>
+              <w:jc w:val="both"/>
+              <w:rPr>
+                <w:rFonts w:asciiTheme="minorHAnsi" w:hAnsiTheme="minorHAnsi" w:cstheme="minorHAnsi"/>
+                <w:i/>
+                <w:szCs w:val="24"/>
+                <w:lang w:val="es-ES" w:eastAsia="es-ES"/>
+              </w:rPr>
+            </w:pPr>
+            <w:proofErr w:type="spellStart"/>
+            <w:r>
+              <w:rPr>
+                <w:rFonts w:asciiTheme="minorHAnsi" w:hAnsiTheme="minorHAnsi" w:cstheme="minorHAnsi"/>
+                <w:i/>
+                <w:szCs w:val="24"/>
+                <w:lang w:val="es-ES" w:eastAsia="es-ES"/>
+              </w:rPr>
+              <w:t>Angelo</w:t>
+            </w:r>
+            <w:proofErr w:type="spellEnd"/>
+            <w:r>
+              <w:rPr>
+                <w:rFonts w:asciiTheme="minorHAnsi" w:hAnsiTheme="minorHAnsi" w:cstheme="minorHAnsi"/>
+                <w:i/>
+                <w:szCs w:val="24"/>
+                <w:lang w:val="es-ES" w:eastAsia="es-ES"/>
+              </w:rPr>
+              <w:t xml:space="preserve"> Galindo.</w:t>
             </w:r>
           </w:p>
         </w:tc>
         <w:tc>
           <w:tcPr>
-            <w:tcW w:w="3060" w:type="dxa"/>
+            <w:tcW w:w="3827" w:type="dxa"/>
             <w:vAlign w:val="center"/>
           </w:tcPr>
           <w:p>
@@ -1997,7 +2065,6 @@
               <w:rPr>
                 <w:rFonts w:asciiTheme="minorHAnsi" w:hAnsiTheme="minorHAnsi" w:cstheme="minorHAnsi"/>
                 <w:i/>
-                <w:color w:val="FF0000"/>
                 <w:szCs w:val="24"/>
                 <w:lang w:val="es-ES" w:eastAsia="es-ES"/>
               </w:rPr>
@@ -2006,79 +2073,209 @@
               <w:rPr>
                 <w:rFonts w:cstheme="minorHAnsi"/>
                 <w:i/>
-                <w:color w:val="FF0000"/>
                 <w:szCs w:val="24"/>
                 <w:lang w:val="es-ES" w:eastAsia="es-ES"/>
               </w:rPr>
-              <w:fldChar w:fldCharType="begin"/>
-            </w:r>
-            <w:r>
-              <w:rPr>
-                <w:rFonts w:asciiTheme="minorHAnsi" w:hAnsiTheme="minorHAnsi" w:cstheme="minorHAnsi"/>
-                <w:i/>
-                <w:color w:val="FF0000"/>
-                <w:szCs w:val="24"/>
-                <w:lang w:val="es-ES" w:eastAsia="es-ES"/>
-              </w:rPr>
-              <w:instrText>MACROBUTTON NoMacro [Descripcion]</w:instrText>
+              <w:t xml:space="preserve">- </w:t>
             </w:r>
             <w:r>
               <w:rPr>
                 <w:rFonts w:cstheme="minorHAnsi"/>
                 <w:i/>
-                <w:color w:val="FF0000"/>
                 <w:szCs w:val="24"/>
                 <w:lang w:val="es-ES" w:eastAsia="es-ES"/>
               </w:rPr>
-              <w:fldChar w:fldCharType="end"/>
+              <w:t xml:space="preserve">Se realizan las pruebas correspondientes al </w:t>
+            </w:r>
+            <w:proofErr w:type="spellStart"/>
+            <w:r>
+              <w:rPr>
+                <w:rFonts w:cstheme="minorHAnsi"/>
+                <w:i/>
+                <w:szCs w:val="24"/>
+                <w:lang w:val="es-ES" w:eastAsia="es-ES"/>
+              </w:rPr>
+              <w:t>backend</w:t>
+            </w:r>
+            <w:proofErr w:type="spellEnd"/>
+            <w:r>
+              <w:rPr>
+                <w:rFonts w:cstheme="minorHAnsi"/>
+                <w:i/>
+                <w:szCs w:val="24"/>
+                <w:lang w:val="es-ES" w:eastAsia="es-ES"/>
+              </w:rPr>
+              <w:t>.</w:t>
             </w:r>
           </w:p>
         </w:tc>
+      </w:tr>
+      <w:tr>
+        <w:trPr>
+          <w:trHeight w:val="1134"/>
+        </w:trPr>
         <w:tc>
           <w:tcPr>
-            <w:tcW w:w="3316" w:type="dxa"/>
+            <w:tcW w:w="1276" w:type="dxa"/>
             <w:vAlign w:val="center"/>
           </w:tcPr>
           <w:p>
             <w:pPr>
               <w:jc w:val="both"/>
               <w:rPr>
+                <w:rFonts w:cstheme="minorHAnsi"/>
+                <w:i/>
+                <w:szCs w:val="24"/>
+                <w:lang w:val="es-ES" w:eastAsia="es-ES"/>
+              </w:rPr>
+            </w:pPr>
+            <w:r>
+              <w:rPr>
+                <w:rFonts w:cstheme="minorHAnsi"/>
+                <w:i/>
+                <w:szCs w:val="24"/>
+                <w:lang w:val="es-ES" w:eastAsia="es-ES"/>
+              </w:rPr>
+              <w:t>05</w:t>
+            </w:r>
+            <w:r>
+              <w:rPr>
+                <w:rFonts w:cstheme="minorHAnsi"/>
+                <w:i/>
+                <w:szCs w:val="24"/>
+                <w:lang w:val="es-ES" w:eastAsia="es-ES"/>
+              </w:rPr>
+              <w:t>/10/2026</w:t>
+            </w:r>
+          </w:p>
+        </w:tc>
+        <w:tc>
+          <w:tcPr>
+            <w:tcW w:w="3969" w:type="dxa"/>
+            <w:vAlign w:val="center"/>
+          </w:tcPr>
+          <w:p>
+            <w:pPr>
+              <w:pStyle w:val="Prrafodelista"/>
+              <w:numPr>
+                <w:ilvl w:val="0"/>
+                <w:numId w:val="16"/>
+              </w:numPr>
+              <w:jc w:val="both"/>
+              <w:rPr>
+                <w:rFonts w:cstheme="minorHAnsi"/>
+                <w:i/>
+                <w:szCs w:val="24"/>
+                <w:lang w:val="es-ES" w:eastAsia="es-ES"/>
+              </w:rPr>
+            </w:pPr>
+            <w:r>
+              <w:rPr>
+                <w:rFonts w:cstheme="minorHAnsi"/>
+                <w:i/>
+                <w:szCs w:val="24"/>
+                <w:lang w:val="es-ES" w:eastAsia="es-ES"/>
+              </w:rPr>
+              <w:t>Se envían los documentos solicitados por el docente</w:t>
+            </w:r>
+          </w:p>
+        </w:tc>
+        <w:tc>
+          <w:tcPr>
+            <w:tcW w:w="1985" w:type="dxa"/>
+            <w:vAlign w:val="center"/>
+          </w:tcPr>
+          <w:p>
+            <w:pPr>
+              <w:jc w:val="both"/>
+              <w:rPr>
                 <w:rFonts w:asciiTheme="minorHAnsi" w:hAnsiTheme="minorHAnsi" w:cstheme="minorHAnsi"/>
                 <w:i/>
-                <w:color w:val="FF0000"/>
                 <w:szCs w:val="24"/>
                 <w:lang w:val="es-ES" w:eastAsia="es-ES"/>
               </w:rPr>
             </w:pPr>
             <w:r>
+              <w:rPr>
+                <w:rFonts w:asciiTheme="minorHAnsi" w:hAnsiTheme="minorHAnsi" w:cstheme="minorHAnsi"/>
+                <w:i/>
+                <w:szCs w:val="24"/>
+                <w:lang w:val="es-ES" w:eastAsia="es-ES"/>
+              </w:rPr>
+              <w:t>Alejandro Rodríguez</w:t>
+            </w:r>
+            <w:r>
+              <w:rPr>
+                <w:rFonts w:asciiTheme="minorHAnsi" w:hAnsiTheme="minorHAnsi" w:cstheme="minorHAnsi"/>
+                <w:i/>
+                <w:szCs w:val="24"/>
+                <w:lang w:val="es-ES" w:eastAsia="es-ES"/>
+              </w:rPr>
+              <w:t>.</w:t>
+            </w:r>
+          </w:p>
+          <w:p>
+            <w:pPr>
+              <w:jc w:val="both"/>
               <w:rPr>
                 <w:rFonts w:cstheme="minorHAnsi"/>
                 <w:i/>
-                <w:color w:val="FF0000"/>
                 <w:szCs w:val="24"/>
                 <w:lang w:val="es-ES" w:eastAsia="es-ES"/>
               </w:rPr>
-              <w:fldChar w:fldCharType="begin"/>
-            </w:r>
-            <w:r>
-              <w:rPr>
-                <w:rFonts w:asciiTheme="minorHAnsi" w:hAnsiTheme="minorHAnsi" w:cstheme="minorHAnsi"/>
-                <w:i/>
-                <w:color w:val="FF0000"/>
-                <w:szCs w:val="24"/>
-                <w:lang w:val="es-ES" w:eastAsia="es-ES"/>
-              </w:rPr>
-              <w:instrText>MACROBUTTON NoMacro [Descripcion]</w:instrText>
-            </w:r>
+            </w:pPr>
             <w:r>
               <w:rPr>
                 <w:rFonts w:cstheme="minorHAnsi"/>
                 <w:i/>
-                <w:color w:val="FF0000"/>
                 <w:szCs w:val="24"/>
                 <w:lang w:val="es-ES" w:eastAsia="es-ES"/>
               </w:rPr>
-              <w:fldChar w:fldCharType="end"/>
+              <w:t>Diego Carrillo.</w:t>
+            </w:r>
+          </w:p>
+        </w:tc>
+        <w:tc>
+          <w:tcPr>
+            <w:tcW w:w="3827" w:type="dxa"/>
+            <w:vAlign w:val="center"/>
+          </w:tcPr>
+          <w:p>
+            <w:pPr>
+              <w:jc w:val="both"/>
+              <w:rPr>
+                <w:rFonts w:cstheme="minorHAnsi"/>
+                <w:i/>
+                <w:szCs w:val="24"/>
+                <w:lang w:val="es-ES" w:eastAsia="es-ES"/>
+              </w:rPr>
+            </w:pPr>
+            <w:r>
+              <w:rPr>
+                <w:rFonts w:cstheme="minorHAnsi"/>
+                <w:i/>
+                <w:szCs w:val="24"/>
+                <w:lang w:val="es-ES" w:eastAsia="es-ES"/>
+              </w:rPr>
+              <w:t>-</w:t>
+            </w:r>
+            <w:r>
+              <w:rPr>
+                <w:rFonts w:cstheme="minorHAnsi"/>
+                <w:i/>
+                <w:szCs w:val="24"/>
+                <w:lang w:val="es-ES" w:eastAsia="es-ES"/>
+              </w:rPr>
+              <w:t xml:space="preserve"> </w:t>
+            </w:r>
+            <w:r>
+              <w:rPr>
+                <w:rFonts w:cstheme="minorHAnsi"/>
+                <w:i/>
+                <w:szCs w:val="24"/>
+                <w:lang w:val="es-ES" w:eastAsia="es-ES"/>
+              </w:rPr>
+              <w:t>Se realiza la grabación del video demo del login.</w:t>
             </w:r>
           </w:p>
         </w:tc>
@@ -2148,27 +2345,7 @@
           <w:szCs w:val="24"/>
           <w:lang w:val="es-ES" w:eastAsia="es-ES"/>
         </w:rPr>
-        <w:fldChar w:fldCharType="begin"/>
-      </w:r>
-      <w:r>
-        <w:rPr>
-          <w:rFonts w:eastAsia="Times New Roman" w:cstheme="minorHAnsi"/>
-          <w:color w:val="FF0000"/>
-          <w:sz w:val="20"/>
-          <w:szCs w:val="24"/>
-          <w:lang w:val="es-ES" w:eastAsia="es-ES"/>
-        </w:rPr>
-        <w:instrText>MACROBUTTON NoMacro [Fecha]</w:instrText>
-      </w:r>
-      <w:r>
-        <w:rPr>
-          <w:rFonts w:eastAsia="Times New Roman" w:cstheme="minorHAnsi"/>
-          <w:color w:val="FF0000"/>
-          <w:sz w:val="20"/>
-          <w:szCs w:val="24"/>
-          <w:lang w:val="es-ES" w:eastAsia="es-ES"/>
-        </w:rPr>
-        <w:fldChar w:fldCharType="end"/>
+        <w:t>05/10/2026</w:t>
       </w:r>
     </w:p>
     <w:p>
@@ -4022,6 +4199,230 @@
     </w:lvl>
   </w:abstractNum>
   <w:abstractNum w:abstractNumId="3" w15:restartNumberingAfterBreak="0">
+    <w:nsid w:val="1BA126EA"/>
+    <w:multiLevelType w:val="hybridMultilevel"/>
+    <w:tmpl w:val="DEF4B83C"/>
+    <w:lvl w:ilvl="0" w:tplc="7C6CB5F4">
+      <w:numFmt w:val="bullet"/>
+      <w:lvlText w:val="-"/>
+      <w:lvlJc w:val="left"/>
+      <w:pPr>
+        <w:ind w:left="720" w:hanging="360"/>
+      </w:pPr>
+      <w:rPr>
+        <w:rFonts w:ascii="Times New Roman" w:eastAsia="Times New Roman" w:hAnsi="Times New Roman" w:cs="Times New Roman" w:hint="default"/>
+      </w:rPr>
+    </w:lvl>
+    <w:lvl w:ilvl="1" w:tplc="340A0003" w:tentative="1">
+      <w:start w:val="1"/>
+      <w:numFmt w:val="bullet"/>
+      <w:lvlText w:val="o"/>
+      <w:lvlJc w:val="left"/>
+      <w:pPr>
+        <w:ind w:left="1440" w:hanging="360"/>
+      </w:pPr>
+      <w:rPr>
+        <w:rFonts w:ascii="Courier New" w:hAnsi="Courier New" w:cs="Courier New" w:hint="default"/>
+      </w:rPr>
+    </w:lvl>
+    <w:lvl w:ilvl="2" w:tplc="340A0005" w:tentative="1">
+      <w:start w:val="1"/>
+      <w:numFmt w:val="bullet"/>
+      <w:lvlText w:val=""/>
+      <w:lvlJc w:val="left"/>
+      <w:pPr>
+        <w:ind w:left="2160" w:hanging="360"/>
+      </w:pPr>
+      <w:rPr>
+        <w:rFonts w:ascii="Wingdings" w:hAnsi="Wingdings" w:hint="default"/>
+      </w:rPr>
+    </w:lvl>
+    <w:lvl w:ilvl="3" w:tplc="340A0001" w:tentative="1">
+      <w:start w:val="1"/>
+      <w:numFmt w:val="bullet"/>
+      <w:lvlText w:val=""/>
+      <w:lvlJc w:val="left"/>
+      <w:pPr>
+        <w:ind w:left="2880" w:hanging="360"/>
+      </w:pPr>
+      <w:rPr>
+        <w:rFonts w:ascii="Symbol" w:hAnsi="Symbol" w:hint="default"/>
+      </w:rPr>
+    </w:lvl>
+    <w:lvl w:ilvl="4" w:tplc="340A0003" w:tentative="1">
+      <w:start w:val="1"/>
+      <w:numFmt w:val="bullet"/>
+      <w:lvlText w:val="o"/>
+      <w:lvlJc w:val="left"/>
+      <w:pPr>
+        <w:ind w:left="3600" w:hanging="360"/>
+      </w:pPr>
+      <w:rPr>
+        <w:rFonts w:ascii="Courier New" w:hAnsi="Courier New" w:cs="Courier New" w:hint="default"/>
+      </w:rPr>
+    </w:lvl>
+    <w:lvl w:ilvl="5" w:tplc="340A0005" w:tentative="1">
+      <w:start w:val="1"/>
+      <w:numFmt w:val="bullet"/>
+      <w:lvlText w:val=""/>
+      <w:lvlJc w:val="left"/>
+      <w:pPr>
+        <w:ind w:left="4320" w:hanging="360"/>
+      </w:pPr>
+      <w:rPr>
+        <w:rFonts w:ascii="Wingdings" w:hAnsi="Wingdings" w:hint="default"/>
+      </w:rPr>
+    </w:lvl>
+    <w:lvl w:ilvl="6" w:tplc="340A0001" w:tentative="1">
+      <w:start w:val="1"/>
+      <w:numFmt w:val="bullet"/>
+      <w:lvlText w:val=""/>
+      <w:lvlJc w:val="left"/>
+      <w:pPr>
+        <w:ind w:left="5040" w:hanging="360"/>
+      </w:pPr>
+      <w:rPr>
+        <w:rFonts w:ascii="Symbol" w:hAnsi="Symbol" w:hint="default"/>
+      </w:rPr>
+    </w:lvl>
+    <w:lvl w:ilvl="7" w:tplc="340A0003" w:tentative="1">
+      <w:start w:val="1"/>
+      <w:numFmt w:val="bullet"/>
+      <w:lvlText w:val="o"/>
+      <w:lvlJc w:val="left"/>
+      <w:pPr>
+        <w:ind w:left="5760" w:hanging="360"/>
+      </w:pPr>
+      <w:rPr>
+        <w:rFonts w:ascii="Courier New" w:hAnsi="Courier New" w:cs="Courier New" w:hint="default"/>
+      </w:rPr>
+    </w:lvl>
+    <w:lvl w:ilvl="8" w:tplc="340A0005" w:tentative="1">
+      <w:start w:val="1"/>
+      <w:numFmt w:val="bullet"/>
+      <w:lvlText w:val=""/>
+      <w:lvlJc w:val="left"/>
+      <w:pPr>
+        <w:ind w:left="6480" w:hanging="360"/>
+      </w:pPr>
+      <w:rPr>
+        <w:rFonts w:ascii="Wingdings" w:hAnsi="Wingdings" w:hint="default"/>
+      </w:rPr>
+    </w:lvl>
+  </w:abstractNum>
+  <w:abstractNum w:abstractNumId="4" w15:restartNumberingAfterBreak="0">
+    <w:nsid w:val="26293A1F"/>
+    <w:multiLevelType w:val="hybridMultilevel"/>
+    <w:tmpl w:val="DED2D8BA"/>
+    <w:lvl w:ilvl="0" w:tplc="EDD49B8C">
+      <w:numFmt w:val="bullet"/>
+      <w:lvlText w:val=""/>
+      <w:lvlJc w:val="left"/>
+      <w:pPr>
+        <w:ind w:left="720" w:hanging="360"/>
+      </w:pPr>
+      <w:rPr>
+        <w:rFonts w:ascii="Calibri" w:eastAsia="Times New Roman" w:hAnsi="Calibri" w:cs="Calibri" w:hint="default"/>
+      </w:rPr>
+    </w:lvl>
+    <w:lvl w:ilvl="1" w:tplc="340A0003" w:tentative="1">
+      <w:start w:val="1"/>
+      <w:numFmt w:val="bullet"/>
+      <w:lvlText w:val="o"/>
+      <w:lvlJc w:val="left"/>
+      <w:pPr>
+        <w:ind w:left="1440" w:hanging="360"/>
+      </w:pPr>
+      <w:rPr>
+        <w:rFonts w:ascii="Courier New" w:hAnsi="Courier New" w:cs="Courier New" w:hint="default"/>
+      </w:rPr>
+    </w:lvl>
+    <w:lvl w:ilvl="2" w:tplc="340A0005" w:tentative="1">
+      <w:start w:val="1"/>
+      <w:numFmt w:val="bullet"/>
+      <w:lvlText w:val=""/>
+      <w:lvlJc w:val="left"/>
+      <w:pPr>
+        <w:ind w:left="2160" w:hanging="360"/>
+      </w:pPr>
+      <w:rPr>
+        <w:rFonts w:ascii="Wingdings" w:hAnsi="Wingdings" w:hint="default"/>
+      </w:rPr>
+    </w:lvl>
+    <w:lvl w:ilvl="3" w:tplc="340A0001" w:tentative="1">
+      <w:start w:val="1"/>
+      <w:numFmt w:val="bullet"/>
+      <w:lvlText w:val=""/>
+      <w:lvlJc w:val="left"/>
+      <w:pPr>
+        <w:ind w:left="2880" w:hanging="360"/>
+      </w:pPr>
+      <w:rPr>
+        <w:rFonts w:ascii="Symbol" w:hAnsi="Symbol" w:hint="default"/>
+      </w:rPr>
+    </w:lvl>
+    <w:lvl w:ilvl="4" w:tplc="340A0003" w:tentative="1">
+      <w:start w:val="1"/>
+      <w:numFmt w:val="bullet"/>
+      <w:lvlText w:val="o"/>
+      <w:lvlJc w:val="left"/>
+      <w:pPr>
+        <w:ind w:left="3600" w:hanging="360"/>
+      </w:pPr>
+      <w:rPr>
+        <w:rFonts w:ascii="Courier New" w:hAnsi="Courier New" w:cs="Courier New" w:hint="default"/>
+      </w:rPr>
+    </w:lvl>
+    <w:lvl w:ilvl="5" w:tplc="340A0005" w:tentative="1">
+      <w:start w:val="1"/>
+      <w:numFmt w:val="bullet"/>
+      <w:lvlText w:val=""/>
+      <w:lvlJc w:val="left"/>
+      <w:pPr>
+        <w:ind w:left="4320" w:hanging="360"/>
+      </w:pPr>
+      <w:rPr>
+        <w:rFonts w:ascii="Wingdings" w:hAnsi="Wingdings" w:hint="default"/>
+      </w:rPr>
+    </w:lvl>
+    <w:lvl w:ilvl="6" w:tplc="340A0001" w:tentative="1">
+      <w:start w:val="1"/>
+      <w:numFmt w:val="bullet"/>
+      <w:lvlText w:val=""/>
+      <w:lvlJc w:val="left"/>
+      <w:pPr>
+        <w:ind w:left="5040" w:hanging="360"/>
+      </w:pPr>
+      <w:rPr>
+        <w:rFonts w:ascii="Symbol" w:hAnsi="Symbol" w:hint="default"/>
+      </w:rPr>
+    </w:lvl>
+    <w:lvl w:ilvl="7" w:tplc="340A0003" w:tentative="1">
+      <w:start w:val="1"/>
+      <w:numFmt w:val="bullet"/>
+      <w:lvlText w:val="o"/>
+      <w:lvlJc w:val="left"/>
+      <w:pPr>
+        <w:ind w:left="5760" w:hanging="360"/>
+      </w:pPr>
+      <w:rPr>
+        <w:rFonts w:ascii="Courier New" w:hAnsi="Courier New" w:cs="Courier New" w:hint="default"/>
+      </w:rPr>
+    </w:lvl>
+    <w:lvl w:ilvl="8" w:tplc="340A0005" w:tentative="1">
+      <w:start w:val="1"/>
+      <w:numFmt w:val="bullet"/>
+      <w:lvlText w:val=""/>
+      <w:lvlJc w:val="left"/>
+      <w:pPr>
+        <w:ind w:left="6480" w:hanging="360"/>
+      </w:pPr>
+      <w:rPr>
+        <w:rFonts w:ascii="Wingdings" w:hAnsi="Wingdings" w:hint="default"/>
+      </w:rPr>
+    </w:lvl>
+  </w:abstractNum>
+  <w:abstractNum w:abstractNumId="5" w15:restartNumberingAfterBreak="0">
     <w:nsid w:val="273F5792"/>
     <w:multiLevelType w:val="hybridMultilevel"/>
     <w:tmpl w:val="A706FB68"/>
@@ -4134,7 +4535,7 @@
       </w:rPr>
     </w:lvl>
   </w:abstractNum>
-  <w:abstractNum w:abstractNumId="4" w15:restartNumberingAfterBreak="0">
+  <w:abstractNum w:abstractNumId="6" w15:restartNumberingAfterBreak="0">
     <w:nsid w:val="27AE77F4"/>
     <w:multiLevelType w:val="hybridMultilevel"/>
     <w:tmpl w:val="43404632"/>
@@ -4247,7 +4648,7 @@
       </w:rPr>
     </w:lvl>
   </w:abstractNum>
-  <w:abstractNum w:abstractNumId="5" w15:restartNumberingAfterBreak="0">
+  <w:abstractNum w:abstractNumId="7" w15:restartNumberingAfterBreak="0">
     <w:nsid w:val="2B895CBE"/>
     <w:multiLevelType w:val="multilevel"/>
     <w:tmpl w:val="5324F4FC"/>
@@ -4342,7 +4743,7 @@
       </w:pPr>
     </w:lvl>
   </w:abstractNum>
-  <w:abstractNum w:abstractNumId="6" w15:restartNumberingAfterBreak="0">
+  <w:abstractNum w:abstractNumId="8" w15:restartNumberingAfterBreak="0">
     <w:nsid w:val="45D12BE1"/>
     <w:multiLevelType w:val="hybridMultilevel"/>
     <w:tmpl w:val="44B2ED9C"/>
@@ -4455,7 +4856,7 @@
       </w:rPr>
     </w:lvl>
   </w:abstractNum>
-  <w:abstractNum w:abstractNumId="7" w15:restartNumberingAfterBreak="0">
+  <w:abstractNum w:abstractNumId="9" w15:restartNumberingAfterBreak="0">
     <w:nsid w:val="45DB1F84"/>
     <w:multiLevelType w:val="hybridMultilevel"/>
     <w:tmpl w:val="7CF2EF4E"/>
@@ -4541,7 +4942,231 @@
       </w:pPr>
     </w:lvl>
   </w:abstractNum>
-  <w:abstractNum w:abstractNumId="8" w15:restartNumberingAfterBreak="0">
+  <w:abstractNum w:abstractNumId="10" w15:restartNumberingAfterBreak="0">
+    <w:nsid w:val="491F74DB"/>
+    <w:multiLevelType w:val="hybridMultilevel"/>
+    <w:tmpl w:val="8CBA285C"/>
+    <w:lvl w:ilvl="0" w:tplc="71EA95F6">
+      <w:numFmt w:val="bullet"/>
+      <w:lvlText w:val="-"/>
+      <w:lvlJc w:val="left"/>
+      <w:pPr>
+        <w:ind w:left="720" w:hanging="360"/>
+      </w:pPr>
+      <w:rPr>
+        <w:rFonts w:ascii="Times New Roman" w:eastAsia="Times New Roman" w:hAnsi="Times New Roman" w:cs="Times New Roman" w:hint="default"/>
+      </w:rPr>
+    </w:lvl>
+    <w:lvl w:ilvl="1" w:tplc="340A0003" w:tentative="1">
+      <w:start w:val="1"/>
+      <w:numFmt w:val="bullet"/>
+      <w:lvlText w:val="o"/>
+      <w:lvlJc w:val="left"/>
+      <w:pPr>
+        <w:ind w:left="1440" w:hanging="360"/>
+      </w:pPr>
+      <w:rPr>
+        <w:rFonts w:ascii="Courier New" w:hAnsi="Courier New" w:cs="Courier New" w:hint="default"/>
+      </w:rPr>
+    </w:lvl>
+    <w:lvl w:ilvl="2" w:tplc="340A0005" w:tentative="1">
+      <w:start w:val="1"/>
+      <w:numFmt w:val="bullet"/>
+      <w:lvlText w:val=""/>
+      <w:lvlJc w:val="left"/>
+      <w:pPr>
+        <w:ind w:left="2160" w:hanging="360"/>
+      </w:pPr>
+      <w:rPr>
+        <w:rFonts w:ascii="Wingdings" w:hAnsi="Wingdings" w:hint="default"/>
+      </w:rPr>
+    </w:lvl>
+    <w:lvl w:ilvl="3" w:tplc="340A0001" w:tentative="1">
+      <w:start w:val="1"/>
+      <w:numFmt w:val="bullet"/>
+      <w:lvlText w:val=""/>
+      <w:lvlJc w:val="left"/>
+      <w:pPr>
+        <w:ind w:left="2880" w:hanging="360"/>
+      </w:pPr>
+      <w:rPr>
+        <w:rFonts w:ascii="Symbol" w:hAnsi="Symbol" w:hint="default"/>
+      </w:rPr>
+    </w:lvl>
+    <w:lvl w:ilvl="4" w:tplc="340A0003" w:tentative="1">
+      <w:start w:val="1"/>
+      <w:numFmt w:val="bullet"/>
+      <w:lvlText w:val="o"/>
+      <w:lvlJc w:val="left"/>
+      <w:pPr>
+        <w:ind w:left="3600" w:hanging="360"/>
+      </w:pPr>
+      <w:rPr>
+        <w:rFonts w:ascii="Courier New" w:hAnsi="Courier New" w:cs="Courier New" w:hint="default"/>
+      </w:rPr>
+    </w:lvl>
+    <w:lvl w:ilvl="5" w:tplc="340A0005" w:tentative="1">
+      <w:start w:val="1"/>
+      <w:numFmt w:val="bullet"/>
+      <w:lvlText w:val=""/>
+      <w:lvlJc w:val="left"/>
+      <w:pPr>
+        <w:ind w:left="4320" w:hanging="360"/>
+      </w:pPr>
+      <w:rPr>
+        <w:rFonts w:ascii="Wingdings" w:hAnsi="Wingdings" w:hint="default"/>
+      </w:rPr>
+    </w:lvl>
+    <w:lvl w:ilvl="6" w:tplc="340A0001" w:tentative="1">
+      <w:start w:val="1"/>
+      <w:numFmt w:val="bullet"/>
+      <w:lvlText w:val=""/>
+      <w:lvlJc w:val="left"/>
+      <w:pPr>
+        <w:ind w:left="5040" w:hanging="360"/>
+      </w:pPr>
+      <w:rPr>
+        <w:rFonts w:ascii="Symbol" w:hAnsi="Symbol" w:hint="default"/>
+      </w:rPr>
+    </w:lvl>
+    <w:lvl w:ilvl="7" w:tplc="340A0003" w:tentative="1">
+      <w:start w:val="1"/>
+      <w:numFmt w:val="bullet"/>
+      <w:lvlText w:val="o"/>
+      <w:lvlJc w:val="left"/>
+      <w:pPr>
+        <w:ind w:left="5760" w:hanging="360"/>
+      </w:pPr>
+      <w:rPr>
+        <w:rFonts w:ascii="Courier New" w:hAnsi="Courier New" w:cs="Courier New" w:hint="default"/>
+      </w:rPr>
+    </w:lvl>
+    <w:lvl w:ilvl="8" w:tplc="340A0005" w:tentative="1">
+      <w:start w:val="1"/>
+      <w:numFmt w:val="bullet"/>
+      <w:lvlText w:val=""/>
+      <w:lvlJc w:val="left"/>
+      <w:pPr>
+        <w:ind w:left="6480" w:hanging="360"/>
+      </w:pPr>
+      <w:rPr>
+        <w:rFonts w:ascii="Wingdings" w:hAnsi="Wingdings" w:hint="default"/>
+      </w:rPr>
+    </w:lvl>
+  </w:abstractNum>
+  <w:abstractNum w:abstractNumId="11" w15:restartNumberingAfterBreak="0">
+    <w:nsid w:val="512E0C0F"/>
+    <w:multiLevelType w:val="hybridMultilevel"/>
+    <w:tmpl w:val="B4BAC834"/>
+    <w:lvl w:ilvl="0" w:tplc="F948DFA0">
+      <w:numFmt w:val="bullet"/>
+      <w:lvlText w:val="-"/>
+      <w:lvlJc w:val="left"/>
+      <w:pPr>
+        <w:ind w:left="720" w:hanging="360"/>
+      </w:pPr>
+      <w:rPr>
+        <w:rFonts w:ascii="Calibri" w:eastAsia="Times New Roman" w:hAnsi="Calibri" w:cs="Calibri" w:hint="default"/>
+      </w:rPr>
+    </w:lvl>
+    <w:lvl w:ilvl="1" w:tplc="340A0003" w:tentative="1">
+      <w:start w:val="1"/>
+      <w:numFmt w:val="bullet"/>
+      <w:lvlText w:val="o"/>
+      <w:lvlJc w:val="left"/>
+      <w:pPr>
+        <w:ind w:left="1440" w:hanging="360"/>
+      </w:pPr>
+      <w:rPr>
+        <w:rFonts w:ascii="Courier New" w:hAnsi="Courier New" w:cs="Courier New" w:hint="default"/>
+      </w:rPr>
+    </w:lvl>
+    <w:lvl w:ilvl="2" w:tplc="340A0005" w:tentative="1">
+      <w:start w:val="1"/>
+      <w:numFmt w:val="bullet"/>
+      <w:lvlText w:val=""/>
+      <w:lvlJc w:val="left"/>
+      <w:pPr>
+        <w:ind w:left="2160" w:hanging="360"/>
+      </w:pPr>
+      <w:rPr>
+        <w:rFonts w:ascii="Wingdings" w:hAnsi="Wingdings" w:hint="default"/>
+      </w:rPr>
+    </w:lvl>
+    <w:lvl w:ilvl="3" w:tplc="340A0001" w:tentative="1">
+      <w:start w:val="1"/>
+      <w:numFmt w:val="bullet"/>
+      <w:lvlText w:val=""/>
+      <w:lvlJc w:val="left"/>
+      <w:pPr>
+        <w:ind w:left="2880" w:hanging="360"/>
+      </w:pPr>
+      <w:rPr>
+        <w:rFonts w:ascii="Symbol" w:hAnsi="Symbol" w:hint="default"/>
+      </w:rPr>
+    </w:lvl>
+    <w:lvl w:ilvl="4" w:tplc="340A0003" w:tentative="1">
+      <w:start w:val="1"/>
+      <w:numFmt w:val="bullet"/>
+      <w:lvlText w:val="o"/>
+      <w:lvlJc w:val="left"/>
+      <w:pPr>
+        <w:ind w:left="3600" w:hanging="360"/>
+      </w:pPr>
+      <w:rPr>
+        <w:rFonts w:ascii="Courier New" w:hAnsi="Courier New" w:cs="Courier New" w:hint="default"/>
+      </w:rPr>
+    </w:lvl>
+    <w:lvl w:ilvl="5" w:tplc="340A0005" w:tentative="1">
+      <w:start w:val="1"/>
+      <w:numFmt w:val="bullet"/>
+      <w:lvlText w:val=""/>
+      <w:lvlJc w:val="left"/>
+      <w:pPr>
+        <w:ind w:left="4320" w:hanging="360"/>
+      </w:pPr>
+      <w:rPr>
+        <w:rFonts w:ascii="Wingdings" w:hAnsi="Wingdings" w:hint="default"/>
+      </w:rPr>
+    </w:lvl>
+    <w:lvl w:ilvl="6" w:tplc="340A0001" w:tentative="1">
+      <w:start w:val="1"/>
+      <w:numFmt w:val="bullet"/>
+      <w:lvlText w:val=""/>
+      <w:lvlJc w:val="left"/>
+      <w:pPr>
+        <w:ind w:left="5040" w:hanging="360"/>
+      </w:pPr>
+      <w:rPr>
+        <w:rFonts w:ascii="Symbol" w:hAnsi="Symbol" w:hint="default"/>
+      </w:rPr>
+    </w:lvl>
+    <w:lvl w:ilvl="7" w:tplc="340A0003" w:tentative="1">
+      <w:start w:val="1"/>
+      <w:numFmt w:val="bullet"/>
+      <w:lvlText w:val="o"/>
+      <w:lvlJc w:val="left"/>
+      <w:pPr>
+        <w:ind w:left="5760" w:hanging="360"/>
+      </w:pPr>
+      <w:rPr>
+        <w:rFonts w:ascii="Courier New" w:hAnsi="Courier New" w:cs="Courier New" w:hint="default"/>
+      </w:rPr>
+    </w:lvl>
+    <w:lvl w:ilvl="8" w:tplc="340A0005" w:tentative="1">
+      <w:start w:val="1"/>
+      <w:numFmt w:val="bullet"/>
+      <w:lvlText w:val=""/>
+      <w:lvlJc w:val="left"/>
+      <w:pPr>
+        <w:ind w:left="6480" w:hanging="360"/>
+      </w:pPr>
+      <w:rPr>
+        <w:rFonts w:ascii="Wingdings" w:hAnsi="Wingdings" w:hint="default"/>
+      </w:rPr>
+    </w:lvl>
+  </w:abstractNum>
+  <w:abstractNum w:abstractNumId="12" w15:restartNumberingAfterBreak="0">
     <w:nsid w:val="65BA6DC5"/>
     <w:multiLevelType w:val="hybridMultilevel"/>
     <w:tmpl w:val="BE0A0C50"/>
@@ -4654,7 +5279,7 @@
       </w:rPr>
     </w:lvl>
   </w:abstractNum>
-  <w:abstractNum w:abstractNumId="9" w15:restartNumberingAfterBreak="0">
+  <w:abstractNum w:abstractNumId="13" w15:restartNumberingAfterBreak="0">
     <w:nsid w:val="69616CB8"/>
     <w:multiLevelType w:val="hybridMultilevel"/>
     <w:tmpl w:val="23EC7D4A"/>
@@ -4767,7 +5392,7 @@
       </w:rPr>
     </w:lvl>
   </w:abstractNum>
-  <w:abstractNum w:abstractNumId="10" w15:restartNumberingAfterBreak="0">
+  <w:abstractNum w:abstractNumId="14" w15:restartNumberingAfterBreak="0">
     <w:nsid w:val="6B625092"/>
     <w:multiLevelType w:val="hybridMultilevel"/>
     <w:tmpl w:val="86F61076"/>
@@ -4880,7 +5505,7 @@
       </w:rPr>
     </w:lvl>
   </w:abstractNum>
-  <w:abstractNum w:abstractNumId="11" w15:restartNumberingAfterBreak="0">
+  <w:abstractNum w:abstractNumId="15" w15:restartNumberingAfterBreak="0">
     <w:nsid w:val="76304F08"/>
     <w:multiLevelType w:val="hybridMultilevel"/>
     <w:tmpl w:val="BBB47B0A"/>
@@ -4992,7 +5617,7 @@
       </w:rPr>
     </w:lvl>
   </w:abstractNum>
-  <w:abstractNum w:abstractNumId="12" w15:restartNumberingAfterBreak="0">
+  <w:abstractNum w:abstractNumId="16" w15:restartNumberingAfterBreak="0">
     <w:nsid w:val="7A7120EA"/>
     <w:multiLevelType w:val="hybridMultilevel"/>
     <w:tmpl w:val="B714EC70"/>
@@ -5136,40 +5761,52 @@
     <w:abstractNumId w:val="0"/>
   </w:num>
   <w:num w:numId="2" w16cid:durableId="2045672853">
-    <w:abstractNumId w:val="7"/>
+    <w:abstractNumId w:val="9"/>
   </w:num>
   <w:num w:numId="3" w16cid:durableId="1798642824">
     <w:abstractNumId w:val="1"/>
   </w:num>
   <w:num w:numId="4" w16cid:durableId="983237737">
-    <w:abstractNumId w:val="10"/>
+    <w:abstractNumId w:val="14"/>
   </w:num>
   <w:num w:numId="5" w16cid:durableId="490171255">
-    <w:abstractNumId w:val="11"/>
+    <w:abstractNumId w:val="15"/>
   </w:num>
   <w:num w:numId="6" w16cid:durableId="340814691">
     <w:abstractNumId w:val="2"/>
   </w:num>
   <w:num w:numId="7" w16cid:durableId="1344936245">
+    <w:abstractNumId w:val="8"/>
+  </w:num>
+  <w:num w:numId="8" w16cid:durableId="1353531980">
+    <w:abstractNumId w:val="12"/>
+  </w:num>
+  <w:num w:numId="9" w16cid:durableId="1518156833">
     <w:abstractNumId w:val="6"/>
   </w:num>
-  <w:num w:numId="8" w16cid:durableId="1353531980">
-    <w:abstractNumId w:val="8"/>
+  <w:num w:numId="10" w16cid:durableId="1113330907">
+    <w:abstractNumId w:val="5"/>
   </w:num>
-  <w:num w:numId="9" w16cid:durableId="1518156833">
+  <w:num w:numId="11" w16cid:durableId="526329763">
+    <w:abstractNumId w:val="13"/>
+  </w:num>
+  <w:num w:numId="12" w16cid:durableId="67458668">
+    <w:abstractNumId w:val="7"/>
+  </w:num>
+  <w:num w:numId="13" w16cid:durableId="137234301">
+    <w:abstractNumId w:val="16"/>
+  </w:num>
+  <w:num w:numId="14" w16cid:durableId="808475776">
     <w:abstractNumId w:val="4"/>
   </w:num>
-  <w:num w:numId="10" w16cid:durableId="1113330907">
+  <w:num w:numId="15" w16cid:durableId="645745975">
+    <w:abstractNumId w:val="11"/>
+  </w:num>
+  <w:num w:numId="16" w16cid:durableId="1410271453">
     <w:abstractNumId w:val="3"/>
   </w:num>
-  <w:num w:numId="11" w16cid:durableId="526329763">
-    <w:abstractNumId w:val="9"/>
-  </w:num>
-  <w:num w:numId="12" w16cid:durableId="67458668">
-    <w:abstractNumId w:val="5"/>
-  </w:num>
-  <w:num w:numId="13" w16cid:durableId="137234301">
-    <w:abstractNumId w:val="12"/>
+  <w:num w:numId="17" w16cid:durableId="1894612844">
+    <w:abstractNumId w:val="10"/>
   </w:num>
 </w:numbering>
 </file>
@@ -5563,7 +6200,7 @@
   <w:style w:type="paragraph" w:default="1" w:styleId="Normal">
     <w:name w:val="Normal"/>
     <w:qFormat/>
-    <w:rsid w:val="001F6FE1"/>
+    <w:rsid w:val="007B21B5"/>
   </w:style>
   <w:style w:type="paragraph" w:styleId="Ttulo1">
     <w:name w:val="heading 1"/>
@@ -6587,6 +7224,7 @@
     <w:rsid w:val="0057410B"/>
     <w:rsid w:val="00595623"/>
     <w:rsid w:val="005B27DB"/>
+    <w:rsid w:val="006D0EDE"/>
     <w:rsid w:val="006E2FCC"/>
     <w:rsid w:val="00704192"/>
     <w:rsid w:val="00801859"/>
@@ -6596,6 +7234,7 @@
     <w:rsid w:val="00AE6FE7"/>
     <w:rsid w:val="00B86F34"/>
     <w:rsid w:val="00BD2436"/>
+    <w:rsid w:val="00C450AA"/>
     <w:rsid w:val="00C47BA2"/>
     <w:rsid w:val="00C5036F"/>
     <w:rsid w:val="00C861E5"/>
@@ -7354,10 +7993,25 @@
 </file>
 
 <file path=customXml/item2.xml><?xml version="1.0" encoding="utf-8"?>
-<b:Sources xmlns:b="http://schemas.openxmlformats.org/officeDocument/2006/bibliography" xmlns="http://schemas.openxmlformats.org/officeDocument/2006/bibliography" SelectedStyle="\APA.XSL" StyleName="APA"/>
+<p:properties xmlns:p="http://schemas.microsoft.com/office/2006/metadata/properties" xmlns:xsi="http://www.w3.org/2001/XMLSchema-instance" xmlns:pc="http://schemas.microsoft.com/office/infopath/2007/PartnerControls">
+  <documentManagement>
+    <lcf76f155ced4ddcb4097134ff3c332f xmlns="e1e7bc46-bed0-459f-9452-a76b1c5b695e">
+      <Terms xmlns="http://schemas.microsoft.com/office/infopath/2007/PartnerControls"/>
+    </lcf76f155ced4ddcb4097134ff3c332f>
+  </documentManagement>
+</p:properties>
 </file>
 
 <file path=customXml/item3.xml><?xml version="1.0" encoding="utf-8"?>
+<?mso-contentType ?>
+<FormTemplates xmlns="http://schemas.microsoft.com/sharepoint/v3/contenttype/forms">
+  <Display>DocumentLibraryForm</Display>
+  <Edit>DocumentLibraryForm</Edit>
+  <New>DocumentLibraryForm</New>
+</FormTemplates>
+</file>
+
+<file path=customXml/item4.xml><?xml version="1.0" encoding="utf-8"?>
 <ct:contentTypeSchema xmlns:ct="http://schemas.microsoft.com/office/2006/metadata/contentType" xmlns:ma="http://schemas.microsoft.com/office/2006/metadata/properties/metaAttributes" ct:_="" ma:_="" ma:contentTypeName="Documento" ma:contentTypeID="0x0101005395107FFD641345A10C8A5ACACB9D20" ma:contentTypeVersion="13" ma:contentTypeDescription="Crear nuevo documento." ma:contentTypeScope="" ma:versionID="7407f70e7181b908656026f379795b2c">
   <xsd:schema xmlns:xsd="http://www.w3.org/2001/XMLSchema" xmlns:xs="http://www.w3.org/2001/XMLSchema" xmlns:p="http://schemas.microsoft.com/office/2006/metadata/properties" xmlns:ns2="e1e7bc46-bed0-459f-9452-a76b1c5b695e" xmlns:ns3="bb8cf7e1-610f-40a0-8f00-126b9d139fde" targetNamespace="http://schemas.microsoft.com/office/2006/metadata/properties" ma:root="true" ma:fieldsID="b29ea8901729e1eaaa4e48e09148c760" ns2:_="" ns3:_="">
     <xsd:import namespace="e1e7bc46-bed0-459f-9452-a76b1c5b695e"/>
@@ -7574,23 +8228,8 @@
 </ct:contentTypeSchema>
 </file>
 
-<file path=customXml/item4.xml><?xml version="1.0" encoding="utf-8"?>
-<?mso-contentType ?>
-<FormTemplates xmlns="http://schemas.microsoft.com/sharepoint/v3/contenttype/forms">
-  <Display>DocumentLibraryForm</Display>
-  <Edit>DocumentLibraryForm</Edit>
-  <New>DocumentLibraryForm</New>
-</FormTemplates>
-</file>
-
 <file path=customXml/item5.xml><?xml version="1.0" encoding="utf-8"?>
-<p:properties xmlns:p="http://schemas.microsoft.com/office/2006/metadata/properties" xmlns:xsi="http://www.w3.org/2001/XMLSchema-instance" xmlns:pc="http://schemas.microsoft.com/office/infopath/2007/PartnerControls">
-  <documentManagement>
-    <lcf76f155ced4ddcb4097134ff3c332f xmlns="e1e7bc46-bed0-459f-9452-a76b1c5b695e">
-      <Terms xmlns="http://schemas.microsoft.com/office/infopath/2007/PartnerControls"/>
-    </lcf76f155ced4ddcb4097134ff3c332f>
-  </documentManagement>
-</p:properties>
+<b:Sources xmlns:b="http://schemas.openxmlformats.org/officeDocument/2006/bibliography" xmlns="http://schemas.openxmlformats.org/officeDocument/2006/bibliography" SelectedStyle="\APA.XSL" StyleName="APA"/>
 </file>
 
 <file path=customXml/itemProps1.xml><?xml version="1.0" encoding="utf-8"?>
@@ -7602,14 +8241,24 @@
 </file>
 
 <file path=customXml/itemProps2.xml><?xml version="1.0" encoding="utf-8"?>
-<ds:datastoreItem xmlns:ds="http://schemas.openxmlformats.org/officeDocument/2006/customXml" ds:itemID="{BD6EC776-6679-4C69-98E3-6D068EA0A3C9}">
+<ds:datastoreItem xmlns:ds="http://schemas.openxmlformats.org/officeDocument/2006/customXml" ds:itemID="{E1036DFC-1D85-404D-898C-621D06C0EB1C}">
   <ds:schemaRefs>
-    <ds:schemaRef ds:uri="http://schemas.openxmlformats.org/officeDocument/2006/bibliography"/>
+    <ds:schemaRef ds:uri="http://schemas.microsoft.com/office/2006/metadata/properties"/>
+    <ds:schemaRef ds:uri="http://schemas.microsoft.com/office/infopath/2007/PartnerControls"/>
+    <ds:schemaRef ds:uri="e1e7bc46-bed0-459f-9452-a76b1c5b695e"/>
   </ds:schemaRefs>
 </ds:datastoreItem>
 </file>
 
 <file path=customXml/itemProps3.xml><?xml version="1.0" encoding="utf-8"?>
+<ds:datastoreItem xmlns:ds="http://schemas.openxmlformats.org/officeDocument/2006/customXml" ds:itemID="{EE9AAF0E-D63F-459F-A0FB-CDCE9F728F33}">
+  <ds:schemaRefs>
+    <ds:schemaRef ds:uri="http://schemas.microsoft.com/sharepoint/v3/contenttype/forms"/>
+  </ds:schemaRefs>
+</ds:datastoreItem>
+</file>
+
+<file path=customXml/itemProps4.xml><?xml version="1.0" encoding="utf-8"?>
 <ds:datastoreItem xmlns:ds="http://schemas.openxmlformats.org/officeDocument/2006/customXml" ds:itemID="{444115BD-C1C6-48AD-B714-E1866627071D}">
   <ds:schemaRefs>
     <ds:schemaRef ds:uri="http://schemas.microsoft.com/office/2006/metadata/contentType"/>
@@ -7628,20 +8277,10 @@
 </ds:datastoreItem>
 </file>
 
-<file path=customXml/itemProps4.xml><?xml version="1.0" encoding="utf-8"?>
-<ds:datastoreItem xmlns:ds="http://schemas.openxmlformats.org/officeDocument/2006/customXml" ds:itemID="{EE9AAF0E-D63F-459F-A0FB-CDCE9F728F33}">
+<file path=customXml/itemProps5.xml><?xml version="1.0" encoding="utf-8"?>
+<ds:datastoreItem xmlns:ds="http://schemas.openxmlformats.org/officeDocument/2006/customXml" ds:itemID="{BD6EC776-6679-4C69-98E3-6D068EA0A3C9}">
   <ds:schemaRefs>
-    <ds:schemaRef ds:uri="http://schemas.microsoft.com/sharepoint/v3/contenttype/forms"/>
-  </ds:schemaRefs>
-</ds:datastoreItem>
-</file>
-
-<file path=customXml/itemProps5.xml><?xml version="1.0" encoding="utf-8"?>
-<ds:datastoreItem xmlns:ds="http://schemas.openxmlformats.org/officeDocument/2006/customXml" ds:itemID="{E1036DFC-1D85-404D-898C-621D06C0EB1C}">
-  <ds:schemaRefs>
-    <ds:schemaRef ds:uri="http://schemas.microsoft.com/office/2006/metadata/properties"/>
-    <ds:schemaRef ds:uri="http://schemas.microsoft.com/office/infopath/2007/PartnerControls"/>
-    <ds:schemaRef ds:uri="e1e7bc46-bed0-459f-9452-a76b1c5b695e"/>
+    <ds:schemaRef ds:uri="http://schemas.openxmlformats.org/officeDocument/2006/bibliography"/>
   </ds:schemaRefs>
 </ds:datastoreItem>
 </file>
</xml_diff>

<commit_message>
Actualización de los diagramas de secuencia en los Documentos de Diseño
</commit_message>
<xml_diff>
--- a/Fase 2/Evidencias Proyecto (version Agil)/Documento 05 - Documento de Diseño.docx
+++ b/Fase 2/Evidencias Proyecto (version Agil)/Documento 05 - Documento de Diseño.docx
@@ -1899,16 +1899,7 @@
                 <w:szCs w:val="24"/>
                 <w:lang w:val="es-ES" w:eastAsia="es-ES"/>
               </w:rPr>
-              <w:t>04</w:t>
-            </w:r>
-            <w:r>
-              <w:rPr>
-                <w:rFonts w:cstheme="minorHAnsi"/>
-                <w:i/>
-                <w:szCs w:val="24"/>
-                <w:lang w:val="es-ES" w:eastAsia="es-ES"/>
-              </w:rPr>
-              <w:t>/10/2026</w:t>
+              <w:t>04/10/2026</w:t>
             </w:r>
           </w:p>
         </w:tc>
@@ -2010,16 +2001,7 @@
                 <w:szCs w:val="24"/>
                 <w:lang w:val="es-ES" w:eastAsia="es-ES"/>
               </w:rPr>
-              <w:t>Alejandro Rodríguez</w:t>
-            </w:r>
-            <w:r>
-              <w:rPr>
-                <w:rFonts w:asciiTheme="minorHAnsi" w:hAnsiTheme="minorHAnsi" w:cstheme="minorHAnsi"/>
-                <w:i/>
-                <w:szCs w:val="24"/>
-                <w:lang w:val="es-ES" w:eastAsia="es-ES"/>
-              </w:rPr>
-              <w:t>.</w:t>
+              <w:t>Alejandro Rodríguez.</w:t>
             </w:r>
           </w:p>
           <w:p>
@@ -2076,16 +2058,7 @@
                 <w:szCs w:val="24"/>
                 <w:lang w:val="es-ES" w:eastAsia="es-ES"/>
               </w:rPr>
-              <w:t xml:space="preserve">- </w:t>
-            </w:r>
-            <w:r>
-              <w:rPr>
-                <w:rFonts w:cstheme="minorHAnsi"/>
-                <w:i/>
-                <w:szCs w:val="24"/>
-                <w:lang w:val="es-ES" w:eastAsia="es-ES"/>
-              </w:rPr>
-              <w:t xml:space="preserve">Se realizan las pruebas correspondientes al </w:t>
+              <w:t xml:space="preserve">- Se realizan las pruebas correspondientes al </w:t>
             </w:r>
             <w:proofErr w:type="spellStart"/>
             <w:r>
@@ -2136,16 +2109,7 @@
                 <w:szCs w:val="24"/>
                 <w:lang w:val="es-ES" w:eastAsia="es-ES"/>
               </w:rPr>
-              <w:t>05</w:t>
-            </w:r>
-            <w:r>
-              <w:rPr>
-                <w:rFonts w:cstheme="minorHAnsi"/>
-                <w:i/>
-                <w:szCs w:val="24"/>
-                <w:lang w:val="es-ES" w:eastAsia="es-ES"/>
-              </w:rPr>
-              <w:t>/10/2026</w:t>
+              <w:t>05/10/2026</w:t>
             </w:r>
           </w:p>
         </w:tc>
@@ -2202,16 +2166,7 @@
                 <w:szCs w:val="24"/>
                 <w:lang w:val="es-ES" w:eastAsia="es-ES"/>
               </w:rPr>
-              <w:t>Alejandro Rodríguez</w:t>
-            </w:r>
-            <w:r>
-              <w:rPr>
-                <w:rFonts w:asciiTheme="minorHAnsi" w:hAnsiTheme="minorHAnsi" w:cstheme="minorHAnsi"/>
-                <w:i/>
-                <w:szCs w:val="24"/>
-                <w:lang w:val="es-ES" w:eastAsia="es-ES"/>
-              </w:rPr>
-              <w:t>.</w:t>
+              <w:t>Alejandro Rodríguez.</w:t>
             </w:r>
           </w:p>
           <w:p>
@@ -2266,16 +2221,7 @@
                 <w:szCs w:val="24"/>
                 <w:lang w:val="es-ES" w:eastAsia="es-ES"/>
               </w:rPr>
-              <w:t xml:space="preserve"> </w:t>
-            </w:r>
-            <w:r>
-              <w:rPr>
-                <w:rFonts w:cstheme="minorHAnsi"/>
-                <w:i/>
-                <w:szCs w:val="24"/>
-                <w:lang w:val="es-ES" w:eastAsia="es-ES"/>
-              </w:rPr>
-              <w:t>Se realiza la grabación del video demo del login.</w:t>
+              <w:t xml:space="preserve"> Se realiza la grabación del video demo del login.</w:t>
             </w:r>
           </w:p>
         </w:tc>
@@ -3320,7 +3266,67 @@
         <w:pStyle w:val="Ttulo3"/>
       </w:pPr>
       <w:r>
+        <w:rPr>
+          <w:noProof/>
+        </w:rPr>
         <w:lastRenderedPageBreak/>
+        <w:drawing>
+          <wp:anchor distT="0" distB="0" distL="114300" distR="114300" simplePos="0" relativeHeight="251657728" behindDoc="1" locked="0" layoutInCell="1" allowOverlap="1" wp14:anchorId="0A024C78" wp14:editId="7C560788">
+            <wp:simplePos x="0" y="0"/>
+            <wp:positionH relativeFrom="column">
+              <wp:posOffset>-594995</wp:posOffset>
+            </wp:positionH>
+            <wp:positionV relativeFrom="paragraph">
+              <wp:posOffset>381635</wp:posOffset>
+            </wp:positionV>
+            <wp:extent cx="7045490" cy="8535670"/>
+            <wp:effectExtent l="0" t="0" r="0" b="0"/>
+            <wp:wrapNone/>
+            <wp:docPr id="918983248" name="Imagen 10"/>
+            <wp:cNvGraphicFramePr>
+              <a:graphicFrameLocks xmlns:a="http://schemas.openxmlformats.org/drawingml/2006/main" noChangeAspect="1"/>
+            </wp:cNvGraphicFramePr>
+            <a:graphic xmlns:a="http://schemas.openxmlformats.org/drawingml/2006/main">
+              <a:graphicData uri="http://schemas.openxmlformats.org/drawingml/2006/picture">
+                <pic:pic xmlns:pic="http://schemas.openxmlformats.org/drawingml/2006/picture">
+                  <pic:nvPicPr>
+                    <pic:cNvPr id="918983248" name="Imagen 10"/>
+                    <pic:cNvPicPr>
+                      <a:picLocks noChangeAspect="1" noChangeArrowheads="1"/>
+                    </pic:cNvPicPr>
+                  </pic:nvPicPr>
+                  <pic:blipFill>
+                    <a:blip r:embed="rId21"/>
+                    <a:stretch>
+                      <a:fillRect/>
+                    </a:stretch>
+                  </pic:blipFill>
+                  <pic:spPr bwMode="auto">
+                    <a:xfrm>
+                      <a:off x="0" y="0"/>
+                      <a:ext cx="7045490" cy="8535670"/>
+                    </a:xfrm>
+                    <a:prstGeom prst="rect">
+                      <a:avLst/>
+                    </a:prstGeom>
+                    <a:noFill/>
+                    <a:ln>
+                      <a:noFill/>
+                    </a:ln>
+                  </pic:spPr>
+                </pic:pic>
+              </a:graphicData>
+            </a:graphic>
+            <wp14:sizeRelH relativeFrom="margin">
+              <wp14:pctWidth>0</wp14:pctWidth>
+            </wp14:sizeRelH>
+            <wp14:sizeRelV relativeFrom="margin">
+              <wp14:pctHeight>0</wp14:pctHeight>
+            </wp14:sizeRelV>
+          </wp:anchor>
+        </w:drawing>
+      </w:r>
+      <w:r>
         <w:t>Diagrama de Secuencia</w:t>
       </w:r>
       <w:bookmarkEnd w:id="8"/>
@@ -3352,11 +3358,40 @@
           <w:sz w:val="22"/>
           <w:szCs w:val="22"/>
         </w:rPr>
-        <w:t>Diagrama de secuencia - Inicio de sesión</w:t>
+        <w:t xml:space="preserve"> </w:t>
       </w:r>
     </w:p>
     <w:p>
       <w:pPr>
+        <w:rPr>
+          <w:lang w:val="es-ES" w:eastAsia="es-ES"/>
+        </w:rPr>
+      </w:pPr>
+      <w:r>
+        <w:rPr>
+          <w:lang w:val="es-ES" w:eastAsia="es-ES"/>
+        </w:rPr>
+        <w:br w:type="page"/>
+      </w:r>
+    </w:p>
+    <w:p>
+      <w:pPr>
+        <w:jc w:val="center"/>
+        <w:rPr>
+          <w:lang w:val="es-ES" w:eastAsia="es-ES"/>
+        </w:rPr>
+        <w:sectPr>
+          <w:pgSz w:w="12240" w:h="15840"/>
+          <w:pgMar w:top="1418" w:right="1701" w:bottom="1418" w:left="1701" w:header="709" w:footer="709" w:gutter="0"/>
+          <w:cols w:space="708"/>
+          <w:titlePg/>
+          <w:docGrid w:linePitch="360"/>
+        </w:sectPr>
+      </w:pPr>
+    </w:p>
+    <w:p>
+      <w:pPr>
+        <w:jc w:val="center"/>
         <w:rPr>
           <w:lang w:val="es-ES" w:eastAsia="es-ES"/>
         </w:rPr>
@@ -3365,19 +3400,20 @@
         <w:rPr>
           <w:noProof/>
         </w:rPr>
+        <w:lastRenderedPageBreak/>
         <w:drawing>
-          <wp:anchor distT="0" distB="0" distL="114300" distR="114300" simplePos="0" relativeHeight="251673600" behindDoc="1" locked="0" layoutInCell="1" allowOverlap="1" wp14:anchorId="0A024C78" wp14:editId="3FFCE0B7">
+          <wp:anchor distT="0" distB="0" distL="114300" distR="114300" simplePos="0" relativeHeight="251658752" behindDoc="1" locked="0" layoutInCell="1" allowOverlap="1" wp14:anchorId="0F052675" wp14:editId="0508992A">
             <wp:simplePos x="0" y="0"/>
             <wp:positionH relativeFrom="column">
-              <wp:posOffset>-1364048</wp:posOffset>
+              <wp:posOffset>-246868</wp:posOffset>
             </wp:positionH>
             <wp:positionV relativeFrom="paragraph">
-              <wp:posOffset>378097</wp:posOffset>
+              <wp:posOffset>-88265</wp:posOffset>
             </wp:positionV>
-            <wp:extent cx="8209529" cy="6324600"/>
+            <wp:extent cx="6271846" cy="9052724"/>
             <wp:effectExtent l="0" t="0" r="0" b="0"/>
             <wp:wrapNone/>
-            <wp:docPr id="918983248" name="Imagen 10"/>
+            <wp:docPr id="1396443609" name="Imagen 11"/>
             <wp:cNvGraphicFramePr>
               <a:graphicFrameLocks xmlns:a="http://schemas.openxmlformats.org/drawingml/2006/main" noChangeAspect="1"/>
             </wp:cNvGraphicFramePr>
@@ -3385,20 +3421,13 @@
               <a:graphicData uri="http://schemas.openxmlformats.org/drawingml/2006/picture">
                 <pic:pic xmlns:pic="http://schemas.openxmlformats.org/drawingml/2006/picture">
                   <pic:nvPicPr>
-                    <pic:cNvPr id="0" name="Picture 21"/>
+                    <pic:cNvPr id="1396443609" name="Imagen 11"/>
                     <pic:cNvPicPr>
                       <a:picLocks noChangeAspect="1" noChangeArrowheads="1"/>
                     </pic:cNvPicPr>
                   </pic:nvPicPr>
                   <pic:blipFill>
-                    <a:blip r:embed="rId21">
-                      <a:extLst>
-                        <a:ext uri="{28A0092B-C50C-407E-A947-70E740481C1C}">
-                          <a14:useLocalDpi xmlns:a14="http://schemas.microsoft.com/office/drawing/2010/main" val="0"/>
-                        </a:ext>
-                      </a:extLst>
-                    </a:blip>
-                    <a:srcRect/>
+                    <a:blip r:embed="rId22"/>
                     <a:stretch>
                       <a:fillRect/>
                     </a:stretch>
@@ -3406,7 +3435,7 @@
                   <pic:spPr bwMode="auto">
                     <a:xfrm>
                       <a:off x="0" y="0"/>
-                      <a:ext cx="8242682" cy="6350141"/>
+                      <a:ext cx="6271846" cy="9052724"/>
                     </a:xfrm>
                     <a:prstGeom prst="rect">
                       <a:avLst/>
@@ -3432,13 +3461,13 @@
         <w:rPr>
           <w:lang w:val="es-ES" w:eastAsia="es-ES"/>
         </w:rPr>
-        <w:br w:type="page"/>
+        <w:t xml:space="preserve"> </w:t>
       </w:r>
     </w:p>
     <w:p>
       <w:pPr>
-        <w:jc w:val="center"/>
         <w:rPr>
+          <w:u w:val="single"/>
           <w:lang w:val="es-ES" w:eastAsia="es-ES"/>
         </w:rPr>
         <w:sectPr>
@@ -3449,102 +3478,6 @@
           <w:docGrid w:linePitch="360"/>
         </w:sectPr>
       </w:pPr>
-    </w:p>
-    <w:p>
-      <w:pPr>
-        <w:jc w:val="center"/>
-        <w:rPr>
-          <w:lang w:val="es-ES" w:eastAsia="es-ES"/>
-        </w:rPr>
-      </w:pPr>
-      <w:r>
-        <w:rPr>
-          <w:lang w:val="es-ES" w:eastAsia="es-ES"/>
-        </w:rPr>
-        <w:lastRenderedPageBreak/>
-        <w:t>Diagrama de secuencia - Registro de tarja de recepción</w:t>
-      </w:r>
-    </w:p>
-    <w:p>
-      <w:pPr>
-        <w:rPr>
-          <w:lang w:val="es-ES" w:eastAsia="es-ES"/>
-        </w:rPr>
-        <w:sectPr>
-          <w:pgSz w:w="12240" w:h="15840"/>
-          <w:pgMar w:top="1418" w:right="1701" w:bottom="1418" w:left="1701" w:header="709" w:footer="709" w:gutter="0"/>
-          <w:cols w:space="708"/>
-          <w:titlePg/>
-          <w:docGrid w:linePitch="360"/>
-        </w:sectPr>
-      </w:pPr>
-      <w:r>
-        <w:rPr>
-          <w:noProof/>
-        </w:rPr>
-        <w:drawing>
-          <wp:anchor distT="0" distB="0" distL="114300" distR="114300" simplePos="0" relativeHeight="251675648" behindDoc="1" locked="0" layoutInCell="1" allowOverlap="1" wp14:anchorId="0F052675" wp14:editId="079D49C1">
-            <wp:simplePos x="0" y="0"/>
-            <wp:positionH relativeFrom="column">
-              <wp:posOffset>-1417593</wp:posOffset>
-            </wp:positionH>
-            <wp:positionV relativeFrom="paragraph">
-              <wp:posOffset>320766</wp:posOffset>
-            </wp:positionV>
-            <wp:extent cx="8336419" cy="6422571"/>
-            <wp:effectExtent l="0" t="0" r="0" b="0"/>
-            <wp:wrapNone/>
-            <wp:docPr id="1396443609" name="Imagen 11"/>
-            <wp:cNvGraphicFramePr>
-              <a:graphicFrameLocks xmlns:a="http://schemas.openxmlformats.org/drawingml/2006/main" noChangeAspect="1"/>
-            </wp:cNvGraphicFramePr>
-            <a:graphic xmlns:a="http://schemas.openxmlformats.org/drawingml/2006/main">
-              <a:graphicData uri="http://schemas.openxmlformats.org/drawingml/2006/picture">
-                <pic:pic xmlns:pic="http://schemas.openxmlformats.org/drawingml/2006/picture">
-                  <pic:nvPicPr>
-                    <pic:cNvPr id="0" name="Picture 23"/>
-                    <pic:cNvPicPr>
-                      <a:picLocks noChangeAspect="1" noChangeArrowheads="1"/>
-                    </pic:cNvPicPr>
-                  </pic:nvPicPr>
-                  <pic:blipFill>
-                    <a:blip r:embed="rId21">
-                      <a:extLst>
-                        <a:ext uri="{28A0092B-C50C-407E-A947-70E740481C1C}">
-                          <a14:useLocalDpi xmlns:a14="http://schemas.microsoft.com/office/drawing/2010/main" val="0"/>
-                        </a:ext>
-                      </a:extLst>
-                    </a:blip>
-                    <a:srcRect/>
-                    <a:stretch>
-                      <a:fillRect/>
-                    </a:stretch>
-                  </pic:blipFill>
-                  <pic:spPr bwMode="auto">
-                    <a:xfrm>
-                      <a:off x="0" y="0"/>
-                      <a:ext cx="8373143" cy="6450864"/>
-                    </a:xfrm>
-                    <a:prstGeom prst="rect">
-                      <a:avLst/>
-                    </a:prstGeom>
-                    <a:noFill/>
-                    <a:ln>
-                      <a:noFill/>
-                    </a:ln>
-                  </pic:spPr>
-                </pic:pic>
-              </a:graphicData>
-            </a:graphic>
-            <wp14:sizeRelH relativeFrom="margin">
-              <wp14:pctWidth>0</wp14:pctWidth>
-            </wp14:sizeRelH>
-            <wp14:sizeRelV relativeFrom="margin">
-              <wp14:pctHeight>0</wp14:pctHeight>
-            </wp14:sizeRelV>
-          </wp:anchor>
-        </w:drawing>
-      </w:r>
     </w:p>
     <w:p>
       <w:pPr>
@@ -3604,7 +3537,7 @@
                     </pic:cNvPicPr>
                   </pic:nvPicPr>
                   <pic:blipFill>
-                    <a:blip r:embed="rId22">
+                    <a:blip r:embed="rId23">
                       <a:extLst>
                         <a:ext uri="{28A0092B-C50C-407E-A947-70E740481C1C}">
                           <a14:useLocalDpi xmlns:a14="http://schemas.microsoft.com/office/drawing/2010/main" val="0"/>
@@ -7220,6 +7153,7 @@
     <w:rsid w:val="001B14B7"/>
     <w:rsid w:val="002835FC"/>
     <w:rsid w:val="002C06A7"/>
+    <w:rsid w:val="00377B47"/>
     <w:rsid w:val="004F7F49"/>
     <w:rsid w:val="0057410B"/>
     <w:rsid w:val="00595623"/>
@@ -7237,6 +7171,7 @@
     <w:rsid w:val="00C450AA"/>
     <w:rsid w:val="00C47BA2"/>
     <w:rsid w:val="00C5036F"/>
+    <w:rsid w:val="00C60D38"/>
     <w:rsid w:val="00C861E5"/>
     <w:rsid w:val="00CF44FB"/>
     <w:rsid w:val="00D10844"/>
@@ -7993,25 +7928,10 @@
 </file>
 
 <file path=customXml/item2.xml><?xml version="1.0" encoding="utf-8"?>
-<p:properties xmlns:p="http://schemas.microsoft.com/office/2006/metadata/properties" xmlns:xsi="http://www.w3.org/2001/XMLSchema-instance" xmlns:pc="http://schemas.microsoft.com/office/infopath/2007/PartnerControls">
-  <documentManagement>
-    <lcf76f155ced4ddcb4097134ff3c332f xmlns="e1e7bc46-bed0-459f-9452-a76b1c5b695e">
-      <Terms xmlns="http://schemas.microsoft.com/office/infopath/2007/PartnerControls"/>
-    </lcf76f155ced4ddcb4097134ff3c332f>
-  </documentManagement>
-</p:properties>
+<b:Sources xmlns:b="http://schemas.openxmlformats.org/officeDocument/2006/bibliography" xmlns="http://schemas.openxmlformats.org/officeDocument/2006/bibliography" SelectedStyle="\APA.XSL" StyleName="APA"/>
 </file>
 
 <file path=customXml/item3.xml><?xml version="1.0" encoding="utf-8"?>
-<?mso-contentType ?>
-<FormTemplates xmlns="http://schemas.microsoft.com/sharepoint/v3/contenttype/forms">
-  <Display>DocumentLibraryForm</Display>
-  <Edit>DocumentLibraryForm</Edit>
-  <New>DocumentLibraryForm</New>
-</FormTemplates>
-</file>
-
-<file path=customXml/item4.xml><?xml version="1.0" encoding="utf-8"?>
 <ct:contentTypeSchema xmlns:ct="http://schemas.microsoft.com/office/2006/metadata/contentType" xmlns:ma="http://schemas.microsoft.com/office/2006/metadata/properties/metaAttributes" ct:_="" ma:_="" ma:contentTypeName="Documento" ma:contentTypeID="0x0101005395107FFD641345A10C8A5ACACB9D20" ma:contentTypeVersion="13" ma:contentTypeDescription="Crear nuevo documento." ma:contentTypeScope="" ma:versionID="7407f70e7181b908656026f379795b2c">
   <xsd:schema xmlns:xsd="http://www.w3.org/2001/XMLSchema" xmlns:xs="http://www.w3.org/2001/XMLSchema" xmlns:p="http://schemas.microsoft.com/office/2006/metadata/properties" xmlns:ns2="e1e7bc46-bed0-459f-9452-a76b1c5b695e" xmlns:ns3="bb8cf7e1-610f-40a0-8f00-126b9d139fde" targetNamespace="http://schemas.microsoft.com/office/2006/metadata/properties" ma:root="true" ma:fieldsID="b29ea8901729e1eaaa4e48e09148c760" ns2:_="" ns3:_="">
     <xsd:import namespace="e1e7bc46-bed0-459f-9452-a76b1c5b695e"/>
@@ -8228,8 +8148,23 @@
 </ct:contentTypeSchema>
 </file>
 
+<file path=customXml/item4.xml><?xml version="1.0" encoding="utf-8"?>
+<?mso-contentType ?>
+<FormTemplates xmlns="http://schemas.microsoft.com/sharepoint/v3/contenttype/forms">
+  <Display>DocumentLibraryForm</Display>
+  <Edit>DocumentLibraryForm</Edit>
+  <New>DocumentLibraryForm</New>
+</FormTemplates>
+</file>
+
 <file path=customXml/item5.xml><?xml version="1.0" encoding="utf-8"?>
-<b:Sources xmlns:b="http://schemas.openxmlformats.org/officeDocument/2006/bibliography" xmlns="http://schemas.openxmlformats.org/officeDocument/2006/bibliography" SelectedStyle="\APA.XSL" StyleName="APA"/>
+<p:properties xmlns:p="http://schemas.microsoft.com/office/2006/metadata/properties" xmlns:xsi="http://www.w3.org/2001/XMLSchema-instance" xmlns:pc="http://schemas.microsoft.com/office/infopath/2007/PartnerControls">
+  <documentManagement>
+    <lcf76f155ced4ddcb4097134ff3c332f xmlns="e1e7bc46-bed0-459f-9452-a76b1c5b695e">
+      <Terms xmlns="http://schemas.microsoft.com/office/infopath/2007/PartnerControls"/>
+    </lcf76f155ced4ddcb4097134ff3c332f>
+  </documentManagement>
+</p:properties>
 </file>
 
 <file path=customXml/itemProps1.xml><?xml version="1.0" encoding="utf-8"?>
@@ -8241,24 +8176,14 @@
 </file>
 
 <file path=customXml/itemProps2.xml><?xml version="1.0" encoding="utf-8"?>
-<ds:datastoreItem xmlns:ds="http://schemas.openxmlformats.org/officeDocument/2006/customXml" ds:itemID="{E1036DFC-1D85-404D-898C-621D06C0EB1C}">
+<ds:datastoreItem xmlns:ds="http://schemas.openxmlformats.org/officeDocument/2006/customXml" ds:itemID="{BD6EC776-6679-4C69-98E3-6D068EA0A3C9}">
   <ds:schemaRefs>
-    <ds:schemaRef ds:uri="http://schemas.microsoft.com/office/2006/metadata/properties"/>
-    <ds:schemaRef ds:uri="http://schemas.microsoft.com/office/infopath/2007/PartnerControls"/>
-    <ds:schemaRef ds:uri="e1e7bc46-bed0-459f-9452-a76b1c5b695e"/>
+    <ds:schemaRef ds:uri="http://schemas.openxmlformats.org/officeDocument/2006/bibliography"/>
   </ds:schemaRefs>
 </ds:datastoreItem>
 </file>
 
 <file path=customXml/itemProps3.xml><?xml version="1.0" encoding="utf-8"?>
-<ds:datastoreItem xmlns:ds="http://schemas.openxmlformats.org/officeDocument/2006/customXml" ds:itemID="{EE9AAF0E-D63F-459F-A0FB-CDCE9F728F33}">
-  <ds:schemaRefs>
-    <ds:schemaRef ds:uri="http://schemas.microsoft.com/sharepoint/v3/contenttype/forms"/>
-  </ds:schemaRefs>
-</ds:datastoreItem>
-</file>
-
-<file path=customXml/itemProps4.xml><?xml version="1.0" encoding="utf-8"?>
 <ds:datastoreItem xmlns:ds="http://schemas.openxmlformats.org/officeDocument/2006/customXml" ds:itemID="{444115BD-C1C6-48AD-B714-E1866627071D}">
   <ds:schemaRefs>
     <ds:schemaRef ds:uri="http://schemas.microsoft.com/office/2006/metadata/contentType"/>
@@ -8277,10 +8202,20 @@
 </ds:datastoreItem>
 </file>
 
+<file path=customXml/itemProps4.xml><?xml version="1.0" encoding="utf-8"?>
+<ds:datastoreItem xmlns:ds="http://schemas.openxmlformats.org/officeDocument/2006/customXml" ds:itemID="{EE9AAF0E-D63F-459F-A0FB-CDCE9F728F33}">
+  <ds:schemaRefs>
+    <ds:schemaRef ds:uri="http://schemas.microsoft.com/sharepoint/v3/contenttype/forms"/>
+  </ds:schemaRefs>
+</ds:datastoreItem>
+</file>
+
 <file path=customXml/itemProps5.xml><?xml version="1.0" encoding="utf-8"?>
-<ds:datastoreItem xmlns:ds="http://schemas.openxmlformats.org/officeDocument/2006/customXml" ds:itemID="{BD6EC776-6679-4C69-98E3-6D068EA0A3C9}">
+<ds:datastoreItem xmlns:ds="http://schemas.openxmlformats.org/officeDocument/2006/customXml" ds:itemID="{E1036DFC-1D85-404D-898C-621D06C0EB1C}">
   <ds:schemaRefs>
-    <ds:schemaRef ds:uri="http://schemas.openxmlformats.org/officeDocument/2006/bibliography"/>
+    <ds:schemaRef ds:uri="http://schemas.microsoft.com/office/2006/metadata/properties"/>
+    <ds:schemaRef ds:uri="http://schemas.microsoft.com/office/infopath/2007/PartnerControls"/>
+    <ds:schemaRef ds:uri="e1e7bc46-bed0-459f-9452-a76b1c5b695e"/>
   </ds:schemaRefs>
 </ds:datastoreItem>
 </file>
</xml_diff>

<commit_message>
Actualizacion casos de uso
</commit_message>
<xml_diff>
--- a/Fase 2/Evidencias Proyecto (version Agil)/Documento 05 - Documento de Diseño.docx
+++ b/Fase 2/Evidencias Proyecto (version Agil)/Documento 05 - Documento de Diseño.docx
@@ -2014,7 +2014,6 @@
                 <w:lang w:val="es-ES" w:eastAsia="es-ES"/>
               </w:rPr>
             </w:pPr>
-            <w:proofErr w:type="spellStart"/>
             <w:r>
               <w:rPr>
                 <w:rFonts w:asciiTheme="minorHAnsi" w:hAnsiTheme="minorHAnsi" w:cstheme="minorHAnsi"/>
@@ -2022,17 +2021,7 @@
                 <w:szCs w:val="24"/>
                 <w:lang w:val="es-ES" w:eastAsia="es-ES"/>
               </w:rPr>
-              <w:t>Angelo</w:t>
-            </w:r>
-            <w:proofErr w:type="spellEnd"/>
-            <w:r>
-              <w:rPr>
-                <w:rFonts w:asciiTheme="minorHAnsi" w:hAnsiTheme="minorHAnsi" w:cstheme="minorHAnsi"/>
-                <w:i/>
-                <w:szCs w:val="24"/>
-                <w:lang w:val="es-ES" w:eastAsia="es-ES"/>
-              </w:rPr>
-              <w:t xml:space="preserve"> Galindo.</w:t>
+              <w:t>Angelo Galindo.</w:t>
             </w:r>
           </w:p>
         </w:tc>
@@ -2700,21 +2689,19 @@
       </w:pPr>
       <w:r>
         <w:rPr>
+          <w:rFonts w:asciiTheme="minorHAnsi" w:eastAsiaTheme="minorHAnsi" w:hAnsiTheme="minorHAnsi" w:cstheme="minorBidi"/>
+          <w:b w:val="0"/>
+          <w:bCs w:val="0"/>
           <w:noProof/>
+          <w:color w:val="auto"/>
+          <w:sz w:val="22"/>
+          <w:szCs w:val="22"/>
         </w:rPr>
         <w:drawing>
-          <wp:anchor distT="0" distB="0" distL="114300" distR="114300" simplePos="0" relativeHeight="251641856" behindDoc="1" locked="0" layoutInCell="1" allowOverlap="1" wp14:anchorId="648EB09B" wp14:editId="162B798C">
-            <wp:simplePos x="0" y="0"/>
-            <wp:positionH relativeFrom="column">
-              <wp:posOffset>-385869</wp:posOffset>
-            </wp:positionH>
-            <wp:positionV relativeFrom="paragraph">
-              <wp:posOffset>254847</wp:posOffset>
-            </wp:positionV>
-            <wp:extent cx="6316133" cy="5310611"/>
+          <wp:inline distT="0" distB="0" distL="0" distR="0" wp14:anchorId="515D6152" wp14:editId="380E1762">
+            <wp:extent cx="5612130" cy="4895215"/>
             <wp:effectExtent l="0" t="0" r="0" b="0"/>
-            <wp:wrapNone/>
-            <wp:docPr id="1786144815" name="Imagen 1"/>
+            <wp:docPr id="1229241245" name="Imagen 1"/>
             <wp:cNvGraphicFramePr>
               <a:graphicFrameLocks xmlns:a="http://schemas.openxmlformats.org/drawingml/2006/main" noChangeAspect="1"/>
             </wp:cNvGraphicFramePr>
@@ -2722,47 +2709,28 @@
               <a:graphicData uri="http://schemas.openxmlformats.org/drawingml/2006/picture">
                 <pic:pic xmlns:pic="http://schemas.openxmlformats.org/drawingml/2006/picture">
                   <pic:nvPicPr>
-                    <pic:cNvPr id="0" name="Picture 1"/>
-                    <pic:cNvPicPr>
-                      <a:picLocks noChangeAspect="1" noChangeArrowheads="1"/>
-                    </pic:cNvPicPr>
+                    <pic:cNvPr id="1229241245" name="Imagen 1229241245"/>
+                    <pic:cNvPicPr/>
                   </pic:nvPicPr>
                   <pic:blipFill>
-                    <a:blip r:embed="rId12">
-                      <a:extLst>
-                        <a:ext uri="{28A0092B-C50C-407E-A947-70E740481C1C}">
-                          <a14:useLocalDpi xmlns:a14="http://schemas.microsoft.com/office/drawing/2010/main" val="0"/>
-                        </a:ext>
-                      </a:extLst>
-                    </a:blip>
-                    <a:srcRect/>
+                    <a:blip r:embed="rId12"/>
                     <a:stretch>
                       <a:fillRect/>
                     </a:stretch>
                   </pic:blipFill>
-                  <pic:spPr bwMode="auto">
+                  <pic:spPr>
                     <a:xfrm>
                       <a:off x="0" y="0"/>
-                      <a:ext cx="6326724" cy="5319516"/>
+                      <a:ext cx="5612130" cy="4895215"/>
                     </a:xfrm>
                     <a:prstGeom prst="rect">
                       <a:avLst/>
                     </a:prstGeom>
-                    <a:noFill/>
-                    <a:ln>
-                      <a:noFill/>
-                    </a:ln>
                   </pic:spPr>
                 </pic:pic>
               </a:graphicData>
             </a:graphic>
-            <wp14:sizeRelH relativeFrom="margin">
-              <wp14:pctWidth>0</wp14:pctWidth>
-            </wp14:sizeRelH>
-            <wp14:sizeRelV relativeFrom="margin">
-              <wp14:pctHeight>0</wp14:pctHeight>
-            </wp14:sizeRelV>
-          </wp:anchor>
+          </wp:inline>
         </w:drawing>
       </w:r>
     </w:p>
@@ -2809,10 +2777,10 @@
           <w:noProof/>
         </w:rPr>
         <w:drawing>
-          <wp:inline distT="0" distB="0" distL="0" distR="0" wp14:anchorId="35842A92" wp14:editId="783FFE9C">
-            <wp:extent cx="5612130" cy="5542280"/>
+          <wp:inline distT="0" distB="0" distL="0" distR="0" wp14:anchorId="4607DA32" wp14:editId="11E75B64">
+            <wp:extent cx="5612130" cy="4112895"/>
             <wp:effectExtent l="0" t="0" r="0" b="0"/>
-            <wp:docPr id="241663544" name="Imagen 3"/>
+            <wp:docPr id="910382827" name="Imagen 2"/>
             <wp:cNvGraphicFramePr>
               <a:graphicFrameLocks xmlns:a="http://schemas.openxmlformats.org/drawingml/2006/main" noChangeAspect="1"/>
             </wp:cNvGraphicFramePr>
@@ -2820,36 +2788,23 @@
               <a:graphicData uri="http://schemas.openxmlformats.org/drawingml/2006/picture">
                 <pic:pic xmlns:pic="http://schemas.openxmlformats.org/drawingml/2006/picture">
                   <pic:nvPicPr>
-                    <pic:cNvPr id="0" name="Picture 4"/>
-                    <pic:cNvPicPr>
-                      <a:picLocks noChangeAspect="1" noChangeArrowheads="1"/>
-                    </pic:cNvPicPr>
+                    <pic:cNvPr id="910382827" name="Imagen 910382827"/>
+                    <pic:cNvPicPr/>
                   </pic:nvPicPr>
                   <pic:blipFill>
-                    <a:blip r:embed="rId13">
-                      <a:extLst>
-                        <a:ext uri="{28A0092B-C50C-407E-A947-70E740481C1C}">
-                          <a14:useLocalDpi xmlns:a14="http://schemas.microsoft.com/office/drawing/2010/main" val="0"/>
-                        </a:ext>
-                      </a:extLst>
-                    </a:blip>
-                    <a:srcRect/>
+                    <a:blip r:embed="rId13"/>
                     <a:stretch>
                       <a:fillRect/>
                     </a:stretch>
                   </pic:blipFill>
-                  <pic:spPr bwMode="auto">
+                  <pic:spPr>
                     <a:xfrm>
                       <a:off x="0" y="0"/>
-                      <a:ext cx="5612130" cy="5542280"/>
+                      <a:ext cx="5612130" cy="4112895"/>
                     </a:xfrm>
                     <a:prstGeom prst="rect">
                       <a:avLst/>
                     </a:prstGeom>
-                    <a:noFill/>
-                    <a:ln>
-                      <a:noFill/>
-                    </a:ln>
                   </pic:spPr>
                 </pic:pic>
               </a:graphicData>
@@ -2878,10 +2833,10 @@
           <w:noProof/>
         </w:rPr>
         <w:drawing>
-          <wp:inline distT="0" distB="0" distL="0" distR="0" wp14:anchorId="372EEE94" wp14:editId="0C2EF12F">
-            <wp:extent cx="6231467" cy="6231467"/>
+          <wp:inline distT="0" distB="0" distL="0" distR="0" wp14:anchorId="785F3A73" wp14:editId="13CF6DD0">
+            <wp:extent cx="4668644" cy="7835900"/>
             <wp:effectExtent l="0" t="0" r="0" b="0"/>
-            <wp:docPr id="1128499574" name="Imagen 4"/>
+            <wp:docPr id="59645325" name="Imagen 3"/>
             <wp:cNvGraphicFramePr>
               <a:graphicFrameLocks xmlns:a="http://schemas.openxmlformats.org/drawingml/2006/main" noChangeAspect="1"/>
             </wp:cNvGraphicFramePr>
@@ -2889,36 +2844,23 @@
               <a:graphicData uri="http://schemas.openxmlformats.org/drawingml/2006/picture">
                 <pic:pic xmlns:pic="http://schemas.openxmlformats.org/drawingml/2006/picture">
                   <pic:nvPicPr>
-                    <pic:cNvPr id="0" name="Picture 6"/>
-                    <pic:cNvPicPr>
-                      <a:picLocks noChangeAspect="1" noChangeArrowheads="1"/>
-                    </pic:cNvPicPr>
+                    <pic:cNvPr id="59645325" name="Imagen 59645325"/>
+                    <pic:cNvPicPr/>
                   </pic:nvPicPr>
                   <pic:blipFill>
-                    <a:blip r:embed="rId14">
-                      <a:extLst>
-                        <a:ext uri="{28A0092B-C50C-407E-A947-70E740481C1C}">
-                          <a14:useLocalDpi xmlns:a14="http://schemas.microsoft.com/office/drawing/2010/main" val="0"/>
-                        </a:ext>
-                      </a:extLst>
-                    </a:blip>
-                    <a:srcRect/>
+                    <a:blip r:embed="rId14"/>
                     <a:stretch>
                       <a:fillRect/>
                     </a:stretch>
                   </pic:blipFill>
-                  <pic:spPr bwMode="auto">
+                  <pic:spPr>
                     <a:xfrm>
                       <a:off x="0" y="0"/>
-                      <a:ext cx="6235790" cy="6235790"/>
+                      <a:ext cx="4674055" cy="7844982"/>
                     </a:xfrm>
                     <a:prstGeom prst="rect">
                       <a:avLst/>
                     </a:prstGeom>
-                    <a:noFill/>
-                    <a:ln>
-                      <a:noFill/>
-                    </a:ln>
                   </pic:spPr>
                 </pic:pic>
               </a:graphicData>
@@ -2929,6 +2871,7 @@
     </w:p>
     <w:p>
       <w:r>
+        <w:lastRenderedPageBreak/>
         <w:br w:type="page"/>
       </w:r>
     </w:p>
@@ -2950,10 +2893,10 @@
           <w:noProof/>
         </w:rPr>
         <w:drawing>
-          <wp:inline distT="0" distB="0" distL="0" distR="0" wp14:anchorId="78257762" wp14:editId="13594008">
-            <wp:extent cx="4673600" cy="6984355"/>
+          <wp:inline distT="0" distB="0" distL="0" distR="0" wp14:anchorId="664D25FD" wp14:editId="679A997B">
+            <wp:extent cx="3876675" cy="5581650"/>
             <wp:effectExtent l="0" t="0" r="0" b="0"/>
-            <wp:docPr id="531192965" name="Imagen 5"/>
+            <wp:docPr id="1723435650" name="Imagen 4"/>
             <wp:cNvGraphicFramePr>
               <a:graphicFrameLocks xmlns:a="http://schemas.openxmlformats.org/drawingml/2006/main" noChangeAspect="1"/>
             </wp:cNvGraphicFramePr>
@@ -2961,36 +2904,23 @@
               <a:graphicData uri="http://schemas.openxmlformats.org/drawingml/2006/picture">
                 <pic:pic xmlns:pic="http://schemas.openxmlformats.org/drawingml/2006/picture">
                   <pic:nvPicPr>
-                    <pic:cNvPr id="0" name="Picture 8"/>
-                    <pic:cNvPicPr>
-                      <a:picLocks noChangeAspect="1" noChangeArrowheads="1"/>
-                    </pic:cNvPicPr>
+                    <pic:cNvPr id="1723435650" name="Imagen 1723435650"/>
+                    <pic:cNvPicPr/>
                   </pic:nvPicPr>
                   <pic:blipFill>
-                    <a:blip r:embed="rId15">
-                      <a:extLst>
-                        <a:ext uri="{28A0092B-C50C-407E-A947-70E740481C1C}">
-                          <a14:useLocalDpi xmlns:a14="http://schemas.microsoft.com/office/drawing/2010/main" val="0"/>
-                        </a:ext>
-                      </a:extLst>
-                    </a:blip>
-                    <a:srcRect/>
+                    <a:blip r:embed="rId15"/>
                     <a:stretch>
                       <a:fillRect/>
                     </a:stretch>
                   </pic:blipFill>
-                  <pic:spPr bwMode="auto">
+                  <pic:spPr>
                     <a:xfrm>
                       <a:off x="0" y="0"/>
-                      <a:ext cx="4678294" cy="6991370"/>
+                      <a:ext cx="3876675" cy="5581650"/>
                     </a:xfrm>
                     <a:prstGeom prst="rect">
                       <a:avLst/>
                     </a:prstGeom>
-                    <a:noFill/>
-                    <a:ln>
-                      <a:noFill/>
-                    </a:ln>
                   </pic:spPr>
                 </pic:pic>
               </a:graphicData>
@@ -7067,7 +6997,7 @@
     <w:charset w:val="00"/>
     <w:family w:val="swiss"/>
     <w:pitch w:val="variable"/>
-    <w:sig w:usb0="E4002EFF" w:usb1="C000247B" w:usb2="00000009" w:usb3="00000000" w:csb0="000001FF" w:csb1="00000000"/>
+    <w:sig w:usb0="E4002EFF" w:usb1="C200247B" w:usb2="00000009" w:usb3="00000000" w:csb0="000001FF" w:csb1="00000000"/>
   </w:font>
   <w:font w:name="Cambria">
     <w:panose1 w:val="02040503050406030204"/>
@@ -7154,10 +7084,12 @@
     <w:rsid w:val="002835FC"/>
     <w:rsid w:val="002C06A7"/>
     <w:rsid w:val="00377B47"/>
+    <w:rsid w:val="00484C89"/>
     <w:rsid w:val="004F7F49"/>
     <w:rsid w:val="0057410B"/>
     <w:rsid w:val="00595623"/>
     <w:rsid w:val="005B27DB"/>
+    <w:rsid w:val="00643A44"/>
     <w:rsid w:val="006D0EDE"/>
     <w:rsid w:val="006E2FCC"/>
     <w:rsid w:val="00704192"/>
@@ -7932,6 +7864,25 @@
 </file>
 
 <file path=customXml/item3.xml><?xml version="1.0" encoding="utf-8"?>
+<p:properties xmlns:p="http://schemas.microsoft.com/office/2006/metadata/properties" xmlns:xsi="http://www.w3.org/2001/XMLSchema-instance" xmlns:pc="http://schemas.microsoft.com/office/infopath/2007/PartnerControls">
+  <documentManagement>
+    <lcf76f155ced4ddcb4097134ff3c332f xmlns="e1e7bc46-bed0-459f-9452-a76b1c5b695e">
+      <Terms xmlns="http://schemas.microsoft.com/office/infopath/2007/PartnerControls"/>
+    </lcf76f155ced4ddcb4097134ff3c332f>
+  </documentManagement>
+</p:properties>
+</file>
+
+<file path=customXml/item4.xml><?xml version="1.0" encoding="utf-8"?>
+<?mso-contentType ?>
+<FormTemplates xmlns="http://schemas.microsoft.com/sharepoint/v3/contenttype/forms">
+  <Display>DocumentLibraryForm</Display>
+  <Edit>DocumentLibraryForm</Edit>
+  <New>DocumentLibraryForm</New>
+</FormTemplates>
+</file>
+
+<file path=customXml/item5.xml><?xml version="1.0" encoding="utf-8"?>
 <ct:contentTypeSchema xmlns:ct="http://schemas.microsoft.com/office/2006/metadata/contentType" xmlns:ma="http://schemas.microsoft.com/office/2006/metadata/properties/metaAttributes" ct:_="" ma:_="" ma:contentTypeName="Documento" ma:contentTypeID="0x0101005395107FFD641345A10C8A5ACACB9D20" ma:contentTypeVersion="13" ma:contentTypeDescription="Crear nuevo documento." ma:contentTypeScope="" ma:versionID="7407f70e7181b908656026f379795b2c">
   <xsd:schema xmlns:xsd="http://www.w3.org/2001/XMLSchema" xmlns:xs="http://www.w3.org/2001/XMLSchema" xmlns:p="http://schemas.microsoft.com/office/2006/metadata/properties" xmlns:ns2="e1e7bc46-bed0-459f-9452-a76b1c5b695e" xmlns:ns3="bb8cf7e1-610f-40a0-8f00-126b9d139fde" targetNamespace="http://schemas.microsoft.com/office/2006/metadata/properties" ma:root="true" ma:fieldsID="b29ea8901729e1eaaa4e48e09148c760" ns2:_="" ns3:_="">
     <xsd:import namespace="e1e7bc46-bed0-459f-9452-a76b1c5b695e"/>
@@ -8148,25 +8099,6 @@
 </ct:contentTypeSchema>
 </file>
 
-<file path=customXml/item4.xml><?xml version="1.0" encoding="utf-8"?>
-<?mso-contentType ?>
-<FormTemplates xmlns="http://schemas.microsoft.com/sharepoint/v3/contenttype/forms">
-  <Display>DocumentLibraryForm</Display>
-  <Edit>DocumentLibraryForm</Edit>
-  <New>DocumentLibraryForm</New>
-</FormTemplates>
-</file>
-
-<file path=customXml/item5.xml><?xml version="1.0" encoding="utf-8"?>
-<p:properties xmlns:p="http://schemas.microsoft.com/office/2006/metadata/properties" xmlns:xsi="http://www.w3.org/2001/XMLSchema-instance" xmlns:pc="http://schemas.microsoft.com/office/infopath/2007/PartnerControls">
-  <documentManagement>
-    <lcf76f155ced4ddcb4097134ff3c332f xmlns="e1e7bc46-bed0-459f-9452-a76b1c5b695e">
-      <Terms xmlns="http://schemas.microsoft.com/office/infopath/2007/PartnerControls"/>
-    </lcf76f155ced4ddcb4097134ff3c332f>
-  </documentManagement>
-</p:properties>
-</file>
-
 <file path=customXml/itemProps1.xml><?xml version="1.0" encoding="utf-8"?>
 <ds:datastoreItem xmlns:ds="http://schemas.openxmlformats.org/officeDocument/2006/customXml" ds:itemID="{55AF091B-3C7A-41E3-B477-F2FDAA23CFDA}">
   <ds:schemaRefs>
@@ -8184,6 +8116,24 @@
 </file>
 
 <file path=customXml/itemProps3.xml><?xml version="1.0" encoding="utf-8"?>
+<ds:datastoreItem xmlns:ds="http://schemas.openxmlformats.org/officeDocument/2006/customXml" ds:itemID="{E1036DFC-1D85-404D-898C-621D06C0EB1C}">
+  <ds:schemaRefs>
+    <ds:schemaRef ds:uri="http://schemas.microsoft.com/office/2006/metadata/properties"/>
+    <ds:schemaRef ds:uri="http://schemas.microsoft.com/office/infopath/2007/PartnerControls"/>
+    <ds:schemaRef ds:uri="e1e7bc46-bed0-459f-9452-a76b1c5b695e"/>
+  </ds:schemaRefs>
+</ds:datastoreItem>
+</file>
+
+<file path=customXml/itemProps4.xml><?xml version="1.0" encoding="utf-8"?>
+<ds:datastoreItem xmlns:ds="http://schemas.openxmlformats.org/officeDocument/2006/customXml" ds:itemID="{EE9AAF0E-D63F-459F-A0FB-CDCE9F728F33}">
+  <ds:schemaRefs>
+    <ds:schemaRef ds:uri="http://schemas.microsoft.com/sharepoint/v3/contenttype/forms"/>
+  </ds:schemaRefs>
+</ds:datastoreItem>
+</file>
+
+<file path=customXml/itemProps5.xml><?xml version="1.0" encoding="utf-8"?>
 <ds:datastoreItem xmlns:ds="http://schemas.openxmlformats.org/officeDocument/2006/customXml" ds:itemID="{444115BD-C1C6-48AD-B714-E1866627071D}">
   <ds:schemaRefs>
     <ds:schemaRef ds:uri="http://schemas.microsoft.com/office/2006/metadata/contentType"/>
@@ -8200,22 +8150,4 @@
     <ds:schemaRef ds:uri="http://schemas.microsoft.com/internal/obd"/>
   </ds:schemaRefs>
 </ds:datastoreItem>
-</file>
-
-<file path=customXml/itemProps4.xml><?xml version="1.0" encoding="utf-8"?>
-<ds:datastoreItem xmlns:ds="http://schemas.openxmlformats.org/officeDocument/2006/customXml" ds:itemID="{EE9AAF0E-D63F-459F-A0FB-CDCE9F728F33}">
-  <ds:schemaRefs>
-    <ds:schemaRef ds:uri="http://schemas.microsoft.com/sharepoint/v3/contenttype/forms"/>
-  </ds:schemaRefs>
-</ds:datastoreItem>
-</file>
-
-<file path=customXml/itemProps5.xml><?xml version="1.0" encoding="utf-8"?>
-<ds:datastoreItem xmlns:ds="http://schemas.openxmlformats.org/officeDocument/2006/customXml" ds:itemID="{E1036DFC-1D85-404D-898C-621D06C0EB1C}">
-  <ds:schemaRefs>
-    <ds:schemaRef ds:uri="http://schemas.microsoft.com/office/2006/metadata/properties"/>
-    <ds:schemaRef ds:uri="http://schemas.microsoft.com/office/infopath/2007/PartnerControls"/>
-    <ds:schemaRef ds:uri="e1e7bc46-bed0-459f-9452-a76b1c5b695e"/>
-  </ds:schemaRefs>
-</ds:datastoreItem>
 </file>
</xml_diff>

<commit_message>
Actualizacion casos de uso 2
</commit_message>
<xml_diff>
--- a/Fase 2/Evidencias Proyecto (version Agil)/Documento 05 - Documento de Diseño.docx
+++ b/Fase 2/Evidencias Proyecto (version Agil)/Documento 05 - Documento de Diseño.docx
@@ -2692,16 +2692,15 @@
           <w:rFonts w:asciiTheme="minorHAnsi" w:eastAsiaTheme="minorHAnsi" w:hAnsiTheme="minorHAnsi" w:cstheme="minorBidi"/>
           <w:b w:val="0"/>
           <w:bCs w:val="0"/>
-          <w:noProof/>
           <w:color w:val="auto"/>
           <w:sz w:val="22"/>
           <w:szCs w:val="22"/>
         </w:rPr>
         <w:drawing>
-          <wp:inline distT="0" distB="0" distL="0" distR="0" wp14:anchorId="515D6152" wp14:editId="380E1762">
-            <wp:extent cx="5612130" cy="4895215"/>
+          <wp:inline distT="0" distB="0" distL="0" distR="0" wp14:anchorId="44F94B35" wp14:editId="246BD1DE">
+            <wp:extent cx="5612130" cy="3777615"/>
             <wp:effectExtent l="0" t="0" r="0" b="0"/>
-            <wp:docPr id="1229241245" name="Imagen 1"/>
+            <wp:docPr id="1831957324" name="Imagen 1"/>
             <wp:cNvGraphicFramePr>
               <a:graphicFrameLocks xmlns:a="http://schemas.openxmlformats.org/drawingml/2006/main" noChangeAspect="1"/>
             </wp:cNvGraphicFramePr>
@@ -2709,7 +2708,7 @@
               <a:graphicData uri="http://schemas.openxmlformats.org/drawingml/2006/picture">
                 <pic:pic xmlns:pic="http://schemas.openxmlformats.org/drawingml/2006/picture">
                   <pic:nvPicPr>
-                    <pic:cNvPr id="1229241245" name="Imagen 1229241245"/>
+                    <pic:cNvPr id="1831957324" name=""/>
                     <pic:cNvPicPr/>
                   </pic:nvPicPr>
                   <pic:blipFill>
@@ -2721,7 +2720,7 @@
                   <pic:spPr>
                     <a:xfrm>
                       <a:off x="0" y="0"/>
-                      <a:ext cx="5612130" cy="4895215"/>
+                      <a:ext cx="5612130" cy="3777615"/>
                     </a:xfrm>
                     <a:prstGeom prst="rect">
                       <a:avLst/>
@@ -2773,14 +2772,11 @@
         <w:jc w:val="center"/>
       </w:pPr>
       <w:r>
-        <w:rPr>
-          <w:noProof/>
-        </w:rPr>
         <w:drawing>
-          <wp:inline distT="0" distB="0" distL="0" distR="0" wp14:anchorId="4607DA32" wp14:editId="11E75B64">
-            <wp:extent cx="5612130" cy="4112895"/>
+          <wp:inline distT="0" distB="0" distL="0" distR="0" wp14:anchorId="4748E1CA" wp14:editId="03F5FA10">
+            <wp:extent cx="5612130" cy="5431155"/>
             <wp:effectExtent l="0" t="0" r="0" b="0"/>
-            <wp:docPr id="910382827" name="Imagen 2"/>
+            <wp:docPr id="1819644390" name="Imagen 1"/>
             <wp:cNvGraphicFramePr>
               <a:graphicFrameLocks xmlns:a="http://schemas.openxmlformats.org/drawingml/2006/main" noChangeAspect="1"/>
             </wp:cNvGraphicFramePr>
@@ -2788,7 +2784,7 @@
               <a:graphicData uri="http://schemas.openxmlformats.org/drawingml/2006/picture">
                 <pic:pic xmlns:pic="http://schemas.openxmlformats.org/drawingml/2006/picture">
                   <pic:nvPicPr>
-                    <pic:cNvPr id="910382827" name="Imagen 910382827"/>
+                    <pic:cNvPr id="1819644390" name=""/>
                     <pic:cNvPicPr/>
                   </pic:nvPicPr>
                   <pic:blipFill>
@@ -2800,7 +2796,7 @@
                   <pic:spPr>
                     <a:xfrm>
                       <a:off x="0" y="0"/>
-                      <a:ext cx="5612130" cy="4112895"/>
+                      <a:ext cx="5612130" cy="5431155"/>
                     </a:xfrm>
                     <a:prstGeom prst="rect">
                       <a:avLst/>
@@ -2829,14 +2825,11 @@
     </w:p>
     <w:p>
       <w:r>
-        <w:rPr>
-          <w:noProof/>
-        </w:rPr>
         <w:drawing>
-          <wp:inline distT="0" distB="0" distL="0" distR="0" wp14:anchorId="785F3A73" wp14:editId="13CF6DD0">
-            <wp:extent cx="4668644" cy="7835900"/>
+          <wp:inline distT="0" distB="0" distL="0" distR="0" wp14:anchorId="22FB928F" wp14:editId="5A157B3A">
+            <wp:extent cx="3503746" cy="7824470"/>
             <wp:effectExtent l="0" t="0" r="0" b="0"/>
-            <wp:docPr id="59645325" name="Imagen 3"/>
+            <wp:docPr id="1824620616" name="Imagen 1"/>
             <wp:cNvGraphicFramePr>
               <a:graphicFrameLocks xmlns:a="http://schemas.openxmlformats.org/drawingml/2006/main" noChangeAspect="1"/>
             </wp:cNvGraphicFramePr>
@@ -2844,7 +2837,7 @@
               <a:graphicData uri="http://schemas.openxmlformats.org/drawingml/2006/picture">
                 <pic:pic xmlns:pic="http://schemas.openxmlformats.org/drawingml/2006/picture">
                   <pic:nvPicPr>
-                    <pic:cNvPr id="59645325" name="Imagen 59645325"/>
+                    <pic:cNvPr id="1824620616" name=""/>
                     <pic:cNvPicPr/>
                   </pic:nvPicPr>
                   <pic:blipFill>
@@ -2856,7 +2849,7 @@
                   <pic:spPr>
                     <a:xfrm>
                       <a:off x="0" y="0"/>
-                      <a:ext cx="4674055" cy="7844982"/>
+                      <a:ext cx="3507081" cy="7831919"/>
                     </a:xfrm>
                     <a:prstGeom prst="rect">
                       <a:avLst/>
@@ -2889,14 +2882,11 @@
         <w:jc w:val="center"/>
       </w:pPr>
       <w:r>
-        <w:rPr>
-          <w:noProof/>
-        </w:rPr>
         <w:drawing>
-          <wp:inline distT="0" distB="0" distL="0" distR="0" wp14:anchorId="664D25FD" wp14:editId="679A997B">
-            <wp:extent cx="3876675" cy="5581650"/>
-            <wp:effectExtent l="0" t="0" r="0" b="0"/>
-            <wp:docPr id="1723435650" name="Imagen 4"/>
+          <wp:inline distT="0" distB="0" distL="0" distR="0" wp14:anchorId="699A3E17" wp14:editId="5D4CDB09">
+            <wp:extent cx="3829050" cy="6200775"/>
+            <wp:effectExtent l="0" t="0" r="0" b="9525"/>
+            <wp:docPr id="1239915774" name="Imagen 1"/>
             <wp:cNvGraphicFramePr>
               <a:graphicFrameLocks xmlns:a="http://schemas.openxmlformats.org/drawingml/2006/main" noChangeAspect="1"/>
             </wp:cNvGraphicFramePr>
@@ -2904,7 +2894,7 @@
               <a:graphicData uri="http://schemas.openxmlformats.org/drawingml/2006/picture">
                 <pic:pic xmlns:pic="http://schemas.openxmlformats.org/drawingml/2006/picture">
                   <pic:nvPicPr>
-                    <pic:cNvPr id="1723435650" name="Imagen 1723435650"/>
+                    <pic:cNvPr id="1239915774" name=""/>
                     <pic:cNvPicPr/>
                   </pic:nvPicPr>
                   <pic:blipFill>
@@ -2916,7 +2906,7 @@
                   <pic:spPr>
                     <a:xfrm>
                       <a:off x="0" y="0"/>
-                      <a:ext cx="3876675" cy="5581650"/>
+                      <a:ext cx="3829050" cy="6200775"/>
                     </a:xfrm>
                     <a:prstGeom prst="rect">
                       <a:avLst/>
@@ -7085,6 +7075,7 @@
     <w:rsid w:val="002C06A7"/>
     <w:rsid w:val="00377B47"/>
     <w:rsid w:val="00484C89"/>
+    <w:rsid w:val="004D08F5"/>
     <w:rsid w:val="004F7F49"/>
     <w:rsid w:val="0057410B"/>
     <w:rsid w:val="00595623"/>
@@ -7097,6 +7088,7 @@
     <w:rsid w:val="00825B36"/>
     <w:rsid w:val="008E5D5B"/>
     <w:rsid w:val="00960213"/>
+    <w:rsid w:val="009851FF"/>
     <w:rsid w:val="00AE6FE7"/>
     <w:rsid w:val="00B86F34"/>
     <w:rsid w:val="00BD2436"/>
@@ -7864,25 +7856,6 @@
 </file>
 
 <file path=customXml/item3.xml><?xml version="1.0" encoding="utf-8"?>
-<p:properties xmlns:p="http://schemas.microsoft.com/office/2006/metadata/properties" xmlns:xsi="http://www.w3.org/2001/XMLSchema-instance" xmlns:pc="http://schemas.microsoft.com/office/infopath/2007/PartnerControls">
-  <documentManagement>
-    <lcf76f155ced4ddcb4097134ff3c332f xmlns="e1e7bc46-bed0-459f-9452-a76b1c5b695e">
-      <Terms xmlns="http://schemas.microsoft.com/office/infopath/2007/PartnerControls"/>
-    </lcf76f155ced4ddcb4097134ff3c332f>
-  </documentManagement>
-</p:properties>
-</file>
-
-<file path=customXml/item4.xml><?xml version="1.0" encoding="utf-8"?>
-<?mso-contentType ?>
-<FormTemplates xmlns="http://schemas.microsoft.com/sharepoint/v3/contenttype/forms">
-  <Display>DocumentLibraryForm</Display>
-  <Edit>DocumentLibraryForm</Edit>
-  <New>DocumentLibraryForm</New>
-</FormTemplates>
-</file>
-
-<file path=customXml/item5.xml><?xml version="1.0" encoding="utf-8"?>
 <ct:contentTypeSchema xmlns:ct="http://schemas.microsoft.com/office/2006/metadata/contentType" xmlns:ma="http://schemas.microsoft.com/office/2006/metadata/properties/metaAttributes" ct:_="" ma:_="" ma:contentTypeName="Documento" ma:contentTypeID="0x0101005395107FFD641345A10C8A5ACACB9D20" ma:contentTypeVersion="13" ma:contentTypeDescription="Crear nuevo documento." ma:contentTypeScope="" ma:versionID="7407f70e7181b908656026f379795b2c">
   <xsd:schema xmlns:xsd="http://www.w3.org/2001/XMLSchema" xmlns:xs="http://www.w3.org/2001/XMLSchema" xmlns:p="http://schemas.microsoft.com/office/2006/metadata/properties" xmlns:ns2="e1e7bc46-bed0-459f-9452-a76b1c5b695e" xmlns:ns3="bb8cf7e1-610f-40a0-8f00-126b9d139fde" targetNamespace="http://schemas.microsoft.com/office/2006/metadata/properties" ma:root="true" ma:fieldsID="b29ea8901729e1eaaa4e48e09148c760" ns2:_="" ns3:_="">
     <xsd:import namespace="e1e7bc46-bed0-459f-9452-a76b1c5b695e"/>
@@ -8099,6 +8072,25 @@
 </ct:contentTypeSchema>
 </file>
 
+<file path=customXml/item4.xml><?xml version="1.0" encoding="utf-8"?>
+<?mso-contentType ?>
+<FormTemplates xmlns="http://schemas.microsoft.com/sharepoint/v3/contenttype/forms">
+  <Display>DocumentLibraryForm</Display>
+  <Edit>DocumentLibraryForm</Edit>
+  <New>DocumentLibraryForm</New>
+</FormTemplates>
+</file>
+
+<file path=customXml/item5.xml><?xml version="1.0" encoding="utf-8"?>
+<p:properties xmlns:p="http://schemas.microsoft.com/office/2006/metadata/properties" xmlns:xsi="http://www.w3.org/2001/XMLSchema-instance" xmlns:pc="http://schemas.microsoft.com/office/infopath/2007/PartnerControls">
+  <documentManagement>
+    <lcf76f155ced4ddcb4097134ff3c332f xmlns="e1e7bc46-bed0-459f-9452-a76b1c5b695e">
+      <Terms xmlns="http://schemas.microsoft.com/office/infopath/2007/PartnerControls"/>
+    </lcf76f155ced4ddcb4097134ff3c332f>
+  </documentManagement>
+</p:properties>
+</file>
+
 <file path=customXml/itemProps1.xml><?xml version="1.0" encoding="utf-8"?>
 <ds:datastoreItem xmlns:ds="http://schemas.openxmlformats.org/officeDocument/2006/customXml" ds:itemID="{55AF091B-3C7A-41E3-B477-F2FDAA23CFDA}">
   <ds:schemaRefs>
@@ -8116,24 +8108,6 @@
 </file>
 
 <file path=customXml/itemProps3.xml><?xml version="1.0" encoding="utf-8"?>
-<ds:datastoreItem xmlns:ds="http://schemas.openxmlformats.org/officeDocument/2006/customXml" ds:itemID="{E1036DFC-1D85-404D-898C-621D06C0EB1C}">
-  <ds:schemaRefs>
-    <ds:schemaRef ds:uri="http://schemas.microsoft.com/office/2006/metadata/properties"/>
-    <ds:schemaRef ds:uri="http://schemas.microsoft.com/office/infopath/2007/PartnerControls"/>
-    <ds:schemaRef ds:uri="e1e7bc46-bed0-459f-9452-a76b1c5b695e"/>
-  </ds:schemaRefs>
-</ds:datastoreItem>
-</file>
-
-<file path=customXml/itemProps4.xml><?xml version="1.0" encoding="utf-8"?>
-<ds:datastoreItem xmlns:ds="http://schemas.openxmlformats.org/officeDocument/2006/customXml" ds:itemID="{EE9AAF0E-D63F-459F-A0FB-CDCE9F728F33}">
-  <ds:schemaRefs>
-    <ds:schemaRef ds:uri="http://schemas.microsoft.com/sharepoint/v3/contenttype/forms"/>
-  </ds:schemaRefs>
-</ds:datastoreItem>
-</file>
-
-<file path=customXml/itemProps5.xml><?xml version="1.0" encoding="utf-8"?>
 <ds:datastoreItem xmlns:ds="http://schemas.openxmlformats.org/officeDocument/2006/customXml" ds:itemID="{444115BD-C1C6-48AD-B714-E1866627071D}">
   <ds:schemaRefs>
     <ds:schemaRef ds:uri="http://schemas.microsoft.com/office/2006/metadata/contentType"/>
@@ -8150,4 +8124,22 @@
     <ds:schemaRef ds:uri="http://schemas.microsoft.com/internal/obd"/>
   </ds:schemaRefs>
 </ds:datastoreItem>
+</file>
+
+<file path=customXml/itemProps4.xml><?xml version="1.0" encoding="utf-8"?>
+<ds:datastoreItem xmlns:ds="http://schemas.openxmlformats.org/officeDocument/2006/customXml" ds:itemID="{EE9AAF0E-D63F-459F-A0FB-CDCE9F728F33}">
+  <ds:schemaRefs>
+    <ds:schemaRef ds:uri="http://schemas.microsoft.com/sharepoint/v3/contenttype/forms"/>
+  </ds:schemaRefs>
+</ds:datastoreItem>
+</file>
+
+<file path=customXml/itemProps5.xml><?xml version="1.0" encoding="utf-8"?>
+<ds:datastoreItem xmlns:ds="http://schemas.openxmlformats.org/officeDocument/2006/customXml" ds:itemID="{E1036DFC-1D85-404D-898C-621D06C0EB1C}">
+  <ds:schemaRefs>
+    <ds:schemaRef ds:uri="http://schemas.microsoft.com/office/2006/metadata/properties"/>
+    <ds:schemaRef ds:uri="http://schemas.microsoft.com/office/infopath/2007/PartnerControls"/>
+    <ds:schemaRef ds:uri="e1e7bc46-bed0-459f-9452-a76b1c5b695e"/>
+  </ds:schemaRefs>
+</ds:datastoreItem>
 </file>
</xml_diff>

<commit_message>
Se actualizan los diagramas de secuencia post revision
</commit_message>
<xml_diff>
--- a/Fase 2/Evidencias Proyecto (version Agil)/Documento 05 - Documento de Diseño.docx
+++ b/Fase 2/Evidencias Proyecto (version Agil)/Documento 05 - Documento de Diseño.docx
@@ -2692,6 +2692,7 @@
           <w:rFonts w:asciiTheme="minorHAnsi" w:eastAsiaTheme="minorHAnsi" w:hAnsiTheme="minorHAnsi" w:cstheme="minorBidi"/>
           <w:b w:val="0"/>
           <w:bCs w:val="0"/>
+          <w:noProof/>
           <w:color w:val="auto"/>
           <w:sz w:val="22"/>
           <w:szCs w:val="22"/>
@@ -2772,6 +2773,9 @@
         <w:jc w:val="center"/>
       </w:pPr>
       <w:r>
+        <w:rPr>
+          <w:noProof/>
+        </w:rPr>
         <w:drawing>
           <wp:inline distT="0" distB="0" distL="0" distR="0" wp14:anchorId="4748E1CA" wp14:editId="03F5FA10">
             <wp:extent cx="5612130" cy="5431155"/>
@@ -2825,6 +2829,9 @@
     </w:p>
     <w:p>
       <w:r>
+        <w:rPr>
+          <w:noProof/>
+        </w:rPr>
         <w:drawing>
           <wp:inline distT="0" distB="0" distL="0" distR="0" wp14:anchorId="22FB928F" wp14:editId="5A157B3A">
             <wp:extent cx="3503746" cy="7824470"/>
@@ -2882,6 +2889,9 @@
         <w:jc w:val="center"/>
       </w:pPr>
       <w:r>
+        <w:rPr>
+          <w:noProof/>
+        </w:rPr>
         <w:drawing>
           <wp:inline distT="0" distB="0" distL="0" distR="0" wp14:anchorId="699A3E17" wp14:editId="5D4CDB09">
             <wp:extent cx="3829050" cy="6200775"/>
@@ -3191,15 +3201,15 @@
         </w:rPr>
         <w:lastRenderedPageBreak/>
         <w:drawing>
-          <wp:anchor distT="0" distB="0" distL="114300" distR="114300" simplePos="0" relativeHeight="251657728" behindDoc="1" locked="0" layoutInCell="1" allowOverlap="1" wp14:anchorId="0A024C78" wp14:editId="7C560788">
+          <wp:anchor distT="0" distB="0" distL="114300" distR="114300" simplePos="0" relativeHeight="251657728" behindDoc="1" locked="0" layoutInCell="1" allowOverlap="1" wp14:anchorId="0A024C78" wp14:editId="0572B3EF">
             <wp:simplePos x="0" y="0"/>
             <wp:positionH relativeFrom="column">
-              <wp:posOffset>-594995</wp:posOffset>
+              <wp:posOffset>-557479</wp:posOffset>
             </wp:positionH>
             <wp:positionV relativeFrom="paragraph">
-              <wp:posOffset>381635</wp:posOffset>
+              <wp:posOffset>385445</wp:posOffset>
             </wp:positionV>
-            <wp:extent cx="7045490" cy="8535670"/>
+            <wp:extent cx="6971728" cy="8535670"/>
             <wp:effectExtent l="0" t="0" r="0" b="0"/>
             <wp:wrapNone/>
             <wp:docPr id="918983248" name="Imagen 10"/>
@@ -3224,7 +3234,7 @@
                   <pic:spPr bwMode="auto">
                     <a:xfrm>
                       <a:off x="0" y="0"/>
-                      <a:ext cx="7045490" cy="8535670"/>
+                      <a:ext cx="6971728" cy="8535670"/>
                     </a:xfrm>
                     <a:prstGeom prst="rect">
                       <a:avLst/>
@@ -3322,15 +3332,15 @@
         </w:rPr>
         <w:lastRenderedPageBreak/>
         <w:drawing>
-          <wp:anchor distT="0" distB="0" distL="114300" distR="114300" simplePos="0" relativeHeight="251658752" behindDoc="1" locked="0" layoutInCell="1" allowOverlap="1" wp14:anchorId="0F052675" wp14:editId="0508992A">
+          <wp:anchor distT="0" distB="0" distL="114300" distR="114300" simplePos="0" relativeHeight="251658752" behindDoc="1" locked="0" layoutInCell="1" allowOverlap="1" wp14:anchorId="0F052675" wp14:editId="24E9B5FB">
             <wp:simplePos x="0" y="0"/>
             <wp:positionH relativeFrom="column">
-              <wp:posOffset>-246868</wp:posOffset>
+              <wp:posOffset>-718186</wp:posOffset>
             </wp:positionH>
             <wp:positionV relativeFrom="paragraph">
-              <wp:posOffset>-88265</wp:posOffset>
+              <wp:posOffset>-90805</wp:posOffset>
             </wp:positionV>
-            <wp:extent cx="6271846" cy="9052724"/>
+            <wp:extent cx="7172325" cy="9051925"/>
             <wp:effectExtent l="0" t="0" r="0" b="0"/>
             <wp:wrapNone/>
             <wp:docPr id="1396443609" name="Imagen 11"/>
@@ -3355,7 +3365,7 @@
                   <pic:spPr bwMode="auto">
                     <a:xfrm>
                       <a:off x="0" y="0"/>
-                      <a:ext cx="6271846" cy="9052724"/>
+                      <a:ext cx="7172325" cy="9051925"/>
                     </a:xfrm>
                     <a:prstGeom prst="rect">
                       <a:avLst/>
@@ -6987,7 +6997,7 @@
     <w:charset w:val="00"/>
     <w:family w:val="swiss"/>
     <w:pitch w:val="variable"/>
-    <w:sig w:usb0="E4002EFF" w:usb1="C200247B" w:usb2="00000009" w:usb3="00000000" w:csb0="000001FF" w:csb1="00000000"/>
+    <w:sig w:usb0="E4002EFF" w:usb1="C000247B" w:usb2="00000009" w:usb3="00000000" w:csb0="000001FF" w:csb1="00000000"/>
   </w:font>
   <w:font w:name="Cambria">
     <w:panose1 w:val="02040503050406030204"/>
@@ -7071,12 +7081,14 @@
     <w:rsid w:val="00153A14"/>
     <w:rsid w:val="00194DF5"/>
     <w:rsid w:val="001B14B7"/>
+    <w:rsid w:val="00256605"/>
     <w:rsid w:val="002835FC"/>
     <w:rsid w:val="002C06A7"/>
     <w:rsid w:val="00377B47"/>
     <w:rsid w:val="00484C89"/>
     <w:rsid w:val="004D08F5"/>
     <w:rsid w:val="004F7F49"/>
+    <w:rsid w:val="00561305"/>
     <w:rsid w:val="0057410B"/>
     <w:rsid w:val="00595623"/>
     <w:rsid w:val="005B27DB"/>
@@ -7852,10 +7864,25 @@
 </file>
 
 <file path=customXml/item2.xml><?xml version="1.0" encoding="utf-8"?>
-<b:Sources xmlns:b="http://schemas.openxmlformats.org/officeDocument/2006/bibliography" xmlns="http://schemas.openxmlformats.org/officeDocument/2006/bibliography" SelectedStyle="\APA.XSL" StyleName="APA"/>
+<p:properties xmlns:p="http://schemas.microsoft.com/office/2006/metadata/properties" xmlns:xsi="http://www.w3.org/2001/XMLSchema-instance" xmlns:pc="http://schemas.microsoft.com/office/infopath/2007/PartnerControls">
+  <documentManagement>
+    <lcf76f155ced4ddcb4097134ff3c332f xmlns="e1e7bc46-bed0-459f-9452-a76b1c5b695e">
+      <Terms xmlns="http://schemas.microsoft.com/office/infopath/2007/PartnerControls"/>
+    </lcf76f155ced4ddcb4097134ff3c332f>
+  </documentManagement>
+</p:properties>
 </file>
 
 <file path=customXml/item3.xml><?xml version="1.0" encoding="utf-8"?>
+<?mso-contentType ?>
+<FormTemplates xmlns="http://schemas.microsoft.com/sharepoint/v3/contenttype/forms">
+  <Display>DocumentLibraryForm</Display>
+  <Edit>DocumentLibraryForm</Edit>
+  <New>DocumentLibraryForm</New>
+</FormTemplates>
+</file>
+
+<file path=customXml/item4.xml><?xml version="1.0" encoding="utf-8"?>
 <ct:contentTypeSchema xmlns:ct="http://schemas.microsoft.com/office/2006/metadata/contentType" xmlns:ma="http://schemas.microsoft.com/office/2006/metadata/properties/metaAttributes" ct:_="" ma:_="" ma:contentTypeName="Documento" ma:contentTypeID="0x0101005395107FFD641345A10C8A5ACACB9D20" ma:contentTypeVersion="13" ma:contentTypeDescription="Crear nuevo documento." ma:contentTypeScope="" ma:versionID="7407f70e7181b908656026f379795b2c">
   <xsd:schema xmlns:xsd="http://www.w3.org/2001/XMLSchema" xmlns:xs="http://www.w3.org/2001/XMLSchema" xmlns:p="http://schemas.microsoft.com/office/2006/metadata/properties" xmlns:ns2="e1e7bc46-bed0-459f-9452-a76b1c5b695e" xmlns:ns3="bb8cf7e1-610f-40a0-8f00-126b9d139fde" targetNamespace="http://schemas.microsoft.com/office/2006/metadata/properties" ma:root="true" ma:fieldsID="b29ea8901729e1eaaa4e48e09148c760" ns2:_="" ns3:_="">
     <xsd:import namespace="e1e7bc46-bed0-459f-9452-a76b1c5b695e"/>
@@ -8072,23 +8099,8 @@
 </ct:contentTypeSchema>
 </file>
 
-<file path=customXml/item4.xml><?xml version="1.0" encoding="utf-8"?>
-<?mso-contentType ?>
-<FormTemplates xmlns="http://schemas.microsoft.com/sharepoint/v3/contenttype/forms">
-  <Display>DocumentLibraryForm</Display>
-  <Edit>DocumentLibraryForm</Edit>
-  <New>DocumentLibraryForm</New>
-</FormTemplates>
-</file>
-
 <file path=customXml/item5.xml><?xml version="1.0" encoding="utf-8"?>
-<p:properties xmlns:p="http://schemas.microsoft.com/office/2006/metadata/properties" xmlns:xsi="http://www.w3.org/2001/XMLSchema-instance" xmlns:pc="http://schemas.microsoft.com/office/infopath/2007/PartnerControls">
-  <documentManagement>
-    <lcf76f155ced4ddcb4097134ff3c332f xmlns="e1e7bc46-bed0-459f-9452-a76b1c5b695e">
-      <Terms xmlns="http://schemas.microsoft.com/office/infopath/2007/PartnerControls"/>
-    </lcf76f155ced4ddcb4097134ff3c332f>
-  </documentManagement>
-</p:properties>
+<b:Sources xmlns:b="http://schemas.openxmlformats.org/officeDocument/2006/bibliography" xmlns="http://schemas.openxmlformats.org/officeDocument/2006/bibliography" SelectedStyle="\APA.XSL" StyleName="APA"/>
 </file>
 
 <file path=customXml/itemProps1.xml><?xml version="1.0" encoding="utf-8"?>
@@ -8100,14 +8112,24 @@
 </file>
 
 <file path=customXml/itemProps2.xml><?xml version="1.0" encoding="utf-8"?>
-<ds:datastoreItem xmlns:ds="http://schemas.openxmlformats.org/officeDocument/2006/customXml" ds:itemID="{BD6EC776-6679-4C69-98E3-6D068EA0A3C9}">
+<ds:datastoreItem xmlns:ds="http://schemas.openxmlformats.org/officeDocument/2006/customXml" ds:itemID="{E1036DFC-1D85-404D-898C-621D06C0EB1C}">
   <ds:schemaRefs>
-    <ds:schemaRef ds:uri="http://schemas.openxmlformats.org/officeDocument/2006/bibliography"/>
+    <ds:schemaRef ds:uri="http://schemas.microsoft.com/office/2006/metadata/properties"/>
+    <ds:schemaRef ds:uri="http://schemas.microsoft.com/office/infopath/2007/PartnerControls"/>
+    <ds:schemaRef ds:uri="e1e7bc46-bed0-459f-9452-a76b1c5b695e"/>
   </ds:schemaRefs>
 </ds:datastoreItem>
 </file>
 
 <file path=customXml/itemProps3.xml><?xml version="1.0" encoding="utf-8"?>
+<ds:datastoreItem xmlns:ds="http://schemas.openxmlformats.org/officeDocument/2006/customXml" ds:itemID="{EE9AAF0E-D63F-459F-A0FB-CDCE9F728F33}">
+  <ds:schemaRefs>
+    <ds:schemaRef ds:uri="http://schemas.microsoft.com/sharepoint/v3/contenttype/forms"/>
+  </ds:schemaRefs>
+</ds:datastoreItem>
+</file>
+
+<file path=customXml/itemProps4.xml><?xml version="1.0" encoding="utf-8"?>
 <ds:datastoreItem xmlns:ds="http://schemas.openxmlformats.org/officeDocument/2006/customXml" ds:itemID="{444115BD-C1C6-48AD-B714-E1866627071D}">
   <ds:schemaRefs>
     <ds:schemaRef ds:uri="http://schemas.microsoft.com/office/2006/metadata/contentType"/>
@@ -8126,20 +8148,10 @@
 </ds:datastoreItem>
 </file>
 
-<file path=customXml/itemProps4.xml><?xml version="1.0" encoding="utf-8"?>
-<ds:datastoreItem xmlns:ds="http://schemas.openxmlformats.org/officeDocument/2006/customXml" ds:itemID="{EE9AAF0E-D63F-459F-A0FB-CDCE9F728F33}">
+<file path=customXml/itemProps5.xml><?xml version="1.0" encoding="utf-8"?>
+<ds:datastoreItem xmlns:ds="http://schemas.openxmlformats.org/officeDocument/2006/customXml" ds:itemID="{BD6EC776-6679-4C69-98E3-6D068EA0A3C9}">
   <ds:schemaRefs>
-    <ds:schemaRef ds:uri="http://schemas.microsoft.com/sharepoint/v3/contenttype/forms"/>
-  </ds:schemaRefs>
-</ds:datastoreItem>
-</file>
-
-<file path=customXml/itemProps5.xml><?xml version="1.0" encoding="utf-8"?>
-<ds:datastoreItem xmlns:ds="http://schemas.openxmlformats.org/officeDocument/2006/customXml" ds:itemID="{E1036DFC-1D85-404D-898C-621D06C0EB1C}">
-  <ds:schemaRefs>
-    <ds:schemaRef ds:uri="http://schemas.microsoft.com/office/2006/metadata/properties"/>
-    <ds:schemaRef ds:uri="http://schemas.microsoft.com/office/infopath/2007/PartnerControls"/>
-    <ds:schemaRef ds:uri="e1e7bc46-bed0-459f-9452-a76b1c5b695e"/>
+    <ds:schemaRef ds:uri="http://schemas.openxmlformats.org/officeDocument/2006/bibliography"/>
   </ds:schemaRefs>
 </ds:datastoreItem>
 </file>
</xml_diff>